<commit_message>
Added 3 users stories: Elevation Correction; Interpolation, 3D cube visualization and corresponding story points and priority
</commit_message>
<xml_diff>
--- a/Project Plan/UserStories.docx
+++ b/Project Plan/UserStories.docx
@@ -25,6 +25,1790 @@
         </w:rPr>
         <w:t>User Stories</w:t>
       </w:r>
+    </w:p>
+    <w:p>
+      <w:pPr>
+        <w:rPr>
+          <w:rFonts w:ascii="Times New Roman" w:hAnsi="Times New Roman" w:cs="Times New Roman"/>
+          <w:b/>
+          <w:bCs/>
+          <w:sz w:val="36"/>
+          <w:szCs w:val="36"/>
+          <w:lang w:val="en-US"/>
+        </w:rPr>
+      </w:pPr>
+    </w:p>
+    <w:p>
+      <w:pPr>
+        <w:rPr>
+          <w:rFonts w:ascii="Times New Roman" w:hAnsi="Times New Roman" w:cs="Times New Roman"/>
+          <w:sz w:val="28"/>
+          <w:szCs w:val="28"/>
+          <w:lang w:val="en-US"/>
+        </w:rPr>
+      </w:pPr>
+      <w:r>
+        <w:rPr>
+          <w:rFonts w:ascii="Times New Roman" w:hAnsi="Times New Roman" w:cs="Times New Roman"/>
+          <w:b/>
+          <w:bCs/>
+          <w:sz w:val="28"/>
+          <w:szCs w:val="28"/>
+          <w:lang w:val="en-US"/>
+        </w:rPr>
+        <w:t>Title</w:t>
+      </w:r>
+      <w:r>
+        <w:rPr>
+          <w:rFonts w:ascii="Times New Roman" w:hAnsi="Times New Roman" w:cs="Times New Roman"/>
+          <w:b/>
+          <w:bCs/>
+          <w:sz w:val="28"/>
+          <w:szCs w:val="28"/>
+          <w:lang w:val="en-US"/>
+        </w:rPr>
+        <w:t xml:space="preserve">: </w:t>
+      </w:r>
+      <w:r>
+        <w:rPr>
+          <w:rFonts w:ascii="Times New Roman" w:hAnsi="Times New Roman" w:cs="Times New Roman"/>
+          <w:lang w:val="en-US"/>
+        </w:rPr>
+        <w:t>Correcting GPR data for elevation using LiDAR</w:t>
+      </w:r>
+    </w:p>
+    <w:p>
+      <w:pPr>
+        <w:rPr>
+          <w:rFonts w:ascii="Times New Roman" w:hAnsi="Times New Roman" w:cs="Times New Roman"/>
+          <w:sz w:val="28"/>
+          <w:szCs w:val="28"/>
+        </w:rPr>
+      </w:pPr>
+      <w:r>
+        <w:rPr>
+          <w:rFonts w:ascii="Times New Roman" w:hAnsi="Times New Roman" w:cs="Times New Roman"/>
+          <w:b/>
+          <w:bCs/>
+          <w:sz w:val="28"/>
+          <w:szCs w:val="28"/>
+          <w:lang w:val="en-US"/>
+        </w:rPr>
+        <w:t>Story</w:t>
+      </w:r>
+      <w:r>
+        <w:rPr>
+          <w:rFonts w:ascii="Times New Roman" w:hAnsi="Times New Roman" w:cs="Times New Roman"/>
+          <w:b/>
+          <w:bCs/>
+          <w:sz w:val="28"/>
+          <w:szCs w:val="28"/>
+          <w:lang w:val="en-US"/>
+        </w:rPr>
+        <w:t xml:space="preserve">: </w:t>
+      </w:r>
+      <w:r>
+        <w:rPr>
+          <w:rFonts w:ascii="Times New Roman" w:hAnsi="Times New Roman" w:cs="Times New Roman"/>
+          <w:lang w:val="en-US"/>
+        </w:rPr>
+        <w:t xml:space="preserve">As an Archaeologist, I want to adjust my GPR readings to account for elevation changes so that I can accurately find unmarked graves and reduce the </w:t>
+      </w:r>
+      <w:r>
+        <w:rPr>
+          <w:rFonts w:ascii="Times New Roman" w:hAnsi="Times New Roman" w:cs="Times New Roman"/>
+        </w:rPr>
+        <w:t>labour</w:t>
+      </w:r>
+      <w:r>
+        <w:rPr>
+          <w:rFonts w:ascii="Times New Roman" w:hAnsi="Times New Roman" w:cs="Times New Roman"/>
+          <w:lang w:val="en-US"/>
+        </w:rPr>
+        <w:t xml:space="preserve"> cost on my budget</w:t>
+      </w:r>
+      <w:r>
+        <w:rPr>
+          <w:rFonts w:ascii="Times New Roman" w:hAnsi="Times New Roman" w:cs="Times New Roman"/>
+          <w:sz w:val="28"/>
+          <w:szCs w:val="28"/>
+          <w:lang w:val="en-US"/>
+        </w:rPr>
+        <w:t>.</w:t>
+      </w:r>
+      <w:r>
+        <w:rPr>
+          <w:rFonts w:ascii="Times New Roman" w:hAnsi="Times New Roman" w:cs="Times New Roman"/>
+          <w:b/>
+          <w:bCs/>
+          <w:sz w:val="28"/>
+          <w:szCs w:val="28"/>
+          <w:lang w:val="en-US"/>
+        </w:rPr>
+        <w:tab/>
+      </w:r>
+    </w:p>
+    <w:p>
+      <w:pPr>
+        <w:rPr>
+          <w:rFonts w:ascii="Times New Roman" w:hAnsi="Times New Roman" w:cs="Times New Roman"/>
+          <w:b/>
+          <w:bCs/>
+          <w:sz w:val="28"/>
+          <w:szCs w:val="28"/>
+          <w:lang w:val="en-US"/>
+        </w:rPr>
+      </w:pPr>
+      <w:r>
+        <w:rPr>
+          <w:rFonts w:ascii="Times New Roman" w:hAnsi="Times New Roman" w:cs="Times New Roman"/>
+          <w:b/>
+          <w:bCs/>
+          <w:sz w:val="28"/>
+          <w:szCs w:val="28"/>
+          <w:lang w:val="en-US"/>
+        </w:rPr>
+        <w:t>Criteria</w:t>
+      </w:r>
+      <w:r>
+        <w:rPr>
+          <w:rFonts w:ascii="Times New Roman" w:hAnsi="Times New Roman" w:cs="Times New Roman"/>
+          <w:b/>
+          <w:bCs/>
+          <w:sz w:val="28"/>
+          <w:szCs w:val="28"/>
+          <w:lang w:val="en-US"/>
+        </w:rPr>
+        <w:t>:</w:t>
+      </w:r>
+    </w:p>
+    <w:p>
+      <w:pPr>
+        <w:pStyle w:val="ListParagraph"/>
+        <w:numPr>
+          <w:ilvl w:val="0"/>
+          <w:numId w:val="3"/>
+        </w:numPr>
+        <w:rPr>
+          <w:rFonts w:ascii="Times New Roman" w:hAnsi="Times New Roman" w:cs="Times New Roman"/>
+          <w:b/>
+          <w:bCs/>
+          <w:lang w:val="en-US"/>
+        </w:rPr>
+      </w:pPr>
+      <w:r>
+        <w:rPr>
+          <w:rFonts w:ascii="Times New Roman" w:hAnsi="Times New Roman" w:cs="Times New Roman"/>
+          <w:b/>
+          <w:bCs/>
+          <w:sz w:val="28"/>
+          <w:szCs w:val="28"/>
+          <w:lang w:val="en-US"/>
+        </w:rPr>
+        <w:t xml:space="preserve"> </w:t>
+      </w:r>
+      <w:r>
+        <w:rPr>
+          <w:rFonts w:ascii="Times New Roman" w:hAnsi="Times New Roman" w:cs="Times New Roman"/>
+          <w:lang w:val="en-US"/>
+        </w:rPr>
+        <w:t>Read in LiDAR data</w:t>
+      </w:r>
+    </w:p>
+    <w:p>
+      <w:pPr>
+        <w:pStyle w:val="ListParagraph"/>
+        <w:numPr>
+          <w:ilvl w:val="0"/>
+          <w:numId w:val="3"/>
+        </w:numPr>
+        <w:rPr>
+          <w:rFonts w:ascii="Times New Roman" w:hAnsi="Times New Roman" w:cs="Times New Roman"/>
+          <w:lang w:val="en-US"/>
+        </w:rPr>
+      </w:pPr>
+      <w:r>
+        <w:rPr>
+          <w:rFonts w:ascii="Times New Roman" w:hAnsi="Times New Roman" w:cs="Times New Roman"/>
+          <w:b/>
+          <w:bCs/>
+          <w:lang w:val="en-US"/>
+        </w:rPr>
+        <w:t xml:space="preserve"> </w:t>
+      </w:r>
+      <w:r>
+        <w:rPr>
+          <w:rFonts w:ascii="Times New Roman" w:hAnsi="Times New Roman" w:cs="Times New Roman"/>
+          <w:lang w:val="en-US"/>
+        </w:rPr>
+        <w:t>Visualize LiDAR file in 3D space</w:t>
+      </w:r>
+    </w:p>
+    <w:p>
+      <w:pPr>
+        <w:pStyle w:val="ListParagraph"/>
+        <w:numPr>
+          <w:ilvl w:val="0"/>
+          <w:numId w:val="3"/>
+        </w:numPr>
+        <w:rPr>
+          <w:rFonts w:ascii="Times New Roman" w:hAnsi="Times New Roman" w:cs="Times New Roman"/>
+          <w:lang w:val="en-US"/>
+        </w:rPr>
+      </w:pPr>
+      <w:r>
+        <w:rPr>
+          <w:rFonts w:ascii="Times New Roman" w:hAnsi="Times New Roman" w:cs="Times New Roman"/>
+          <w:lang w:val="en-US"/>
+        </w:rPr>
+        <w:t>Get elevation of points in LiDAR image</w:t>
+      </w:r>
+    </w:p>
+    <w:p>
+      <w:pPr>
+        <w:pStyle w:val="ListParagraph"/>
+        <w:numPr>
+          <w:ilvl w:val="0"/>
+          <w:numId w:val="3"/>
+        </w:numPr>
+        <w:rPr>
+          <w:rFonts w:ascii="Times New Roman" w:hAnsi="Times New Roman" w:cs="Times New Roman"/>
+          <w:lang w:val="en-US"/>
+        </w:rPr>
+      </w:pPr>
+      <w:r>
+        <w:rPr>
+          <w:rFonts w:ascii="Times New Roman" w:hAnsi="Times New Roman" w:cs="Times New Roman"/>
+          <w:lang w:val="en-US"/>
+        </w:rPr>
+        <w:t>Get difference in elevation between origin and LiDAR image</w:t>
+      </w:r>
+    </w:p>
+    <w:p>
+      <w:pPr>
+        <w:pStyle w:val="ListParagraph"/>
+        <w:numPr>
+          <w:ilvl w:val="0"/>
+          <w:numId w:val="3"/>
+        </w:numPr>
+        <w:rPr>
+          <w:rFonts w:ascii="Times New Roman" w:hAnsi="Times New Roman" w:cs="Times New Roman"/>
+          <w:lang w:val="en-US"/>
+        </w:rPr>
+      </w:pPr>
+      <w:r>
+        <w:rPr>
+          <w:rFonts w:ascii="Times New Roman" w:hAnsi="Times New Roman" w:cs="Times New Roman"/>
+          <w:lang w:val="en-US"/>
+        </w:rPr>
+        <w:t>Adjust one point in the GPR data for elevation</w:t>
+      </w:r>
+    </w:p>
+    <w:p>
+      <w:pPr>
+        <w:pStyle w:val="ListParagraph"/>
+        <w:numPr>
+          <w:ilvl w:val="0"/>
+          <w:numId w:val="3"/>
+        </w:numPr>
+        <w:rPr>
+          <w:rFonts w:ascii="Times New Roman" w:hAnsi="Times New Roman" w:cs="Times New Roman"/>
+          <w:lang w:val="en-US"/>
+        </w:rPr>
+      </w:pPr>
+      <w:r>
+        <w:rPr>
+          <w:rFonts w:ascii="Times New Roman" w:hAnsi="Times New Roman" w:cs="Times New Roman"/>
+          <w:lang w:val="en-US"/>
+        </w:rPr>
+        <w:t xml:space="preserve">Apply elevation correction to entire 3D cube </w:t>
+      </w:r>
+    </w:p>
+    <w:p>
+      <w:pPr>
+        <w:rPr>
+          <w:rFonts w:ascii="Times New Roman" w:hAnsi="Times New Roman" w:cs="Times New Roman"/>
+          <w:sz w:val="28"/>
+          <w:szCs w:val="28"/>
+          <w:lang w:val="en-US"/>
+        </w:rPr>
+      </w:pPr>
+      <w:r>
+        <w:rPr>
+          <w:rFonts w:ascii="Times New Roman" w:hAnsi="Times New Roman" w:cs="Times New Roman"/>
+          <w:b/>
+          <w:bCs/>
+          <w:sz w:val="28"/>
+          <w:szCs w:val="28"/>
+          <w:lang w:val="en-US"/>
+        </w:rPr>
+        <w:t>Story Points</w:t>
+      </w:r>
+      <w:r>
+        <w:rPr>
+          <w:rFonts w:ascii="Times New Roman" w:hAnsi="Times New Roman" w:cs="Times New Roman"/>
+          <w:b/>
+          <w:bCs/>
+          <w:sz w:val="28"/>
+          <w:szCs w:val="28"/>
+          <w:lang w:val="en-US"/>
+        </w:rPr>
+        <w:t xml:space="preserve">: </w:t>
+      </w:r>
+      <w:r>
+        <w:rPr>
+          <w:rFonts w:ascii="Times New Roman" w:hAnsi="Times New Roman" w:cs="Times New Roman"/>
+          <w:lang w:val="en-US"/>
+        </w:rPr>
+        <w:t>20</w:t>
+      </w:r>
+    </w:p>
+    <w:p>
+      <w:pPr>
+        <w:rPr>
+          <w:rFonts w:ascii="Times New Roman" w:hAnsi="Times New Roman" w:cs="Times New Roman"/>
+          <w:lang w:val="en-US"/>
+        </w:rPr>
+      </w:pPr>
+      <w:r>
+        <w:rPr>
+          <w:rFonts w:ascii="Times New Roman" w:hAnsi="Times New Roman" w:cs="Times New Roman"/>
+          <w:b/>
+          <w:bCs/>
+          <w:sz w:val="28"/>
+          <w:szCs w:val="28"/>
+          <w:lang w:val="en-US"/>
+        </w:rPr>
+        <w:t>Priority</w:t>
+      </w:r>
+      <w:r>
+        <w:rPr>
+          <w:rFonts w:ascii="Times New Roman" w:hAnsi="Times New Roman" w:cs="Times New Roman"/>
+          <w:b/>
+          <w:bCs/>
+          <w:sz w:val="28"/>
+          <w:szCs w:val="28"/>
+          <w:lang w:val="en-US"/>
+        </w:rPr>
+        <w:t xml:space="preserve">: </w:t>
+      </w:r>
+      <w:r>
+        <w:rPr>
+          <w:rFonts w:ascii="Times New Roman" w:hAnsi="Times New Roman" w:cs="Times New Roman"/>
+          <w:lang w:val="en-US"/>
+        </w:rPr>
+        <w:t>HIGH</w:t>
+      </w:r>
+    </w:p>
+    <w:p>
+      <w:pPr>
+        <w:rPr>
+          <w:rFonts w:ascii="Times New Roman" w:hAnsi="Times New Roman" w:cs="Times New Roman"/>
+          <w:b/>
+          <w:bCs/>
+          <w:sz w:val="28"/>
+          <w:szCs w:val="28"/>
+          <w:lang w:val="en-US"/>
+        </w:rPr>
+      </w:pPr>
+    </w:p>
+    <w:p>
+      <w:pPr>
+        <w:rPr>
+          <w:rFonts w:ascii="Times New Roman" w:hAnsi="Times New Roman" w:cs="Times New Roman"/>
+          <w:sz w:val="28"/>
+          <w:szCs w:val="28"/>
+          <w:lang w:val="en-US"/>
+        </w:rPr>
+      </w:pPr>
+      <w:r>
+        <w:rPr>
+          <w:rFonts w:ascii="Times New Roman" w:hAnsi="Times New Roman" w:cs="Times New Roman"/>
+          <w:b/>
+          <w:bCs/>
+          <w:sz w:val="28"/>
+          <w:szCs w:val="28"/>
+          <w:lang w:val="en-US"/>
+        </w:rPr>
+        <w:t>Title</w:t>
+      </w:r>
+      <w:r>
+        <w:rPr>
+          <w:rFonts w:ascii="Times New Roman" w:hAnsi="Times New Roman" w:cs="Times New Roman"/>
+          <w:b/>
+          <w:bCs/>
+          <w:sz w:val="28"/>
+          <w:szCs w:val="28"/>
+          <w:lang w:val="en-US"/>
+        </w:rPr>
+        <w:t xml:space="preserve">: </w:t>
+      </w:r>
+      <w:r>
+        <w:rPr>
+          <w:rFonts w:ascii="Times New Roman" w:hAnsi="Times New Roman" w:cs="Times New Roman"/>
+          <w:lang w:val="en-US"/>
+        </w:rPr>
+        <w:t xml:space="preserve">Interpolation </w:t>
+      </w:r>
+      <w:r>
+        <w:rPr>
+          <w:rFonts w:ascii="Times New Roman" w:hAnsi="Times New Roman" w:cs="Times New Roman"/>
+          <w:lang w:val="en-US"/>
+        </w:rPr>
+        <w:t>of GPR data into 3D cube</w:t>
+      </w:r>
+    </w:p>
+    <w:p>
+      <w:pPr>
+        <w:rPr>
+          <w:rFonts w:ascii="Times New Roman" w:hAnsi="Times New Roman" w:cs="Times New Roman"/>
+          <w:sz w:val="28"/>
+          <w:szCs w:val="28"/>
+          <w:lang w:val="en-US"/>
+        </w:rPr>
+      </w:pPr>
+      <w:r>
+        <w:rPr>
+          <w:rFonts w:ascii="Times New Roman" w:hAnsi="Times New Roman" w:cs="Times New Roman"/>
+          <w:b/>
+          <w:bCs/>
+          <w:sz w:val="28"/>
+          <w:szCs w:val="28"/>
+          <w:lang w:val="en-US"/>
+        </w:rPr>
+        <w:t>Story</w:t>
+      </w:r>
+      <w:r>
+        <w:rPr>
+          <w:rFonts w:ascii="Times New Roman" w:hAnsi="Times New Roman" w:cs="Times New Roman"/>
+          <w:b/>
+          <w:bCs/>
+          <w:sz w:val="28"/>
+          <w:szCs w:val="28"/>
+          <w:lang w:val="en-US"/>
+        </w:rPr>
+        <w:t>:</w:t>
+      </w:r>
+      <w:r>
+        <w:rPr>
+          <w:rFonts w:ascii="Times New Roman" w:hAnsi="Times New Roman" w:cs="Times New Roman"/>
+          <w:b/>
+          <w:bCs/>
+          <w:sz w:val="28"/>
+          <w:szCs w:val="28"/>
+          <w:lang w:val="en-US"/>
+        </w:rPr>
+        <w:t xml:space="preserve"> </w:t>
+      </w:r>
+      <w:r>
+        <w:rPr>
+          <w:rFonts w:ascii="Times New Roman" w:hAnsi="Times New Roman" w:cs="Times New Roman"/>
+          <w:lang w:val="en-US"/>
+        </w:rPr>
+        <w:t>As an archaeologist, I want to be able to create a 3D cube using my GPR data with the click of a button so that I can properly visualize and identify unmarked graves in the landforms</w:t>
+      </w:r>
+    </w:p>
+    <w:p>
+      <w:pPr>
+        <w:rPr>
+          <w:rFonts w:ascii="Times New Roman" w:hAnsi="Times New Roman" w:cs="Times New Roman"/>
+          <w:b/>
+          <w:bCs/>
+          <w:sz w:val="28"/>
+          <w:szCs w:val="28"/>
+          <w:lang w:val="en-US"/>
+        </w:rPr>
+      </w:pPr>
+      <w:r>
+        <w:rPr>
+          <w:rFonts w:ascii="Times New Roman" w:hAnsi="Times New Roman" w:cs="Times New Roman"/>
+          <w:b/>
+          <w:bCs/>
+          <w:sz w:val="28"/>
+          <w:szCs w:val="28"/>
+          <w:lang w:val="en-US"/>
+        </w:rPr>
+        <w:t>Criteria</w:t>
+      </w:r>
+      <w:r>
+        <w:rPr>
+          <w:rFonts w:ascii="Times New Roman" w:hAnsi="Times New Roman" w:cs="Times New Roman"/>
+          <w:b/>
+          <w:bCs/>
+          <w:sz w:val="28"/>
+          <w:szCs w:val="28"/>
+          <w:lang w:val="en-US"/>
+        </w:rPr>
+        <w:t>:</w:t>
+      </w:r>
+    </w:p>
+    <w:p>
+      <w:pPr>
+        <w:pStyle w:val="ListParagraph"/>
+        <w:numPr>
+          <w:ilvl w:val="0"/>
+          <w:numId w:val="4"/>
+        </w:numPr>
+        <w:rPr>
+          <w:rFonts w:ascii="Times New Roman" w:hAnsi="Times New Roman" w:cs="Times New Roman"/>
+          <w:b/>
+          <w:bCs/>
+          <w:lang w:val="en-US"/>
+        </w:rPr>
+      </w:pPr>
+      <w:r>
+        <w:rPr>
+          <w:rFonts w:ascii="Times New Roman" w:hAnsi="Times New Roman" w:cs="Times New Roman"/>
+          <w:lang w:val="en-US"/>
+        </w:rPr>
+        <w:t xml:space="preserve">Load in batch of </w:t>
+      </w:r>
+      <w:proofErr w:type="spellStart"/>
+      <w:r>
+        <w:rPr>
+          <w:rFonts w:ascii="Times New Roman" w:hAnsi="Times New Roman" w:cs="Times New Roman"/>
+          <w:lang w:val="en-US"/>
+        </w:rPr>
+        <w:t>gpr</w:t>
+      </w:r>
+      <w:proofErr w:type="spellEnd"/>
+      <w:r>
+        <w:rPr>
+          <w:rFonts w:ascii="Times New Roman" w:hAnsi="Times New Roman" w:cs="Times New Roman"/>
+          <w:lang w:val="en-US"/>
+        </w:rPr>
+        <w:t xml:space="preserve"> files</w:t>
+      </w:r>
+    </w:p>
+    <w:p>
+      <w:pPr>
+        <w:pStyle w:val="ListParagraph"/>
+        <w:numPr>
+          <w:ilvl w:val="0"/>
+          <w:numId w:val="4"/>
+        </w:numPr>
+        <w:rPr>
+          <w:rFonts w:ascii="Times New Roman" w:hAnsi="Times New Roman" w:cs="Times New Roman"/>
+          <w:b/>
+          <w:bCs/>
+          <w:lang w:val="en-US"/>
+        </w:rPr>
+      </w:pPr>
+      <w:r>
+        <w:rPr>
+          <w:rFonts w:ascii="Times New Roman" w:hAnsi="Times New Roman" w:cs="Times New Roman"/>
+          <w:b/>
+          <w:bCs/>
+          <w:lang w:val="en-US"/>
+        </w:rPr>
+        <w:t xml:space="preserve"> </w:t>
+      </w:r>
+      <w:r>
+        <w:rPr>
+          <w:rFonts w:ascii="Times New Roman" w:hAnsi="Times New Roman" w:cs="Times New Roman"/>
+          <w:lang w:val="en-US"/>
+        </w:rPr>
+        <w:t xml:space="preserve">Perform matrix manipulation to reduce sampling time </w:t>
+      </w:r>
+    </w:p>
+    <w:p>
+      <w:pPr>
+        <w:pStyle w:val="ListParagraph"/>
+        <w:numPr>
+          <w:ilvl w:val="0"/>
+          <w:numId w:val="4"/>
+        </w:numPr>
+        <w:rPr>
+          <w:rFonts w:ascii="Times New Roman" w:hAnsi="Times New Roman" w:cs="Times New Roman"/>
+          <w:b/>
+          <w:bCs/>
+          <w:lang w:val="en-US"/>
+        </w:rPr>
+      </w:pPr>
+      <w:r>
+        <w:rPr>
+          <w:rFonts w:ascii="Times New Roman" w:hAnsi="Times New Roman" w:cs="Times New Roman"/>
+          <w:lang w:val="en-US"/>
+        </w:rPr>
+        <w:t>Display progress bar to indicate time-to-completion of interpolation step</w:t>
+      </w:r>
+    </w:p>
+    <w:p>
+      <w:pPr>
+        <w:pStyle w:val="ListParagraph"/>
+        <w:numPr>
+          <w:ilvl w:val="0"/>
+          <w:numId w:val="4"/>
+        </w:numPr>
+        <w:rPr>
+          <w:rFonts w:ascii="Times New Roman" w:hAnsi="Times New Roman" w:cs="Times New Roman"/>
+          <w:b/>
+          <w:bCs/>
+          <w:sz w:val="28"/>
+          <w:szCs w:val="28"/>
+          <w:lang w:val="en-US"/>
+        </w:rPr>
+      </w:pPr>
+      <w:r>
+        <w:rPr>
+          <w:rFonts w:ascii="Times New Roman" w:hAnsi="Times New Roman" w:cs="Times New Roman"/>
+          <w:lang w:val="en-US"/>
+        </w:rPr>
+        <w:t>Utilize threads to speed up process of cube generation</w:t>
+      </w:r>
+    </w:p>
+    <w:p>
+      <w:pPr>
+        <w:rPr>
+          <w:rFonts w:ascii="Times New Roman" w:hAnsi="Times New Roman" w:cs="Times New Roman"/>
+          <w:b/>
+          <w:bCs/>
+          <w:sz w:val="28"/>
+          <w:szCs w:val="28"/>
+          <w:lang w:val="en-US"/>
+        </w:rPr>
+      </w:pPr>
+      <w:r>
+        <w:rPr>
+          <w:rFonts w:ascii="Times New Roman" w:hAnsi="Times New Roman" w:cs="Times New Roman"/>
+          <w:b/>
+          <w:bCs/>
+          <w:sz w:val="28"/>
+          <w:szCs w:val="28"/>
+          <w:lang w:val="en-US"/>
+        </w:rPr>
+        <w:t>Story Points</w:t>
+      </w:r>
+      <w:r>
+        <w:rPr>
+          <w:rFonts w:ascii="Times New Roman" w:hAnsi="Times New Roman" w:cs="Times New Roman"/>
+          <w:b/>
+          <w:bCs/>
+          <w:sz w:val="28"/>
+          <w:szCs w:val="28"/>
+          <w:lang w:val="en-US"/>
+        </w:rPr>
+        <w:t>:</w:t>
+      </w:r>
+      <w:r>
+        <w:rPr>
+          <w:rFonts w:ascii="Times New Roman" w:hAnsi="Times New Roman" w:cs="Times New Roman"/>
+          <w:b/>
+          <w:bCs/>
+          <w:sz w:val="28"/>
+          <w:szCs w:val="28"/>
+          <w:lang w:val="en-US"/>
+        </w:rPr>
+        <w:t xml:space="preserve"> </w:t>
+      </w:r>
+      <w:r>
+        <w:rPr>
+          <w:rFonts w:ascii="Times New Roman" w:hAnsi="Times New Roman" w:cs="Times New Roman"/>
+          <w:b/>
+          <w:bCs/>
+          <w:lang w:val="en-US"/>
+        </w:rPr>
+        <w:t>20</w:t>
+      </w:r>
+    </w:p>
+    <w:p>
+      <w:pPr>
+        <w:rPr>
+          <w:rFonts w:ascii="Times New Roman" w:hAnsi="Times New Roman" w:cs="Times New Roman"/>
+          <w:sz w:val="28"/>
+          <w:szCs w:val="28"/>
+          <w:lang w:val="en-US"/>
+        </w:rPr>
+      </w:pPr>
+      <w:r>
+        <w:rPr>
+          <w:rFonts w:ascii="Times New Roman" w:hAnsi="Times New Roman" w:cs="Times New Roman"/>
+          <w:b/>
+          <w:bCs/>
+          <w:sz w:val="28"/>
+          <w:szCs w:val="28"/>
+          <w:lang w:val="en-US"/>
+        </w:rPr>
+        <w:t>Priority</w:t>
+      </w:r>
+      <w:r>
+        <w:rPr>
+          <w:rFonts w:ascii="Times New Roman" w:hAnsi="Times New Roman" w:cs="Times New Roman"/>
+          <w:b/>
+          <w:bCs/>
+          <w:lang w:val="en-US"/>
+        </w:rPr>
+        <w:t>:</w:t>
+      </w:r>
+      <w:r>
+        <w:rPr>
+          <w:rFonts w:ascii="Times New Roman" w:hAnsi="Times New Roman" w:cs="Times New Roman"/>
+          <w:b/>
+          <w:bCs/>
+          <w:lang w:val="en-US"/>
+        </w:rPr>
+        <w:t xml:space="preserve"> </w:t>
+      </w:r>
+      <w:r>
+        <w:rPr>
+          <w:rFonts w:ascii="Times New Roman" w:hAnsi="Times New Roman" w:cs="Times New Roman"/>
+          <w:lang w:val="en-US"/>
+        </w:rPr>
+        <w:t>HIGH</w:t>
+      </w:r>
+    </w:p>
+    <w:p>
+      <w:pPr>
+        <w:rPr>
+          <w:rFonts w:ascii="Times New Roman" w:hAnsi="Times New Roman" w:cs="Times New Roman"/>
+          <w:b/>
+          <w:bCs/>
+          <w:sz w:val="28"/>
+          <w:szCs w:val="28"/>
+          <w:lang w:val="en-US"/>
+        </w:rPr>
+      </w:pPr>
+    </w:p>
+    <w:p>
+      <w:pPr>
+        <w:rPr>
+          <w:rFonts w:ascii="Times New Roman" w:hAnsi="Times New Roman" w:cs="Times New Roman"/>
+          <w:b/>
+          <w:bCs/>
+          <w:sz w:val="28"/>
+          <w:szCs w:val="28"/>
+          <w:lang w:val="en-US"/>
+        </w:rPr>
+      </w:pPr>
+    </w:p>
+    <w:p>
+      <w:pPr>
+        <w:rPr>
+          <w:rFonts w:ascii="Times New Roman" w:hAnsi="Times New Roman" w:cs="Times New Roman"/>
+          <w:b/>
+          <w:bCs/>
+          <w:sz w:val="28"/>
+          <w:szCs w:val="28"/>
+          <w:lang w:val="en-US"/>
+        </w:rPr>
+      </w:pPr>
+    </w:p>
+    <w:p>
+      <w:pPr>
+        <w:rPr>
+          <w:rFonts w:ascii="Times New Roman" w:hAnsi="Times New Roman" w:cs="Times New Roman"/>
+          <w:b/>
+          <w:bCs/>
+          <w:sz w:val="28"/>
+          <w:szCs w:val="28"/>
+          <w:lang w:val="en-US"/>
+        </w:rPr>
+      </w:pPr>
+    </w:p>
+    <w:p>
+      <w:pPr>
+        <w:rPr>
+          <w:rFonts w:ascii="Times New Roman" w:hAnsi="Times New Roman" w:cs="Times New Roman"/>
+          <w:b/>
+          <w:bCs/>
+          <w:sz w:val="28"/>
+          <w:szCs w:val="28"/>
+          <w:lang w:val="en-US"/>
+        </w:rPr>
+      </w:pPr>
+      <w:r>
+        <w:rPr>
+          <w:rFonts w:ascii="Times New Roman" w:hAnsi="Times New Roman" w:cs="Times New Roman"/>
+          <w:b/>
+          <w:bCs/>
+          <w:sz w:val="28"/>
+          <w:szCs w:val="28"/>
+          <w:lang w:val="en-US"/>
+        </w:rPr>
+        <w:lastRenderedPageBreak/>
+        <w:t>Title</w:t>
+      </w:r>
+      <w:r>
+        <w:rPr>
+          <w:rFonts w:ascii="Times New Roman" w:hAnsi="Times New Roman" w:cs="Times New Roman"/>
+          <w:b/>
+          <w:bCs/>
+          <w:sz w:val="28"/>
+          <w:szCs w:val="28"/>
+          <w:lang w:val="en-US"/>
+        </w:rPr>
+        <w:t>:</w:t>
+      </w:r>
+      <w:r>
+        <w:rPr>
+          <w:rFonts w:ascii="Times New Roman" w:hAnsi="Times New Roman" w:cs="Times New Roman"/>
+          <w:b/>
+          <w:bCs/>
+          <w:sz w:val="28"/>
+          <w:szCs w:val="28"/>
+          <w:lang w:val="en-US"/>
+        </w:rPr>
+        <w:t xml:space="preserve"> </w:t>
+      </w:r>
+      <w:r>
+        <w:rPr>
+          <w:rFonts w:ascii="Times New Roman" w:hAnsi="Times New Roman" w:cs="Times New Roman"/>
+          <w:sz w:val="28"/>
+          <w:szCs w:val="28"/>
+          <w:lang w:val="en-US"/>
+        </w:rPr>
+        <w:t>3D Cube Manipulation</w:t>
+      </w:r>
+    </w:p>
+    <w:p>
+      <w:pPr>
+        <w:rPr>
+          <w:rFonts w:ascii="Times New Roman" w:hAnsi="Times New Roman" w:cs="Times New Roman"/>
+          <w:sz w:val="28"/>
+          <w:szCs w:val="28"/>
+          <w:lang w:val="en-US"/>
+        </w:rPr>
+      </w:pPr>
+      <w:r>
+        <w:rPr>
+          <w:rFonts w:ascii="Times New Roman" w:hAnsi="Times New Roman" w:cs="Times New Roman"/>
+          <w:b/>
+          <w:bCs/>
+          <w:sz w:val="28"/>
+          <w:szCs w:val="28"/>
+          <w:lang w:val="en-US"/>
+        </w:rPr>
+        <w:t>Story</w:t>
+      </w:r>
+      <w:r>
+        <w:rPr>
+          <w:rFonts w:ascii="Times New Roman" w:hAnsi="Times New Roman" w:cs="Times New Roman"/>
+          <w:b/>
+          <w:bCs/>
+          <w:sz w:val="28"/>
+          <w:szCs w:val="28"/>
+          <w:lang w:val="en-US"/>
+        </w:rPr>
+        <w:t>:</w:t>
+      </w:r>
+      <w:r>
+        <w:rPr>
+          <w:rFonts w:ascii="Times New Roman" w:hAnsi="Times New Roman" w:cs="Times New Roman"/>
+          <w:b/>
+          <w:bCs/>
+          <w:sz w:val="28"/>
+          <w:szCs w:val="28"/>
+          <w:lang w:val="en-US"/>
+        </w:rPr>
+        <w:t xml:space="preserve"> </w:t>
+      </w:r>
+      <w:r>
+        <w:rPr>
+          <w:rFonts w:ascii="Times New Roman" w:hAnsi="Times New Roman" w:cs="Times New Roman"/>
+          <w:sz w:val="28"/>
+          <w:szCs w:val="28"/>
+          <w:lang w:val="en-US"/>
+        </w:rPr>
+        <w:t>As a</w:t>
+      </w:r>
+      <w:r>
+        <w:rPr>
+          <w:rFonts w:ascii="Times New Roman" w:hAnsi="Times New Roman" w:cs="Times New Roman"/>
+          <w:sz w:val="28"/>
+          <w:szCs w:val="28"/>
+          <w:lang w:val="en-US"/>
+        </w:rPr>
+        <w:t>n archaeologist I would like the ability to load and manipulate 3D cubes based on GPR data so that I don’t have to use a paid software just to do simple operations</w:t>
+      </w:r>
+    </w:p>
+    <w:p>
+      <w:pPr>
+        <w:rPr>
+          <w:rFonts w:ascii="Times New Roman" w:hAnsi="Times New Roman" w:cs="Times New Roman"/>
+          <w:b/>
+          <w:bCs/>
+          <w:sz w:val="28"/>
+          <w:szCs w:val="28"/>
+          <w:lang w:val="en-US"/>
+        </w:rPr>
+      </w:pPr>
+      <w:r>
+        <w:rPr>
+          <w:rFonts w:ascii="Times New Roman" w:hAnsi="Times New Roman" w:cs="Times New Roman"/>
+          <w:b/>
+          <w:bCs/>
+          <w:sz w:val="28"/>
+          <w:szCs w:val="28"/>
+          <w:lang w:val="en-US"/>
+        </w:rPr>
+        <w:t>Criteria</w:t>
+      </w:r>
+      <w:r>
+        <w:rPr>
+          <w:rFonts w:ascii="Times New Roman" w:hAnsi="Times New Roman" w:cs="Times New Roman"/>
+          <w:b/>
+          <w:bCs/>
+          <w:sz w:val="28"/>
+          <w:szCs w:val="28"/>
+          <w:lang w:val="en-US"/>
+        </w:rPr>
+        <w:t>:</w:t>
+      </w:r>
+    </w:p>
+    <w:p>
+      <w:pPr>
+        <w:pStyle w:val="ListParagraph"/>
+        <w:numPr>
+          <w:ilvl w:val="0"/>
+          <w:numId w:val="7"/>
+        </w:numPr>
+        <w:rPr>
+          <w:rFonts w:ascii="Times New Roman" w:hAnsi="Times New Roman" w:cs="Times New Roman"/>
+          <w:b/>
+          <w:bCs/>
+          <w:sz w:val="28"/>
+          <w:szCs w:val="28"/>
+          <w:lang w:val="en-US"/>
+        </w:rPr>
+      </w:pPr>
+      <w:r>
+        <w:rPr>
+          <w:rFonts w:ascii="Times New Roman" w:hAnsi="Times New Roman" w:cs="Times New Roman"/>
+          <w:b/>
+          <w:bCs/>
+          <w:sz w:val="28"/>
+          <w:szCs w:val="28"/>
+          <w:lang w:val="en-US"/>
+        </w:rPr>
+        <w:t xml:space="preserve"> </w:t>
+      </w:r>
+      <w:r>
+        <w:rPr>
+          <w:rFonts w:ascii="Times New Roman" w:hAnsi="Times New Roman" w:cs="Times New Roman"/>
+          <w:sz w:val="28"/>
+          <w:szCs w:val="28"/>
+          <w:lang w:val="en-US"/>
+        </w:rPr>
+        <w:t>Button to load 3D cube</w:t>
+      </w:r>
+    </w:p>
+    <w:p>
+      <w:pPr>
+        <w:pStyle w:val="ListParagraph"/>
+        <w:numPr>
+          <w:ilvl w:val="0"/>
+          <w:numId w:val="7"/>
+        </w:numPr>
+        <w:rPr>
+          <w:rFonts w:ascii="Times New Roman" w:hAnsi="Times New Roman" w:cs="Times New Roman"/>
+          <w:b/>
+          <w:bCs/>
+          <w:sz w:val="28"/>
+          <w:szCs w:val="28"/>
+          <w:lang w:val="en-US"/>
+        </w:rPr>
+      </w:pPr>
+      <w:r>
+        <w:rPr>
+          <w:rFonts w:ascii="Times New Roman" w:hAnsi="Times New Roman" w:cs="Times New Roman"/>
+          <w:b/>
+          <w:bCs/>
+          <w:sz w:val="28"/>
+          <w:szCs w:val="28"/>
+          <w:lang w:val="en-US"/>
+        </w:rPr>
+        <w:t xml:space="preserve"> </w:t>
+      </w:r>
+      <w:r>
+        <w:rPr>
+          <w:rFonts w:ascii="Times New Roman" w:hAnsi="Times New Roman" w:cs="Times New Roman"/>
+          <w:sz w:val="28"/>
+          <w:szCs w:val="28"/>
+          <w:lang w:val="en-US"/>
+        </w:rPr>
+        <w:t xml:space="preserve">Button to </w:t>
+      </w:r>
+      <w:proofErr w:type="gramStart"/>
+      <w:r>
+        <w:rPr>
+          <w:rFonts w:ascii="Times New Roman" w:hAnsi="Times New Roman" w:cs="Times New Roman"/>
+          <w:sz w:val="28"/>
+          <w:szCs w:val="28"/>
+          <w:lang w:val="en-US"/>
+        </w:rPr>
+        <w:t>open up</w:t>
+      </w:r>
+      <w:proofErr w:type="gramEnd"/>
+      <w:r>
+        <w:rPr>
+          <w:rFonts w:ascii="Times New Roman" w:hAnsi="Times New Roman" w:cs="Times New Roman"/>
+          <w:sz w:val="28"/>
+          <w:szCs w:val="28"/>
+          <w:lang w:val="en-US"/>
+        </w:rPr>
+        <w:t xml:space="preserve"> 3D visualization software</w:t>
+      </w:r>
+    </w:p>
+    <w:p>
+      <w:pPr>
+        <w:pStyle w:val="ListParagraph"/>
+        <w:numPr>
+          <w:ilvl w:val="0"/>
+          <w:numId w:val="7"/>
+        </w:numPr>
+        <w:rPr>
+          <w:rFonts w:ascii="Times New Roman" w:hAnsi="Times New Roman" w:cs="Times New Roman"/>
+          <w:b/>
+          <w:bCs/>
+          <w:sz w:val="28"/>
+          <w:szCs w:val="28"/>
+          <w:lang w:val="en-US"/>
+        </w:rPr>
+      </w:pPr>
+      <w:r>
+        <w:rPr>
+          <w:rFonts w:ascii="Times New Roman" w:hAnsi="Times New Roman" w:cs="Times New Roman"/>
+          <w:sz w:val="28"/>
+          <w:szCs w:val="28"/>
+          <w:lang w:val="en-US"/>
+        </w:rPr>
+        <w:t>Include ability to rotate data</w:t>
+      </w:r>
+    </w:p>
+    <w:p>
+      <w:pPr>
+        <w:pStyle w:val="ListParagraph"/>
+        <w:numPr>
+          <w:ilvl w:val="0"/>
+          <w:numId w:val="7"/>
+        </w:numPr>
+        <w:rPr>
+          <w:rFonts w:ascii="Times New Roman" w:hAnsi="Times New Roman" w:cs="Times New Roman"/>
+          <w:b/>
+          <w:bCs/>
+          <w:sz w:val="28"/>
+          <w:szCs w:val="28"/>
+          <w:lang w:val="en-US"/>
+        </w:rPr>
+      </w:pPr>
+      <w:r>
+        <w:rPr>
+          <w:rFonts w:ascii="Times New Roman" w:hAnsi="Times New Roman" w:cs="Times New Roman"/>
+          <w:sz w:val="28"/>
+          <w:szCs w:val="28"/>
+          <w:lang w:val="en-US"/>
+        </w:rPr>
+        <w:t>Add ability to get points/coordinates from one slice/section of the cube</w:t>
+      </w:r>
+    </w:p>
+    <w:p>
+      <w:pPr>
+        <w:pStyle w:val="ListParagraph"/>
+        <w:numPr>
+          <w:ilvl w:val="0"/>
+          <w:numId w:val="7"/>
+        </w:numPr>
+        <w:rPr>
+          <w:rFonts w:ascii="Times New Roman" w:hAnsi="Times New Roman" w:cs="Times New Roman"/>
+          <w:b/>
+          <w:bCs/>
+          <w:sz w:val="28"/>
+          <w:szCs w:val="28"/>
+          <w:lang w:val="en-US"/>
+        </w:rPr>
+      </w:pPr>
+      <w:r>
+        <w:rPr>
+          <w:rFonts w:ascii="Times New Roman" w:hAnsi="Times New Roman" w:cs="Times New Roman"/>
+          <w:sz w:val="28"/>
+          <w:szCs w:val="28"/>
+          <w:lang w:val="en-US"/>
+        </w:rPr>
+        <w:t>Add function to automatically get the coordinates from the slice at every “user defined” interval</w:t>
+      </w:r>
+    </w:p>
+    <w:p>
+      <w:pPr>
+        <w:pStyle w:val="ListParagraph"/>
+        <w:numPr>
+          <w:ilvl w:val="0"/>
+          <w:numId w:val="7"/>
+        </w:numPr>
+        <w:rPr>
+          <w:rFonts w:ascii="Times New Roman" w:hAnsi="Times New Roman" w:cs="Times New Roman"/>
+          <w:b/>
+          <w:bCs/>
+          <w:sz w:val="28"/>
+          <w:szCs w:val="28"/>
+          <w:lang w:val="en-US"/>
+        </w:rPr>
+      </w:pPr>
+      <w:r>
+        <w:rPr>
+          <w:rFonts w:ascii="Times New Roman" w:hAnsi="Times New Roman" w:cs="Times New Roman"/>
+          <w:sz w:val="28"/>
+          <w:szCs w:val="28"/>
+          <w:lang w:val="en-US"/>
+        </w:rPr>
+        <w:t>Store coordinates in a formatted exportable file, like excel</w:t>
+      </w:r>
+    </w:p>
+    <w:p>
+      <w:pPr>
+        <w:rPr>
+          <w:rFonts w:ascii="Times New Roman" w:hAnsi="Times New Roman" w:cs="Times New Roman"/>
+          <w:b/>
+          <w:bCs/>
+          <w:sz w:val="28"/>
+          <w:szCs w:val="28"/>
+          <w:lang w:val="en-US"/>
+        </w:rPr>
+      </w:pPr>
+      <w:r>
+        <w:rPr>
+          <w:rFonts w:ascii="Times New Roman" w:hAnsi="Times New Roman" w:cs="Times New Roman"/>
+          <w:b/>
+          <w:bCs/>
+          <w:sz w:val="28"/>
+          <w:szCs w:val="28"/>
+          <w:lang w:val="en-US"/>
+        </w:rPr>
+        <w:t>Story Points</w:t>
+      </w:r>
+      <w:r>
+        <w:rPr>
+          <w:rFonts w:ascii="Times New Roman" w:hAnsi="Times New Roman" w:cs="Times New Roman"/>
+          <w:b/>
+          <w:bCs/>
+          <w:sz w:val="28"/>
+          <w:szCs w:val="28"/>
+          <w:lang w:val="en-US"/>
+        </w:rPr>
+        <w:t>:</w:t>
+      </w:r>
+      <w:r>
+        <w:rPr>
+          <w:rFonts w:ascii="Times New Roman" w:hAnsi="Times New Roman" w:cs="Times New Roman"/>
+          <w:b/>
+          <w:bCs/>
+          <w:sz w:val="28"/>
+          <w:szCs w:val="28"/>
+          <w:lang w:val="en-US"/>
+        </w:rPr>
+        <w:t xml:space="preserve"> </w:t>
+      </w:r>
+      <w:r>
+        <w:rPr>
+          <w:rFonts w:ascii="Times New Roman" w:hAnsi="Times New Roman" w:cs="Times New Roman"/>
+          <w:sz w:val="28"/>
+          <w:szCs w:val="28"/>
+          <w:lang w:val="en-US"/>
+        </w:rPr>
+        <w:t>15</w:t>
+      </w:r>
+    </w:p>
+    <w:p>
+      <w:pPr>
+        <w:rPr>
+          <w:rFonts w:ascii="Times New Roman" w:hAnsi="Times New Roman" w:cs="Times New Roman"/>
+          <w:b/>
+          <w:bCs/>
+          <w:sz w:val="28"/>
+          <w:szCs w:val="28"/>
+          <w:lang w:val="en-US"/>
+        </w:rPr>
+      </w:pPr>
+      <w:r>
+        <w:rPr>
+          <w:rFonts w:ascii="Times New Roman" w:hAnsi="Times New Roman" w:cs="Times New Roman"/>
+          <w:b/>
+          <w:bCs/>
+          <w:sz w:val="28"/>
+          <w:szCs w:val="28"/>
+          <w:lang w:val="en-US"/>
+        </w:rPr>
+        <w:t>Priority</w:t>
+      </w:r>
+      <w:r>
+        <w:rPr>
+          <w:rFonts w:ascii="Times New Roman" w:hAnsi="Times New Roman" w:cs="Times New Roman"/>
+          <w:b/>
+          <w:bCs/>
+          <w:sz w:val="28"/>
+          <w:szCs w:val="28"/>
+          <w:lang w:val="en-US"/>
+        </w:rPr>
+        <w:t>:</w:t>
+      </w:r>
+      <w:r>
+        <w:rPr>
+          <w:rFonts w:ascii="Times New Roman" w:hAnsi="Times New Roman" w:cs="Times New Roman"/>
+          <w:b/>
+          <w:bCs/>
+          <w:sz w:val="28"/>
+          <w:szCs w:val="28"/>
+          <w:lang w:val="en-US"/>
+        </w:rPr>
+        <w:t xml:space="preserve"> </w:t>
+      </w:r>
+      <w:r>
+        <w:rPr>
+          <w:rFonts w:ascii="Times New Roman" w:hAnsi="Times New Roman" w:cs="Times New Roman"/>
+          <w:sz w:val="28"/>
+          <w:szCs w:val="28"/>
+          <w:lang w:val="en-US"/>
+        </w:rPr>
+        <w:t>HIGH</w:t>
+      </w:r>
+    </w:p>
+    <w:p>
+      <w:pPr>
+        <w:rPr>
+          <w:rFonts w:ascii="Times New Roman" w:hAnsi="Times New Roman" w:cs="Times New Roman"/>
+          <w:b/>
+          <w:bCs/>
+          <w:sz w:val="28"/>
+          <w:szCs w:val="28"/>
+          <w:lang w:val="en-US"/>
+        </w:rPr>
+      </w:pPr>
+    </w:p>
+    <w:p>
+      <w:pPr>
+        <w:rPr>
+          <w:rFonts w:ascii="Times New Roman" w:hAnsi="Times New Roman" w:cs="Times New Roman"/>
+          <w:b/>
+          <w:bCs/>
+          <w:sz w:val="28"/>
+          <w:szCs w:val="28"/>
+          <w:lang w:val="en-US"/>
+        </w:rPr>
+      </w:pPr>
+      <w:r>
+        <w:rPr>
+          <w:rFonts w:ascii="Times New Roman" w:hAnsi="Times New Roman" w:cs="Times New Roman"/>
+          <w:b/>
+          <w:bCs/>
+          <w:sz w:val="28"/>
+          <w:szCs w:val="28"/>
+          <w:lang w:val="en-US"/>
+        </w:rPr>
+        <w:t>Title</w:t>
+      </w:r>
+      <w:r>
+        <w:rPr>
+          <w:rFonts w:ascii="Times New Roman" w:hAnsi="Times New Roman" w:cs="Times New Roman"/>
+          <w:b/>
+          <w:bCs/>
+          <w:sz w:val="28"/>
+          <w:szCs w:val="28"/>
+          <w:lang w:val="en-US"/>
+        </w:rPr>
+        <w:t>:</w:t>
+      </w:r>
+    </w:p>
+    <w:p>
+      <w:pPr>
+        <w:rPr>
+          <w:rFonts w:ascii="Times New Roman" w:hAnsi="Times New Roman" w:cs="Times New Roman"/>
+          <w:b/>
+          <w:bCs/>
+          <w:sz w:val="28"/>
+          <w:szCs w:val="28"/>
+          <w:lang w:val="en-US"/>
+        </w:rPr>
+      </w:pPr>
+    </w:p>
+    <w:p>
+      <w:pPr>
+        <w:rPr>
+          <w:rFonts w:ascii="Times New Roman" w:hAnsi="Times New Roman" w:cs="Times New Roman"/>
+          <w:b/>
+          <w:bCs/>
+          <w:sz w:val="28"/>
+          <w:szCs w:val="28"/>
+          <w:lang w:val="en-US"/>
+        </w:rPr>
+      </w:pPr>
+      <w:r>
+        <w:rPr>
+          <w:rFonts w:ascii="Times New Roman" w:hAnsi="Times New Roman" w:cs="Times New Roman"/>
+          <w:b/>
+          <w:bCs/>
+          <w:sz w:val="28"/>
+          <w:szCs w:val="28"/>
+          <w:lang w:val="en-US"/>
+        </w:rPr>
+        <w:t>Story</w:t>
+      </w:r>
+      <w:r>
+        <w:rPr>
+          <w:rFonts w:ascii="Times New Roman" w:hAnsi="Times New Roman" w:cs="Times New Roman"/>
+          <w:b/>
+          <w:bCs/>
+          <w:sz w:val="28"/>
+          <w:szCs w:val="28"/>
+          <w:lang w:val="en-US"/>
+        </w:rPr>
+        <w:t>:</w:t>
+      </w:r>
+    </w:p>
+    <w:p>
+      <w:pPr>
+        <w:rPr>
+          <w:rFonts w:ascii="Times New Roman" w:hAnsi="Times New Roman" w:cs="Times New Roman"/>
+          <w:b/>
+          <w:bCs/>
+          <w:sz w:val="28"/>
+          <w:szCs w:val="28"/>
+          <w:lang w:val="en-US"/>
+        </w:rPr>
+      </w:pPr>
+    </w:p>
+    <w:p>
+      <w:pPr>
+        <w:rPr>
+          <w:rFonts w:ascii="Times New Roman" w:hAnsi="Times New Roman" w:cs="Times New Roman"/>
+          <w:b/>
+          <w:bCs/>
+          <w:sz w:val="28"/>
+          <w:szCs w:val="28"/>
+          <w:lang w:val="en-US"/>
+        </w:rPr>
+      </w:pPr>
+      <w:r>
+        <w:rPr>
+          <w:rFonts w:ascii="Times New Roman" w:hAnsi="Times New Roman" w:cs="Times New Roman"/>
+          <w:b/>
+          <w:bCs/>
+          <w:sz w:val="28"/>
+          <w:szCs w:val="28"/>
+          <w:lang w:val="en-US"/>
+        </w:rPr>
+        <w:t>Criteria</w:t>
+      </w:r>
+      <w:r>
+        <w:rPr>
+          <w:rFonts w:ascii="Times New Roman" w:hAnsi="Times New Roman" w:cs="Times New Roman"/>
+          <w:b/>
+          <w:bCs/>
+          <w:sz w:val="28"/>
+          <w:szCs w:val="28"/>
+          <w:lang w:val="en-US"/>
+        </w:rPr>
+        <w:t>:</w:t>
+      </w:r>
+    </w:p>
+    <w:p>
+      <w:pPr>
+        <w:pStyle w:val="ListParagraph"/>
+        <w:numPr>
+          <w:ilvl w:val="0"/>
+          <w:numId w:val="8"/>
+        </w:numPr>
+        <w:rPr>
+          <w:rFonts w:ascii="Times New Roman" w:hAnsi="Times New Roman" w:cs="Times New Roman"/>
+          <w:b/>
+          <w:bCs/>
+          <w:sz w:val="28"/>
+          <w:szCs w:val="28"/>
+          <w:lang w:val="en-US"/>
+        </w:rPr>
+      </w:pPr>
+      <w:r>
+        <w:rPr>
+          <w:rFonts w:ascii="Times New Roman" w:hAnsi="Times New Roman" w:cs="Times New Roman"/>
+          <w:b/>
+          <w:bCs/>
+          <w:sz w:val="28"/>
+          <w:szCs w:val="28"/>
+          <w:lang w:val="en-US"/>
+        </w:rPr>
+        <w:t xml:space="preserve"> </w:t>
+      </w:r>
+    </w:p>
+    <w:p>
+      <w:pPr>
+        <w:pStyle w:val="ListParagraph"/>
+        <w:numPr>
+          <w:ilvl w:val="0"/>
+          <w:numId w:val="8"/>
+        </w:numPr>
+        <w:rPr>
+          <w:rFonts w:ascii="Times New Roman" w:hAnsi="Times New Roman" w:cs="Times New Roman"/>
+          <w:b/>
+          <w:bCs/>
+          <w:sz w:val="28"/>
+          <w:szCs w:val="28"/>
+          <w:lang w:val="en-US"/>
+        </w:rPr>
+      </w:pPr>
+      <w:r>
+        <w:rPr>
+          <w:rFonts w:ascii="Times New Roman" w:hAnsi="Times New Roman" w:cs="Times New Roman"/>
+          <w:b/>
+          <w:bCs/>
+          <w:sz w:val="28"/>
+          <w:szCs w:val="28"/>
+          <w:lang w:val="en-US"/>
+        </w:rPr>
+        <w:t xml:space="preserve"> </w:t>
+      </w:r>
+    </w:p>
+    <w:p>
+      <w:pPr>
+        <w:rPr>
+          <w:rFonts w:ascii="Times New Roman" w:hAnsi="Times New Roman" w:cs="Times New Roman"/>
+          <w:b/>
+          <w:bCs/>
+          <w:sz w:val="28"/>
+          <w:szCs w:val="28"/>
+          <w:lang w:val="en-US"/>
+        </w:rPr>
+      </w:pPr>
+      <w:r>
+        <w:rPr>
+          <w:rFonts w:ascii="Times New Roman" w:hAnsi="Times New Roman" w:cs="Times New Roman"/>
+          <w:b/>
+          <w:bCs/>
+          <w:sz w:val="28"/>
+          <w:szCs w:val="28"/>
+          <w:lang w:val="en-US"/>
+        </w:rPr>
+        <w:t>Story Points</w:t>
+      </w:r>
+      <w:r>
+        <w:rPr>
+          <w:rFonts w:ascii="Times New Roman" w:hAnsi="Times New Roman" w:cs="Times New Roman"/>
+          <w:b/>
+          <w:bCs/>
+          <w:sz w:val="28"/>
+          <w:szCs w:val="28"/>
+          <w:lang w:val="en-US"/>
+        </w:rPr>
+        <w:t>:</w:t>
+      </w:r>
+    </w:p>
+    <w:p>
+      <w:pPr>
+        <w:rPr>
+          <w:rFonts w:ascii="Times New Roman" w:hAnsi="Times New Roman" w:cs="Times New Roman"/>
+          <w:b/>
+          <w:bCs/>
+          <w:sz w:val="28"/>
+          <w:szCs w:val="28"/>
+          <w:lang w:val="en-US"/>
+        </w:rPr>
+      </w:pPr>
+      <w:r>
+        <w:rPr>
+          <w:rFonts w:ascii="Times New Roman" w:hAnsi="Times New Roman" w:cs="Times New Roman"/>
+          <w:b/>
+          <w:bCs/>
+          <w:sz w:val="28"/>
+          <w:szCs w:val="28"/>
+          <w:lang w:val="en-US"/>
+        </w:rPr>
+        <w:t>Priority</w:t>
+      </w:r>
+      <w:r>
+        <w:rPr>
+          <w:rFonts w:ascii="Times New Roman" w:hAnsi="Times New Roman" w:cs="Times New Roman"/>
+          <w:b/>
+          <w:bCs/>
+          <w:sz w:val="28"/>
+          <w:szCs w:val="28"/>
+          <w:lang w:val="en-US"/>
+        </w:rPr>
+        <w:t>:</w:t>
+      </w:r>
+    </w:p>
+    <w:p>
+      <w:pPr>
+        <w:rPr>
+          <w:rFonts w:ascii="Times New Roman" w:hAnsi="Times New Roman" w:cs="Times New Roman"/>
+          <w:b/>
+          <w:bCs/>
+          <w:sz w:val="28"/>
+          <w:szCs w:val="28"/>
+          <w:lang w:val="en-US"/>
+        </w:rPr>
+      </w:pPr>
+    </w:p>
+    <w:p>
+      <w:pPr>
+        <w:rPr>
+          <w:rFonts w:ascii="Times New Roman" w:hAnsi="Times New Roman" w:cs="Times New Roman"/>
+          <w:b/>
+          <w:bCs/>
+          <w:sz w:val="28"/>
+          <w:szCs w:val="28"/>
+          <w:lang w:val="en-US"/>
+        </w:rPr>
+      </w:pPr>
+      <w:r>
+        <w:rPr>
+          <w:rFonts w:ascii="Times New Roman" w:hAnsi="Times New Roman" w:cs="Times New Roman"/>
+          <w:b/>
+          <w:bCs/>
+          <w:sz w:val="28"/>
+          <w:szCs w:val="28"/>
+          <w:lang w:val="en-US"/>
+        </w:rPr>
+        <w:t>Title</w:t>
+      </w:r>
+      <w:r>
+        <w:rPr>
+          <w:rFonts w:ascii="Times New Roman" w:hAnsi="Times New Roman" w:cs="Times New Roman"/>
+          <w:b/>
+          <w:bCs/>
+          <w:sz w:val="28"/>
+          <w:szCs w:val="28"/>
+          <w:lang w:val="en-US"/>
+        </w:rPr>
+        <w:t>:</w:t>
+      </w:r>
+    </w:p>
+    <w:p>
+      <w:pPr>
+        <w:rPr>
+          <w:rFonts w:ascii="Times New Roman" w:hAnsi="Times New Roman" w:cs="Times New Roman"/>
+          <w:b/>
+          <w:bCs/>
+          <w:sz w:val="28"/>
+          <w:szCs w:val="28"/>
+          <w:lang w:val="en-US"/>
+        </w:rPr>
+      </w:pPr>
+    </w:p>
+    <w:p>
+      <w:pPr>
+        <w:rPr>
+          <w:rFonts w:ascii="Times New Roman" w:hAnsi="Times New Roman" w:cs="Times New Roman"/>
+          <w:b/>
+          <w:bCs/>
+          <w:sz w:val="28"/>
+          <w:szCs w:val="28"/>
+          <w:lang w:val="en-US"/>
+        </w:rPr>
+      </w:pPr>
+      <w:r>
+        <w:rPr>
+          <w:rFonts w:ascii="Times New Roman" w:hAnsi="Times New Roman" w:cs="Times New Roman"/>
+          <w:b/>
+          <w:bCs/>
+          <w:sz w:val="28"/>
+          <w:szCs w:val="28"/>
+          <w:lang w:val="en-US"/>
+        </w:rPr>
+        <w:t>Story</w:t>
+      </w:r>
+      <w:r>
+        <w:rPr>
+          <w:rFonts w:ascii="Times New Roman" w:hAnsi="Times New Roman" w:cs="Times New Roman"/>
+          <w:b/>
+          <w:bCs/>
+          <w:sz w:val="28"/>
+          <w:szCs w:val="28"/>
+          <w:lang w:val="en-US"/>
+        </w:rPr>
+        <w:t>:</w:t>
+      </w:r>
+    </w:p>
+    <w:p>
+      <w:pPr>
+        <w:rPr>
+          <w:rFonts w:ascii="Times New Roman" w:hAnsi="Times New Roman" w:cs="Times New Roman"/>
+          <w:b/>
+          <w:bCs/>
+          <w:sz w:val="28"/>
+          <w:szCs w:val="28"/>
+          <w:lang w:val="en-US"/>
+        </w:rPr>
+      </w:pPr>
+    </w:p>
+    <w:p>
+      <w:pPr>
+        <w:rPr>
+          <w:rFonts w:ascii="Times New Roman" w:hAnsi="Times New Roman" w:cs="Times New Roman"/>
+          <w:b/>
+          <w:bCs/>
+          <w:sz w:val="28"/>
+          <w:szCs w:val="28"/>
+          <w:lang w:val="en-US"/>
+        </w:rPr>
+      </w:pPr>
+      <w:r>
+        <w:rPr>
+          <w:rFonts w:ascii="Times New Roman" w:hAnsi="Times New Roman" w:cs="Times New Roman"/>
+          <w:b/>
+          <w:bCs/>
+          <w:sz w:val="28"/>
+          <w:szCs w:val="28"/>
+          <w:lang w:val="en-US"/>
+        </w:rPr>
+        <w:lastRenderedPageBreak/>
+        <w:t>Criteria</w:t>
+      </w:r>
+      <w:r>
+        <w:rPr>
+          <w:rFonts w:ascii="Times New Roman" w:hAnsi="Times New Roman" w:cs="Times New Roman"/>
+          <w:b/>
+          <w:bCs/>
+          <w:sz w:val="28"/>
+          <w:szCs w:val="28"/>
+          <w:lang w:val="en-US"/>
+        </w:rPr>
+        <w:t>:</w:t>
+      </w:r>
+    </w:p>
+    <w:p>
+      <w:pPr>
+        <w:pStyle w:val="ListParagraph"/>
+        <w:numPr>
+          <w:ilvl w:val="0"/>
+          <w:numId w:val="9"/>
+        </w:numPr>
+        <w:rPr>
+          <w:rFonts w:ascii="Times New Roman" w:hAnsi="Times New Roman" w:cs="Times New Roman"/>
+          <w:b/>
+          <w:bCs/>
+          <w:sz w:val="28"/>
+          <w:szCs w:val="28"/>
+          <w:lang w:val="en-US"/>
+        </w:rPr>
+      </w:pPr>
+      <w:r>
+        <w:rPr>
+          <w:rFonts w:ascii="Times New Roman" w:hAnsi="Times New Roman" w:cs="Times New Roman"/>
+          <w:b/>
+          <w:bCs/>
+          <w:sz w:val="28"/>
+          <w:szCs w:val="28"/>
+          <w:lang w:val="en-US"/>
+        </w:rPr>
+        <w:t xml:space="preserve"> </w:t>
+      </w:r>
+    </w:p>
+    <w:p>
+      <w:pPr>
+        <w:pStyle w:val="ListParagraph"/>
+        <w:numPr>
+          <w:ilvl w:val="0"/>
+          <w:numId w:val="9"/>
+        </w:numPr>
+        <w:rPr>
+          <w:rFonts w:ascii="Times New Roman" w:hAnsi="Times New Roman" w:cs="Times New Roman"/>
+          <w:b/>
+          <w:bCs/>
+          <w:sz w:val="28"/>
+          <w:szCs w:val="28"/>
+          <w:lang w:val="en-US"/>
+        </w:rPr>
+      </w:pPr>
+      <w:r>
+        <w:rPr>
+          <w:rFonts w:ascii="Times New Roman" w:hAnsi="Times New Roman" w:cs="Times New Roman"/>
+          <w:b/>
+          <w:bCs/>
+          <w:sz w:val="28"/>
+          <w:szCs w:val="28"/>
+          <w:lang w:val="en-US"/>
+        </w:rPr>
+        <w:t xml:space="preserve"> </w:t>
+      </w:r>
+    </w:p>
+    <w:p>
+      <w:pPr>
+        <w:rPr>
+          <w:rFonts w:ascii="Times New Roman" w:hAnsi="Times New Roman" w:cs="Times New Roman"/>
+          <w:b/>
+          <w:bCs/>
+          <w:sz w:val="28"/>
+          <w:szCs w:val="28"/>
+          <w:lang w:val="en-US"/>
+        </w:rPr>
+      </w:pPr>
+      <w:r>
+        <w:rPr>
+          <w:rFonts w:ascii="Times New Roman" w:hAnsi="Times New Roman" w:cs="Times New Roman"/>
+          <w:b/>
+          <w:bCs/>
+          <w:sz w:val="28"/>
+          <w:szCs w:val="28"/>
+          <w:lang w:val="en-US"/>
+        </w:rPr>
+        <w:t>Story Points</w:t>
+      </w:r>
+      <w:r>
+        <w:rPr>
+          <w:rFonts w:ascii="Times New Roman" w:hAnsi="Times New Roman" w:cs="Times New Roman"/>
+          <w:b/>
+          <w:bCs/>
+          <w:sz w:val="28"/>
+          <w:szCs w:val="28"/>
+          <w:lang w:val="en-US"/>
+        </w:rPr>
+        <w:t>:</w:t>
+      </w:r>
+    </w:p>
+    <w:p>
+      <w:pPr>
+        <w:rPr>
+          <w:rFonts w:ascii="Times New Roman" w:hAnsi="Times New Roman" w:cs="Times New Roman"/>
+          <w:b/>
+          <w:bCs/>
+          <w:sz w:val="28"/>
+          <w:szCs w:val="28"/>
+          <w:lang w:val="en-US"/>
+        </w:rPr>
+      </w:pPr>
+      <w:r>
+        <w:rPr>
+          <w:rFonts w:ascii="Times New Roman" w:hAnsi="Times New Roman" w:cs="Times New Roman"/>
+          <w:b/>
+          <w:bCs/>
+          <w:sz w:val="28"/>
+          <w:szCs w:val="28"/>
+          <w:lang w:val="en-US"/>
+        </w:rPr>
+        <w:t>Priority</w:t>
+      </w:r>
+      <w:r>
+        <w:rPr>
+          <w:rFonts w:ascii="Times New Roman" w:hAnsi="Times New Roman" w:cs="Times New Roman"/>
+          <w:b/>
+          <w:bCs/>
+          <w:sz w:val="28"/>
+          <w:szCs w:val="28"/>
+          <w:lang w:val="en-US"/>
+        </w:rPr>
+        <w:t>:</w:t>
+      </w:r>
+    </w:p>
+    <w:p>
+      <w:pPr>
+        <w:rPr>
+          <w:rFonts w:ascii="Times New Roman" w:hAnsi="Times New Roman" w:cs="Times New Roman"/>
+          <w:b/>
+          <w:bCs/>
+          <w:sz w:val="28"/>
+          <w:szCs w:val="28"/>
+          <w:lang w:val="en-US"/>
+        </w:rPr>
+      </w:pPr>
+    </w:p>
+    <w:p>
+      <w:pPr>
+        <w:rPr>
+          <w:rFonts w:ascii="Times New Roman" w:hAnsi="Times New Roman" w:cs="Times New Roman"/>
+          <w:b/>
+          <w:bCs/>
+          <w:sz w:val="28"/>
+          <w:szCs w:val="28"/>
+          <w:lang w:val="en-US"/>
+        </w:rPr>
+      </w:pPr>
     </w:p>
     <w:sectPr>
       <w:pgSz w:w="11906" w:h="16838"/>
@@ -34,6 +1818,843 @@
     </w:sectPr>
   </w:body>
 </w:document>
+</file>
+
+<file path=word/numbering.xml><?xml version="1.0" encoding="utf-8"?>
+<w:numbering xmlns:wpc="http://schemas.microsoft.com/office/word/2010/wordprocessingCanvas" xmlns:cx="http://schemas.microsoft.com/office/drawing/2014/chartex" xmlns:cx1="http://schemas.microsoft.com/office/drawing/2015/9/8/chartex" xmlns:cx2="http://schemas.microsoft.com/office/drawing/2015/10/21/chartex" xmlns:cx3="http://schemas.microsoft.com/office/drawing/2016/5/9/chartex" xmlns:cx4="http://schemas.microsoft.com/office/drawing/2016/5/10/chartex" xmlns:cx5="http://schemas.microsoft.com/office/drawing/2016/5/11/chartex" xmlns:cx6="http://schemas.microsoft.com/office/drawing/2016/5/12/chartex" xmlns:cx7="http://schemas.microsoft.com/office/drawing/2016/5/13/chartex" xmlns:cx8="http://schemas.microsoft.com/office/drawing/2016/5/14/chartex" xmlns:mc="http://schemas.openxmlformats.org/markup-compatibility/2006" xmlns:aink="http://schemas.microsoft.com/office/drawing/2016/ink" xmlns:am3d="http://schemas.microsoft.com/office/drawing/2017/model3d" xmlns:o="urn:schemas-microsoft-com:office:office" xmlns:oel="http://schemas.microsoft.com/office/2019/extlst" xmlns:r="http://schemas.openxmlformats.org/officeDocument/2006/relationships" xmlns:m="http://schemas.openxmlformats.org/officeDocument/2006/math" xmlns:v="urn:schemas-microsoft-com:vml" xmlns:wp14="http://schemas.microsoft.com/office/word/2010/wordprocessingDrawing" xmlns:wp="http://schemas.openxmlformats.org/drawingml/2006/wordprocessingDrawing" xmlns:w10="urn:schemas-microsoft-com:office:word" xmlns:w="http://schemas.openxmlformats.org/wordprocessingml/2006/main" xmlns:w14="http://schemas.microsoft.com/office/word/2010/wordml" xmlns:w15="http://schemas.microsoft.com/office/word/2012/wordml" xmlns:w16cex="http://schemas.microsoft.com/office/word/2018/wordml/cex" xmlns:w16cid="http://schemas.microsoft.com/office/word/2016/wordml/cid" xmlns:w16="http://schemas.microsoft.com/office/word/2018/wordml" xmlns:w16du="http://schemas.microsoft.com/office/word/2023/wordml/word16du" xmlns:w16sdtdh="http://schemas.microsoft.com/office/word/2020/wordml/sdtdatahash" xmlns:w16sdtfl="http://schemas.microsoft.com/office/word/2024/wordml/sdtformatlock" xmlns:w16se="http://schemas.microsoft.com/office/word/2015/wordml/symex" xmlns:wpg="http://schemas.microsoft.com/office/word/2010/wordprocessingGroup" xmlns:wpi="http://schemas.microsoft.com/office/word/2010/wordprocessingInk" xmlns:wne="http://schemas.microsoft.com/office/word/2006/wordml" xmlns:wps="http://schemas.microsoft.com/office/word/2010/wordprocessingShape" mc:Ignorable="w14 w15 w16se w16cid w16 w16cex w16sdtdh w16sdtfl w16du wp14">
+  <w:abstractNum w:abstractNumId="0" w15:restartNumberingAfterBreak="0">
+    <w:nsid w:val="08BF25B2"/>
+    <w:multiLevelType w:val="hybridMultilevel"/>
+    <w:tmpl w:val="42341D0A"/>
+    <w:lvl w:ilvl="0" w:tplc="08090011">
+      <w:start w:val="1"/>
+      <w:numFmt w:val="decimal"/>
+      <w:lvlText w:val="%1)"/>
+      <w:lvlJc w:val="left"/>
+      <w:pPr>
+        <w:ind w:left="720" w:hanging="360"/>
+      </w:pPr>
+      <w:rPr>
+        <w:rFonts w:hint="default"/>
+      </w:rPr>
+    </w:lvl>
+    <w:lvl w:ilvl="1" w:tplc="08090019" w:tentative="1">
+      <w:start w:val="1"/>
+      <w:numFmt w:val="lowerLetter"/>
+      <w:lvlText w:val="%2."/>
+      <w:lvlJc w:val="left"/>
+      <w:pPr>
+        <w:ind w:left="1440" w:hanging="360"/>
+      </w:pPr>
+    </w:lvl>
+    <w:lvl w:ilvl="2" w:tplc="0809001B" w:tentative="1">
+      <w:start w:val="1"/>
+      <w:numFmt w:val="lowerRoman"/>
+      <w:lvlText w:val="%3."/>
+      <w:lvlJc w:val="right"/>
+      <w:pPr>
+        <w:ind w:left="2160" w:hanging="180"/>
+      </w:pPr>
+    </w:lvl>
+    <w:lvl w:ilvl="3" w:tplc="0809000F" w:tentative="1">
+      <w:start w:val="1"/>
+      <w:numFmt w:val="decimal"/>
+      <w:lvlText w:val="%4."/>
+      <w:lvlJc w:val="left"/>
+      <w:pPr>
+        <w:ind w:left="2880" w:hanging="360"/>
+      </w:pPr>
+    </w:lvl>
+    <w:lvl w:ilvl="4" w:tplc="08090019" w:tentative="1">
+      <w:start w:val="1"/>
+      <w:numFmt w:val="lowerLetter"/>
+      <w:lvlText w:val="%5."/>
+      <w:lvlJc w:val="left"/>
+      <w:pPr>
+        <w:ind w:left="3600" w:hanging="360"/>
+      </w:pPr>
+    </w:lvl>
+    <w:lvl w:ilvl="5" w:tplc="0809001B" w:tentative="1">
+      <w:start w:val="1"/>
+      <w:numFmt w:val="lowerRoman"/>
+      <w:lvlText w:val="%6."/>
+      <w:lvlJc w:val="right"/>
+      <w:pPr>
+        <w:ind w:left="4320" w:hanging="180"/>
+      </w:pPr>
+    </w:lvl>
+    <w:lvl w:ilvl="6" w:tplc="0809000F" w:tentative="1">
+      <w:start w:val="1"/>
+      <w:numFmt w:val="decimal"/>
+      <w:lvlText w:val="%7."/>
+      <w:lvlJc w:val="left"/>
+      <w:pPr>
+        <w:ind w:left="5040" w:hanging="360"/>
+      </w:pPr>
+    </w:lvl>
+    <w:lvl w:ilvl="7" w:tplc="08090019" w:tentative="1">
+      <w:start w:val="1"/>
+      <w:numFmt w:val="lowerLetter"/>
+      <w:lvlText w:val="%8."/>
+      <w:lvlJc w:val="left"/>
+      <w:pPr>
+        <w:ind w:left="5760" w:hanging="360"/>
+      </w:pPr>
+    </w:lvl>
+    <w:lvl w:ilvl="8" w:tplc="0809001B" w:tentative="1">
+      <w:start w:val="1"/>
+      <w:numFmt w:val="lowerRoman"/>
+      <w:lvlText w:val="%9."/>
+      <w:lvlJc w:val="right"/>
+      <w:pPr>
+        <w:ind w:left="6480" w:hanging="180"/>
+      </w:pPr>
+    </w:lvl>
+  </w:abstractNum>
+  <w:abstractNum w:abstractNumId="1" w15:restartNumberingAfterBreak="0">
+    <w:nsid w:val="0DD55FE7"/>
+    <w:multiLevelType w:val="hybridMultilevel"/>
+    <w:tmpl w:val="42341D0A"/>
+    <w:lvl w:ilvl="0" w:tplc="FFFFFFFF">
+      <w:start w:val="1"/>
+      <w:numFmt w:val="decimal"/>
+      <w:lvlText w:val="%1)"/>
+      <w:lvlJc w:val="left"/>
+      <w:pPr>
+        <w:ind w:left="720" w:hanging="360"/>
+      </w:pPr>
+      <w:rPr>
+        <w:rFonts w:hint="default"/>
+      </w:rPr>
+    </w:lvl>
+    <w:lvl w:ilvl="1" w:tplc="FFFFFFFF" w:tentative="1">
+      <w:start w:val="1"/>
+      <w:numFmt w:val="lowerLetter"/>
+      <w:lvlText w:val="%2."/>
+      <w:lvlJc w:val="left"/>
+      <w:pPr>
+        <w:ind w:left="1440" w:hanging="360"/>
+      </w:pPr>
+    </w:lvl>
+    <w:lvl w:ilvl="2" w:tplc="FFFFFFFF" w:tentative="1">
+      <w:start w:val="1"/>
+      <w:numFmt w:val="lowerRoman"/>
+      <w:lvlText w:val="%3."/>
+      <w:lvlJc w:val="right"/>
+      <w:pPr>
+        <w:ind w:left="2160" w:hanging="180"/>
+      </w:pPr>
+    </w:lvl>
+    <w:lvl w:ilvl="3" w:tplc="FFFFFFFF" w:tentative="1">
+      <w:start w:val="1"/>
+      <w:numFmt w:val="decimal"/>
+      <w:lvlText w:val="%4."/>
+      <w:lvlJc w:val="left"/>
+      <w:pPr>
+        <w:ind w:left="2880" w:hanging="360"/>
+      </w:pPr>
+    </w:lvl>
+    <w:lvl w:ilvl="4" w:tplc="FFFFFFFF" w:tentative="1">
+      <w:start w:val="1"/>
+      <w:numFmt w:val="lowerLetter"/>
+      <w:lvlText w:val="%5."/>
+      <w:lvlJc w:val="left"/>
+      <w:pPr>
+        <w:ind w:left="3600" w:hanging="360"/>
+      </w:pPr>
+    </w:lvl>
+    <w:lvl w:ilvl="5" w:tplc="FFFFFFFF" w:tentative="1">
+      <w:start w:val="1"/>
+      <w:numFmt w:val="lowerRoman"/>
+      <w:lvlText w:val="%6."/>
+      <w:lvlJc w:val="right"/>
+      <w:pPr>
+        <w:ind w:left="4320" w:hanging="180"/>
+      </w:pPr>
+    </w:lvl>
+    <w:lvl w:ilvl="6" w:tplc="FFFFFFFF" w:tentative="1">
+      <w:start w:val="1"/>
+      <w:numFmt w:val="decimal"/>
+      <w:lvlText w:val="%7."/>
+      <w:lvlJc w:val="left"/>
+      <w:pPr>
+        <w:ind w:left="5040" w:hanging="360"/>
+      </w:pPr>
+    </w:lvl>
+    <w:lvl w:ilvl="7" w:tplc="FFFFFFFF" w:tentative="1">
+      <w:start w:val="1"/>
+      <w:numFmt w:val="lowerLetter"/>
+      <w:lvlText w:val="%8."/>
+      <w:lvlJc w:val="left"/>
+      <w:pPr>
+        <w:ind w:left="5760" w:hanging="360"/>
+      </w:pPr>
+    </w:lvl>
+    <w:lvl w:ilvl="8" w:tplc="FFFFFFFF" w:tentative="1">
+      <w:start w:val="1"/>
+      <w:numFmt w:val="lowerRoman"/>
+      <w:lvlText w:val="%9."/>
+      <w:lvlJc w:val="right"/>
+      <w:pPr>
+        <w:ind w:left="6480" w:hanging="180"/>
+      </w:pPr>
+    </w:lvl>
+  </w:abstractNum>
+  <w:abstractNum w:abstractNumId="2" w15:restartNumberingAfterBreak="0">
+    <w:nsid w:val="283C4B13"/>
+    <w:multiLevelType w:val="hybridMultilevel"/>
+    <w:tmpl w:val="42341D0A"/>
+    <w:lvl w:ilvl="0" w:tplc="FFFFFFFF">
+      <w:start w:val="1"/>
+      <w:numFmt w:val="decimal"/>
+      <w:lvlText w:val="%1)"/>
+      <w:lvlJc w:val="left"/>
+      <w:pPr>
+        <w:ind w:left="720" w:hanging="360"/>
+      </w:pPr>
+      <w:rPr>
+        <w:rFonts w:hint="default"/>
+      </w:rPr>
+    </w:lvl>
+    <w:lvl w:ilvl="1" w:tplc="FFFFFFFF" w:tentative="1">
+      <w:start w:val="1"/>
+      <w:numFmt w:val="lowerLetter"/>
+      <w:lvlText w:val="%2."/>
+      <w:lvlJc w:val="left"/>
+      <w:pPr>
+        <w:ind w:left="1440" w:hanging="360"/>
+      </w:pPr>
+    </w:lvl>
+    <w:lvl w:ilvl="2" w:tplc="FFFFFFFF" w:tentative="1">
+      <w:start w:val="1"/>
+      <w:numFmt w:val="lowerRoman"/>
+      <w:lvlText w:val="%3."/>
+      <w:lvlJc w:val="right"/>
+      <w:pPr>
+        <w:ind w:left="2160" w:hanging="180"/>
+      </w:pPr>
+    </w:lvl>
+    <w:lvl w:ilvl="3" w:tplc="FFFFFFFF" w:tentative="1">
+      <w:start w:val="1"/>
+      <w:numFmt w:val="decimal"/>
+      <w:lvlText w:val="%4."/>
+      <w:lvlJc w:val="left"/>
+      <w:pPr>
+        <w:ind w:left="2880" w:hanging="360"/>
+      </w:pPr>
+    </w:lvl>
+    <w:lvl w:ilvl="4" w:tplc="FFFFFFFF" w:tentative="1">
+      <w:start w:val="1"/>
+      <w:numFmt w:val="lowerLetter"/>
+      <w:lvlText w:val="%5."/>
+      <w:lvlJc w:val="left"/>
+      <w:pPr>
+        <w:ind w:left="3600" w:hanging="360"/>
+      </w:pPr>
+    </w:lvl>
+    <w:lvl w:ilvl="5" w:tplc="FFFFFFFF" w:tentative="1">
+      <w:start w:val="1"/>
+      <w:numFmt w:val="lowerRoman"/>
+      <w:lvlText w:val="%6."/>
+      <w:lvlJc w:val="right"/>
+      <w:pPr>
+        <w:ind w:left="4320" w:hanging="180"/>
+      </w:pPr>
+    </w:lvl>
+    <w:lvl w:ilvl="6" w:tplc="FFFFFFFF" w:tentative="1">
+      <w:start w:val="1"/>
+      <w:numFmt w:val="decimal"/>
+      <w:lvlText w:val="%7."/>
+      <w:lvlJc w:val="left"/>
+      <w:pPr>
+        <w:ind w:left="5040" w:hanging="360"/>
+      </w:pPr>
+    </w:lvl>
+    <w:lvl w:ilvl="7" w:tplc="FFFFFFFF" w:tentative="1">
+      <w:start w:val="1"/>
+      <w:numFmt w:val="lowerLetter"/>
+      <w:lvlText w:val="%8."/>
+      <w:lvlJc w:val="left"/>
+      <w:pPr>
+        <w:ind w:left="5760" w:hanging="360"/>
+      </w:pPr>
+    </w:lvl>
+    <w:lvl w:ilvl="8" w:tplc="FFFFFFFF" w:tentative="1">
+      <w:start w:val="1"/>
+      <w:numFmt w:val="lowerRoman"/>
+      <w:lvlText w:val="%9."/>
+      <w:lvlJc w:val="right"/>
+      <w:pPr>
+        <w:ind w:left="6480" w:hanging="180"/>
+      </w:pPr>
+    </w:lvl>
+  </w:abstractNum>
+  <w:abstractNum w:abstractNumId="3" w15:restartNumberingAfterBreak="0">
+    <w:nsid w:val="2B134009"/>
+    <w:multiLevelType w:val="hybridMultilevel"/>
+    <w:tmpl w:val="449C685C"/>
+    <w:lvl w:ilvl="0" w:tplc="08090011">
+      <w:start w:val="1"/>
+      <w:numFmt w:val="decimal"/>
+      <w:lvlText w:val="%1)"/>
+      <w:lvlJc w:val="left"/>
+      <w:pPr>
+        <w:ind w:left="720" w:hanging="360"/>
+      </w:pPr>
+      <w:rPr>
+        <w:rFonts w:hint="default"/>
+      </w:rPr>
+    </w:lvl>
+    <w:lvl w:ilvl="1" w:tplc="08090019" w:tentative="1">
+      <w:start w:val="1"/>
+      <w:numFmt w:val="lowerLetter"/>
+      <w:lvlText w:val="%2."/>
+      <w:lvlJc w:val="left"/>
+      <w:pPr>
+        <w:ind w:left="1440" w:hanging="360"/>
+      </w:pPr>
+    </w:lvl>
+    <w:lvl w:ilvl="2" w:tplc="0809001B" w:tentative="1">
+      <w:start w:val="1"/>
+      <w:numFmt w:val="lowerRoman"/>
+      <w:lvlText w:val="%3."/>
+      <w:lvlJc w:val="right"/>
+      <w:pPr>
+        <w:ind w:left="2160" w:hanging="180"/>
+      </w:pPr>
+    </w:lvl>
+    <w:lvl w:ilvl="3" w:tplc="0809000F" w:tentative="1">
+      <w:start w:val="1"/>
+      <w:numFmt w:val="decimal"/>
+      <w:lvlText w:val="%4."/>
+      <w:lvlJc w:val="left"/>
+      <w:pPr>
+        <w:ind w:left="2880" w:hanging="360"/>
+      </w:pPr>
+    </w:lvl>
+    <w:lvl w:ilvl="4" w:tplc="08090019" w:tentative="1">
+      <w:start w:val="1"/>
+      <w:numFmt w:val="lowerLetter"/>
+      <w:lvlText w:val="%5."/>
+      <w:lvlJc w:val="left"/>
+      <w:pPr>
+        <w:ind w:left="3600" w:hanging="360"/>
+      </w:pPr>
+    </w:lvl>
+    <w:lvl w:ilvl="5" w:tplc="0809001B" w:tentative="1">
+      <w:start w:val="1"/>
+      <w:numFmt w:val="lowerRoman"/>
+      <w:lvlText w:val="%6."/>
+      <w:lvlJc w:val="right"/>
+      <w:pPr>
+        <w:ind w:left="4320" w:hanging="180"/>
+      </w:pPr>
+    </w:lvl>
+    <w:lvl w:ilvl="6" w:tplc="0809000F" w:tentative="1">
+      <w:start w:val="1"/>
+      <w:numFmt w:val="decimal"/>
+      <w:lvlText w:val="%7."/>
+      <w:lvlJc w:val="left"/>
+      <w:pPr>
+        <w:ind w:left="5040" w:hanging="360"/>
+      </w:pPr>
+    </w:lvl>
+    <w:lvl w:ilvl="7" w:tplc="08090019" w:tentative="1">
+      <w:start w:val="1"/>
+      <w:numFmt w:val="lowerLetter"/>
+      <w:lvlText w:val="%8."/>
+      <w:lvlJc w:val="left"/>
+      <w:pPr>
+        <w:ind w:left="5760" w:hanging="360"/>
+      </w:pPr>
+    </w:lvl>
+    <w:lvl w:ilvl="8" w:tplc="0809001B" w:tentative="1">
+      <w:start w:val="1"/>
+      <w:numFmt w:val="lowerRoman"/>
+      <w:lvlText w:val="%9."/>
+      <w:lvlJc w:val="right"/>
+      <w:pPr>
+        <w:ind w:left="6480" w:hanging="180"/>
+      </w:pPr>
+    </w:lvl>
+  </w:abstractNum>
+  <w:abstractNum w:abstractNumId="4" w15:restartNumberingAfterBreak="0">
+    <w:nsid w:val="36535AB5"/>
+    <w:multiLevelType w:val="hybridMultilevel"/>
+    <w:tmpl w:val="A7108D42"/>
+    <w:lvl w:ilvl="0" w:tplc="963E4A94">
+      <w:start w:val="1"/>
+      <w:numFmt w:val="decimal"/>
+      <w:lvlText w:val="%1)"/>
+      <w:lvlJc w:val="left"/>
+      <w:pPr>
+        <w:ind w:left="720" w:hanging="360"/>
+      </w:pPr>
+      <w:rPr>
+        <w:rFonts w:hint="default"/>
+        <w:b w:val="0"/>
+        <w:bCs w:val="0"/>
+        <w:sz w:val="24"/>
+        <w:szCs w:val="24"/>
+      </w:rPr>
+    </w:lvl>
+    <w:lvl w:ilvl="1" w:tplc="FFFFFFFF" w:tentative="1">
+      <w:start w:val="1"/>
+      <w:numFmt w:val="lowerLetter"/>
+      <w:lvlText w:val="%2."/>
+      <w:lvlJc w:val="left"/>
+      <w:pPr>
+        <w:ind w:left="1440" w:hanging="360"/>
+      </w:pPr>
+    </w:lvl>
+    <w:lvl w:ilvl="2" w:tplc="FFFFFFFF" w:tentative="1">
+      <w:start w:val="1"/>
+      <w:numFmt w:val="lowerRoman"/>
+      <w:lvlText w:val="%3."/>
+      <w:lvlJc w:val="right"/>
+      <w:pPr>
+        <w:ind w:left="2160" w:hanging="180"/>
+      </w:pPr>
+    </w:lvl>
+    <w:lvl w:ilvl="3" w:tplc="FFFFFFFF" w:tentative="1">
+      <w:start w:val="1"/>
+      <w:numFmt w:val="decimal"/>
+      <w:lvlText w:val="%4."/>
+      <w:lvlJc w:val="left"/>
+      <w:pPr>
+        <w:ind w:left="2880" w:hanging="360"/>
+      </w:pPr>
+    </w:lvl>
+    <w:lvl w:ilvl="4" w:tplc="FFFFFFFF" w:tentative="1">
+      <w:start w:val="1"/>
+      <w:numFmt w:val="lowerLetter"/>
+      <w:lvlText w:val="%5."/>
+      <w:lvlJc w:val="left"/>
+      <w:pPr>
+        <w:ind w:left="3600" w:hanging="360"/>
+      </w:pPr>
+    </w:lvl>
+    <w:lvl w:ilvl="5" w:tplc="FFFFFFFF" w:tentative="1">
+      <w:start w:val="1"/>
+      <w:numFmt w:val="lowerRoman"/>
+      <w:lvlText w:val="%6."/>
+      <w:lvlJc w:val="right"/>
+      <w:pPr>
+        <w:ind w:left="4320" w:hanging="180"/>
+      </w:pPr>
+    </w:lvl>
+    <w:lvl w:ilvl="6" w:tplc="FFFFFFFF" w:tentative="1">
+      <w:start w:val="1"/>
+      <w:numFmt w:val="decimal"/>
+      <w:lvlText w:val="%7."/>
+      <w:lvlJc w:val="left"/>
+      <w:pPr>
+        <w:ind w:left="5040" w:hanging="360"/>
+      </w:pPr>
+    </w:lvl>
+    <w:lvl w:ilvl="7" w:tplc="FFFFFFFF" w:tentative="1">
+      <w:start w:val="1"/>
+      <w:numFmt w:val="lowerLetter"/>
+      <w:lvlText w:val="%8."/>
+      <w:lvlJc w:val="left"/>
+      <w:pPr>
+        <w:ind w:left="5760" w:hanging="360"/>
+      </w:pPr>
+    </w:lvl>
+    <w:lvl w:ilvl="8" w:tplc="FFFFFFFF" w:tentative="1">
+      <w:start w:val="1"/>
+      <w:numFmt w:val="lowerRoman"/>
+      <w:lvlText w:val="%9."/>
+      <w:lvlJc w:val="right"/>
+      <w:pPr>
+        <w:ind w:left="6480" w:hanging="180"/>
+      </w:pPr>
+    </w:lvl>
+  </w:abstractNum>
+  <w:abstractNum w:abstractNumId="5" w15:restartNumberingAfterBreak="0">
+    <w:nsid w:val="439620E4"/>
+    <w:multiLevelType w:val="hybridMultilevel"/>
+    <w:tmpl w:val="42341D0A"/>
+    <w:lvl w:ilvl="0" w:tplc="FFFFFFFF">
+      <w:start w:val="1"/>
+      <w:numFmt w:val="decimal"/>
+      <w:lvlText w:val="%1)"/>
+      <w:lvlJc w:val="left"/>
+      <w:pPr>
+        <w:ind w:left="720" w:hanging="360"/>
+      </w:pPr>
+      <w:rPr>
+        <w:rFonts w:hint="default"/>
+      </w:rPr>
+    </w:lvl>
+    <w:lvl w:ilvl="1" w:tplc="FFFFFFFF" w:tentative="1">
+      <w:start w:val="1"/>
+      <w:numFmt w:val="lowerLetter"/>
+      <w:lvlText w:val="%2."/>
+      <w:lvlJc w:val="left"/>
+      <w:pPr>
+        <w:ind w:left="1440" w:hanging="360"/>
+      </w:pPr>
+    </w:lvl>
+    <w:lvl w:ilvl="2" w:tplc="FFFFFFFF" w:tentative="1">
+      <w:start w:val="1"/>
+      <w:numFmt w:val="lowerRoman"/>
+      <w:lvlText w:val="%3."/>
+      <w:lvlJc w:val="right"/>
+      <w:pPr>
+        <w:ind w:left="2160" w:hanging="180"/>
+      </w:pPr>
+    </w:lvl>
+    <w:lvl w:ilvl="3" w:tplc="FFFFFFFF" w:tentative="1">
+      <w:start w:val="1"/>
+      <w:numFmt w:val="decimal"/>
+      <w:lvlText w:val="%4."/>
+      <w:lvlJc w:val="left"/>
+      <w:pPr>
+        <w:ind w:left="2880" w:hanging="360"/>
+      </w:pPr>
+    </w:lvl>
+    <w:lvl w:ilvl="4" w:tplc="FFFFFFFF" w:tentative="1">
+      <w:start w:val="1"/>
+      <w:numFmt w:val="lowerLetter"/>
+      <w:lvlText w:val="%5."/>
+      <w:lvlJc w:val="left"/>
+      <w:pPr>
+        <w:ind w:left="3600" w:hanging="360"/>
+      </w:pPr>
+    </w:lvl>
+    <w:lvl w:ilvl="5" w:tplc="FFFFFFFF" w:tentative="1">
+      <w:start w:val="1"/>
+      <w:numFmt w:val="lowerRoman"/>
+      <w:lvlText w:val="%6."/>
+      <w:lvlJc w:val="right"/>
+      <w:pPr>
+        <w:ind w:left="4320" w:hanging="180"/>
+      </w:pPr>
+    </w:lvl>
+    <w:lvl w:ilvl="6" w:tplc="FFFFFFFF" w:tentative="1">
+      <w:start w:val="1"/>
+      <w:numFmt w:val="decimal"/>
+      <w:lvlText w:val="%7."/>
+      <w:lvlJc w:val="left"/>
+      <w:pPr>
+        <w:ind w:left="5040" w:hanging="360"/>
+      </w:pPr>
+    </w:lvl>
+    <w:lvl w:ilvl="7" w:tplc="FFFFFFFF" w:tentative="1">
+      <w:start w:val="1"/>
+      <w:numFmt w:val="lowerLetter"/>
+      <w:lvlText w:val="%8."/>
+      <w:lvlJc w:val="left"/>
+      <w:pPr>
+        <w:ind w:left="5760" w:hanging="360"/>
+      </w:pPr>
+    </w:lvl>
+    <w:lvl w:ilvl="8" w:tplc="FFFFFFFF" w:tentative="1">
+      <w:start w:val="1"/>
+      <w:numFmt w:val="lowerRoman"/>
+      <w:lvlText w:val="%9."/>
+      <w:lvlJc w:val="right"/>
+      <w:pPr>
+        <w:ind w:left="6480" w:hanging="180"/>
+      </w:pPr>
+    </w:lvl>
+  </w:abstractNum>
+  <w:abstractNum w:abstractNumId="6" w15:restartNumberingAfterBreak="0">
+    <w:nsid w:val="51765F55"/>
+    <w:multiLevelType w:val="hybridMultilevel"/>
+    <w:tmpl w:val="42341D0A"/>
+    <w:lvl w:ilvl="0" w:tplc="FFFFFFFF">
+      <w:start w:val="1"/>
+      <w:numFmt w:val="decimal"/>
+      <w:lvlText w:val="%1)"/>
+      <w:lvlJc w:val="left"/>
+      <w:pPr>
+        <w:ind w:left="720" w:hanging="360"/>
+      </w:pPr>
+      <w:rPr>
+        <w:rFonts w:hint="default"/>
+      </w:rPr>
+    </w:lvl>
+    <w:lvl w:ilvl="1" w:tplc="FFFFFFFF" w:tentative="1">
+      <w:start w:val="1"/>
+      <w:numFmt w:val="lowerLetter"/>
+      <w:lvlText w:val="%2."/>
+      <w:lvlJc w:val="left"/>
+      <w:pPr>
+        <w:ind w:left="1440" w:hanging="360"/>
+      </w:pPr>
+    </w:lvl>
+    <w:lvl w:ilvl="2" w:tplc="FFFFFFFF" w:tentative="1">
+      <w:start w:val="1"/>
+      <w:numFmt w:val="lowerRoman"/>
+      <w:lvlText w:val="%3."/>
+      <w:lvlJc w:val="right"/>
+      <w:pPr>
+        <w:ind w:left="2160" w:hanging="180"/>
+      </w:pPr>
+    </w:lvl>
+    <w:lvl w:ilvl="3" w:tplc="FFFFFFFF" w:tentative="1">
+      <w:start w:val="1"/>
+      <w:numFmt w:val="decimal"/>
+      <w:lvlText w:val="%4."/>
+      <w:lvlJc w:val="left"/>
+      <w:pPr>
+        <w:ind w:left="2880" w:hanging="360"/>
+      </w:pPr>
+    </w:lvl>
+    <w:lvl w:ilvl="4" w:tplc="FFFFFFFF" w:tentative="1">
+      <w:start w:val="1"/>
+      <w:numFmt w:val="lowerLetter"/>
+      <w:lvlText w:val="%5."/>
+      <w:lvlJc w:val="left"/>
+      <w:pPr>
+        <w:ind w:left="3600" w:hanging="360"/>
+      </w:pPr>
+    </w:lvl>
+    <w:lvl w:ilvl="5" w:tplc="FFFFFFFF" w:tentative="1">
+      <w:start w:val="1"/>
+      <w:numFmt w:val="lowerRoman"/>
+      <w:lvlText w:val="%6."/>
+      <w:lvlJc w:val="right"/>
+      <w:pPr>
+        <w:ind w:left="4320" w:hanging="180"/>
+      </w:pPr>
+    </w:lvl>
+    <w:lvl w:ilvl="6" w:tplc="FFFFFFFF" w:tentative="1">
+      <w:start w:val="1"/>
+      <w:numFmt w:val="decimal"/>
+      <w:lvlText w:val="%7."/>
+      <w:lvlJc w:val="left"/>
+      <w:pPr>
+        <w:ind w:left="5040" w:hanging="360"/>
+      </w:pPr>
+    </w:lvl>
+    <w:lvl w:ilvl="7" w:tplc="FFFFFFFF" w:tentative="1">
+      <w:start w:val="1"/>
+      <w:numFmt w:val="lowerLetter"/>
+      <w:lvlText w:val="%8."/>
+      <w:lvlJc w:val="left"/>
+      <w:pPr>
+        <w:ind w:left="5760" w:hanging="360"/>
+      </w:pPr>
+    </w:lvl>
+    <w:lvl w:ilvl="8" w:tplc="FFFFFFFF" w:tentative="1">
+      <w:start w:val="1"/>
+      <w:numFmt w:val="lowerRoman"/>
+      <w:lvlText w:val="%9."/>
+      <w:lvlJc w:val="right"/>
+      <w:pPr>
+        <w:ind w:left="6480" w:hanging="180"/>
+      </w:pPr>
+    </w:lvl>
+  </w:abstractNum>
+  <w:abstractNum w:abstractNumId="7" w15:restartNumberingAfterBreak="0">
+    <w:nsid w:val="696B7F60"/>
+    <w:multiLevelType w:val="hybridMultilevel"/>
+    <w:tmpl w:val="AD6A2826"/>
+    <w:lvl w:ilvl="0" w:tplc="08090011">
+      <w:start w:val="1"/>
+      <w:numFmt w:val="decimal"/>
+      <w:lvlText w:val="%1)"/>
+      <w:lvlJc w:val="left"/>
+      <w:pPr>
+        <w:ind w:left="720" w:hanging="360"/>
+      </w:pPr>
+      <w:rPr>
+        <w:rFonts w:hint="default"/>
+      </w:rPr>
+    </w:lvl>
+    <w:lvl w:ilvl="1" w:tplc="08090019" w:tentative="1">
+      <w:start w:val="1"/>
+      <w:numFmt w:val="lowerLetter"/>
+      <w:lvlText w:val="%2."/>
+      <w:lvlJc w:val="left"/>
+      <w:pPr>
+        <w:ind w:left="1440" w:hanging="360"/>
+      </w:pPr>
+    </w:lvl>
+    <w:lvl w:ilvl="2" w:tplc="0809001B" w:tentative="1">
+      <w:start w:val="1"/>
+      <w:numFmt w:val="lowerRoman"/>
+      <w:lvlText w:val="%3."/>
+      <w:lvlJc w:val="right"/>
+      <w:pPr>
+        <w:ind w:left="2160" w:hanging="180"/>
+      </w:pPr>
+    </w:lvl>
+    <w:lvl w:ilvl="3" w:tplc="0809000F" w:tentative="1">
+      <w:start w:val="1"/>
+      <w:numFmt w:val="decimal"/>
+      <w:lvlText w:val="%4."/>
+      <w:lvlJc w:val="left"/>
+      <w:pPr>
+        <w:ind w:left="2880" w:hanging="360"/>
+      </w:pPr>
+    </w:lvl>
+    <w:lvl w:ilvl="4" w:tplc="08090019" w:tentative="1">
+      <w:start w:val="1"/>
+      <w:numFmt w:val="lowerLetter"/>
+      <w:lvlText w:val="%5."/>
+      <w:lvlJc w:val="left"/>
+      <w:pPr>
+        <w:ind w:left="3600" w:hanging="360"/>
+      </w:pPr>
+    </w:lvl>
+    <w:lvl w:ilvl="5" w:tplc="0809001B" w:tentative="1">
+      <w:start w:val="1"/>
+      <w:numFmt w:val="lowerRoman"/>
+      <w:lvlText w:val="%6."/>
+      <w:lvlJc w:val="right"/>
+      <w:pPr>
+        <w:ind w:left="4320" w:hanging="180"/>
+      </w:pPr>
+    </w:lvl>
+    <w:lvl w:ilvl="6" w:tplc="0809000F" w:tentative="1">
+      <w:start w:val="1"/>
+      <w:numFmt w:val="decimal"/>
+      <w:lvlText w:val="%7."/>
+      <w:lvlJc w:val="left"/>
+      <w:pPr>
+        <w:ind w:left="5040" w:hanging="360"/>
+      </w:pPr>
+    </w:lvl>
+    <w:lvl w:ilvl="7" w:tplc="08090019" w:tentative="1">
+      <w:start w:val="1"/>
+      <w:numFmt w:val="lowerLetter"/>
+      <w:lvlText w:val="%8."/>
+      <w:lvlJc w:val="left"/>
+      <w:pPr>
+        <w:ind w:left="5760" w:hanging="360"/>
+      </w:pPr>
+    </w:lvl>
+    <w:lvl w:ilvl="8" w:tplc="0809001B" w:tentative="1">
+      <w:start w:val="1"/>
+      <w:numFmt w:val="lowerRoman"/>
+      <w:lvlText w:val="%9."/>
+      <w:lvlJc w:val="right"/>
+      <w:pPr>
+        <w:ind w:left="6480" w:hanging="180"/>
+      </w:pPr>
+    </w:lvl>
+  </w:abstractNum>
+  <w:abstractNum w:abstractNumId="8" w15:restartNumberingAfterBreak="0">
+    <w:nsid w:val="7C866A32"/>
+    <w:multiLevelType w:val="hybridMultilevel"/>
+    <w:tmpl w:val="42341D0A"/>
+    <w:lvl w:ilvl="0" w:tplc="FFFFFFFF">
+      <w:start w:val="1"/>
+      <w:numFmt w:val="decimal"/>
+      <w:lvlText w:val="%1)"/>
+      <w:lvlJc w:val="left"/>
+      <w:pPr>
+        <w:ind w:left="720" w:hanging="360"/>
+      </w:pPr>
+      <w:rPr>
+        <w:rFonts w:hint="default"/>
+      </w:rPr>
+    </w:lvl>
+    <w:lvl w:ilvl="1" w:tplc="FFFFFFFF" w:tentative="1">
+      <w:start w:val="1"/>
+      <w:numFmt w:val="lowerLetter"/>
+      <w:lvlText w:val="%2."/>
+      <w:lvlJc w:val="left"/>
+      <w:pPr>
+        <w:ind w:left="1440" w:hanging="360"/>
+      </w:pPr>
+    </w:lvl>
+    <w:lvl w:ilvl="2" w:tplc="FFFFFFFF" w:tentative="1">
+      <w:start w:val="1"/>
+      <w:numFmt w:val="lowerRoman"/>
+      <w:lvlText w:val="%3."/>
+      <w:lvlJc w:val="right"/>
+      <w:pPr>
+        <w:ind w:left="2160" w:hanging="180"/>
+      </w:pPr>
+    </w:lvl>
+    <w:lvl w:ilvl="3" w:tplc="FFFFFFFF" w:tentative="1">
+      <w:start w:val="1"/>
+      <w:numFmt w:val="decimal"/>
+      <w:lvlText w:val="%4."/>
+      <w:lvlJc w:val="left"/>
+      <w:pPr>
+        <w:ind w:left="2880" w:hanging="360"/>
+      </w:pPr>
+    </w:lvl>
+    <w:lvl w:ilvl="4" w:tplc="FFFFFFFF" w:tentative="1">
+      <w:start w:val="1"/>
+      <w:numFmt w:val="lowerLetter"/>
+      <w:lvlText w:val="%5."/>
+      <w:lvlJc w:val="left"/>
+      <w:pPr>
+        <w:ind w:left="3600" w:hanging="360"/>
+      </w:pPr>
+    </w:lvl>
+    <w:lvl w:ilvl="5" w:tplc="FFFFFFFF" w:tentative="1">
+      <w:start w:val="1"/>
+      <w:numFmt w:val="lowerRoman"/>
+      <w:lvlText w:val="%6."/>
+      <w:lvlJc w:val="right"/>
+      <w:pPr>
+        <w:ind w:left="4320" w:hanging="180"/>
+      </w:pPr>
+    </w:lvl>
+    <w:lvl w:ilvl="6" w:tplc="FFFFFFFF" w:tentative="1">
+      <w:start w:val="1"/>
+      <w:numFmt w:val="decimal"/>
+      <w:lvlText w:val="%7."/>
+      <w:lvlJc w:val="left"/>
+      <w:pPr>
+        <w:ind w:left="5040" w:hanging="360"/>
+      </w:pPr>
+    </w:lvl>
+    <w:lvl w:ilvl="7" w:tplc="FFFFFFFF" w:tentative="1">
+      <w:start w:val="1"/>
+      <w:numFmt w:val="lowerLetter"/>
+      <w:lvlText w:val="%8."/>
+      <w:lvlJc w:val="left"/>
+      <w:pPr>
+        <w:ind w:left="5760" w:hanging="360"/>
+      </w:pPr>
+    </w:lvl>
+    <w:lvl w:ilvl="8" w:tplc="FFFFFFFF" w:tentative="1">
+      <w:start w:val="1"/>
+      <w:numFmt w:val="lowerRoman"/>
+      <w:lvlText w:val="%9."/>
+      <w:lvlJc w:val="right"/>
+      <w:pPr>
+        <w:ind w:left="6480" w:hanging="180"/>
+      </w:pPr>
+    </w:lvl>
+  </w:abstractNum>
+  <w:num w:numId="1" w16cid:durableId="1730036337">
+    <w:abstractNumId w:val="3"/>
+  </w:num>
+  <w:num w:numId="2" w16cid:durableId="741178958">
+    <w:abstractNumId w:val="7"/>
+  </w:num>
+  <w:num w:numId="3" w16cid:durableId="494226674">
+    <w:abstractNumId w:val="0"/>
+  </w:num>
+  <w:num w:numId="4" w16cid:durableId="380324371">
+    <w:abstractNumId w:val="4"/>
+  </w:num>
+  <w:num w:numId="5" w16cid:durableId="2096584282">
+    <w:abstractNumId w:val="5"/>
+  </w:num>
+  <w:num w:numId="6" w16cid:durableId="1858687752">
+    <w:abstractNumId w:val="2"/>
+  </w:num>
+  <w:num w:numId="7" w16cid:durableId="1255746879">
+    <w:abstractNumId w:val="8"/>
+  </w:num>
+  <w:num w:numId="8" w16cid:durableId="1753576511">
+    <w:abstractNumId w:val="1"/>
+  </w:num>
+  <w:num w:numId="9" w16cid:durableId="105277600">
+    <w:abstractNumId w:val="6"/>
+  </w:num>
+</w:numbering>
 </file>
 
 <file path=word/styles.xml><?xml version="1.0" encoding="utf-8"?>

</xml_diff>

<commit_message>
Added Batch Processing user story
</commit_message>
<xml_diff>
--- a/Project Plan/UserStories.docx
+++ b/Project Plan/UserStories.docx
@@ -1277,8 +1277,6 @@
       <w:pPr>
         <w:rPr>
           <w:rFonts w:ascii="Times New Roman" w:hAnsi="Times New Roman" w:cs="Times New Roman"/>
-          <w:b/>
-          <w:bCs/>
           <w:sz w:val="28"/>
           <w:szCs w:val="28"/>
           <w:lang w:val="en-US"/>
@@ -1306,25 +1304,38 @@
         </w:rPr>
         <w:t>:</w:t>
       </w:r>
-    </w:p>
-    <w:p>
-      <w:pPr>
-        <w:rPr>
-          <w:rFonts w:ascii="Times New Roman" w:hAnsi="Times New Roman" w:cs="Times New Roman"/>
-          <w:b/>
-          <w:bCs/>
-          <w:sz w:val="28"/>
-          <w:szCs w:val="28"/>
-          <w:lang w:val="en-US"/>
-        </w:rPr>
-      </w:pPr>
-    </w:p>
-    <w:p>
-      <w:pPr>
-        <w:rPr>
-          <w:rFonts w:ascii="Times New Roman" w:hAnsi="Times New Roman" w:cs="Times New Roman"/>
-          <w:b/>
-          <w:bCs/>
+      <w:r>
+        <w:rPr>
+          <w:rFonts w:ascii="Times New Roman" w:hAnsi="Times New Roman" w:cs="Times New Roman"/>
+          <w:b/>
+          <w:bCs/>
+          <w:sz w:val="28"/>
+          <w:szCs w:val="28"/>
+          <w:lang w:val="en-US"/>
+        </w:rPr>
+        <w:t xml:space="preserve"> </w:t>
+      </w:r>
+      <w:r>
+        <w:rPr>
+          <w:rFonts w:ascii="Times New Roman" w:hAnsi="Times New Roman" w:cs="Times New Roman"/>
+          <w:lang w:val="en-US"/>
+        </w:rPr>
+        <w:t>Batch Processing</w:t>
+      </w:r>
+      <w:r>
+        <w:rPr>
+          <w:rFonts w:ascii="Times New Roman" w:hAnsi="Times New Roman" w:cs="Times New Roman"/>
+          <w:sz w:val="28"/>
+          <w:szCs w:val="28"/>
+          <w:lang w:val="en-US"/>
+        </w:rPr>
+        <w:t xml:space="preserve"> </w:t>
+      </w:r>
+    </w:p>
+    <w:p>
+      <w:pPr>
+        <w:rPr>
+          <w:rFonts w:ascii="Times New Roman" w:hAnsi="Times New Roman" w:cs="Times New Roman"/>
           <w:sz w:val="28"/>
           <w:szCs w:val="28"/>
           <w:lang w:val="en-US"/>
@@ -1352,18 +1363,33 @@
         </w:rPr>
         <w:t>:</w:t>
       </w:r>
-    </w:p>
-    <w:p>
-      <w:pPr>
-        <w:rPr>
-          <w:rFonts w:ascii="Times New Roman" w:hAnsi="Times New Roman" w:cs="Times New Roman"/>
-          <w:b/>
-          <w:bCs/>
-          <w:sz w:val="28"/>
-          <w:szCs w:val="28"/>
-          <w:lang w:val="en-US"/>
-        </w:rPr>
-      </w:pPr>
+      <w:r>
+        <w:rPr>
+          <w:rFonts w:ascii="Times New Roman" w:hAnsi="Times New Roman" w:cs="Times New Roman"/>
+          <w:b/>
+          <w:bCs/>
+          <w:sz w:val="28"/>
+          <w:szCs w:val="28"/>
+          <w:lang w:val="en-US"/>
+        </w:rPr>
+        <w:t xml:space="preserve"> </w:t>
+      </w:r>
+      <w:r>
+        <w:rPr>
+          <w:rFonts w:ascii="Times New Roman" w:hAnsi="Times New Roman" w:cs="Times New Roman"/>
+          <w:lang w:val="en-US"/>
+        </w:rPr>
+        <w:t>As an archaeologist with not much of a programming background, I would like to be able to save my changes as a template and apply them to the rest of my GPR data so that I can save time formatting the data and have the data ready for reports</w:t>
+      </w:r>
+      <w:r>
+        <w:rPr>
+          <w:rFonts w:ascii="Times New Roman" w:hAnsi="Times New Roman" w:cs="Times New Roman"/>
+          <w:sz w:val="28"/>
+          <w:szCs w:val="28"/>
+          <w:lang w:val="en-US"/>
+        </w:rPr>
+        <w:t xml:space="preserve"> </w:t>
+      </w:r>
     </w:p>
     <w:p>
       <w:pPr>
@@ -1410,8 +1436,6 @@
           <w:rFonts w:ascii="Times New Roman" w:hAnsi="Times New Roman" w:cs="Times New Roman"/>
           <w:b/>
           <w:bCs/>
-          <w:sz w:val="28"/>
-          <w:szCs w:val="28"/>
           <w:lang w:val="en-US"/>
         </w:rPr>
       </w:pPr>
@@ -1425,6 +1449,27 @@
           <w:lang w:val="en-US"/>
         </w:rPr>
         <w:t xml:space="preserve"> </w:t>
+      </w:r>
+      <w:r>
+        <w:rPr>
+          <w:rFonts w:ascii="Times New Roman" w:hAnsi="Times New Roman" w:cs="Times New Roman"/>
+          <w:lang w:val="en-US"/>
+        </w:rPr>
+        <w:t>Create text</w:t>
+      </w:r>
+      <w:r>
+        <w:rPr>
+          <w:rFonts w:ascii="Times New Roman" w:hAnsi="Times New Roman" w:cs="Times New Roman"/>
+          <w:lang w:val="en-US"/>
+        </w:rPr>
+        <w:t xml:space="preserve"> </w:t>
+      </w:r>
+      <w:r>
+        <w:rPr>
+          <w:rFonts w:ascii="Times New Roman" w:hAnsi="Times New Roman" w:cs="Times New Roman"/>
+          <w:lang w:val="en-US"/>
+        </w:rPr>
+        <w:t>fields to store user settings</w:t>
       </w:r>
     </w:p>
     <w:p>
@@ -1438,22 +1483,98 @@
           <w:rFonts w:ascii="Times New Roman" w:hAnsi="Times New Roman" w:cs="Times New Roman"/>
           <w:b/>
           <w:bCs/>
-          <w:sz w:val="28"/>
-          <w:szCs w:val="28"/>
-          <w:lang w:val="en-US"/>
-        </w:rPr>
-      </w:pPr>
-      <w:r>
-        <w:rPr>
-          <w:rFonts w:ascii="Times New Roman" w:hAnsi="Times New Roman" w:cs="Times New Roman"/>
-          <w:b/>
-          <w:bCs/>
-          <w:sz w:val="28"/>
-          <w:szCs w:val="28"/>
+          <w:lang w:val="en-US"/>
+        </w:rPr>
+      </w:pPr>
+      <w:r>
+        <w:rPr>
+          <w:rFonts w:ascii="Times New Roman" w:hAnsi="Times New Roman" w:cs="Times New Roman"/>
+          <w:b/>
+          <w:bCs/>
           <w:lang w:val="en-US"/>
         </w:rPr>
         <w:t xml:space="preserve"> </w:t>
       </w:r>
+      <w:r>
+        <w:rPr>
+          <w:rFonts w:ascii="Times New Roman" w:hAnsi="Times New Roman" w:cs="Times New Roman"/>
+          <w:lang w:val="en-US"/>
+        </w:rPr>
+        <w:t>Import settings from a text file</w:t>
+      </w:r>
+    </w:p>
+    <w:p>
+      <w:pPr>
+        <w:pStyle w:val="ListParagraph"/>
+        <w:numPr>
+          <w:ilvl w:val="0"/>
+          <w:numId w:val="8"/>
+        </w:numPr>
+        <w:rPr>
+          <w:rFonts w:ascii="Times New Roman" w:hAnsi="Times New Roman" w:cs="Times New Roman"/>
+          <w:b/>
+          <w:bCs/>
+          <w:lang w:val="en-US"/>
+        </w:rPr>
+      </w:pPr>
+      <w:r>
+        <w:rPr>
+          <w:rFonts w:ascii="Times New Roman" w:hAnsi="Times New Roman" w:cs="Times New Roman"/>
+          <w:lang w:val="en-US"/>
+        </w:rPr>
+        <w:t>Given a directory, apply users changes to all files within the directory</w:t>
+      </w:r>
+    </w:p>
+    <w:p>
+      <w:pPr>
+        <w:pStyle w:val="ListParagraph"/>
+        <w:numPr>
+          <w:ilvl w:val="0"/>
+          <w:numId w:val="8"/>
+        </w:numPr>
+        <w:rPr>
+          <w:rFonts w:ascii="Times New Roman" w:hAnsi="Times New Roman" w:cs="Times New Roman"/>
+          <w:b/>
+          <w:bCs/>
+          <w:lang w:val="en-US"/>
+        </w:rPr>
+      </w:pPr>
+      <w:r>
+        <w:rPr>
+          <w:rFonts w:ascii="Times New Roman" w:hAnsi="Times New Roman" w:cs="Times New Roman"/>
+          <w:lang w:val="en-US"/>
+        </w:rPr>
+        <w:t xml:space="preserve">Preview changes to </w:t>
+      </w:r>
+      <w:r>
+        <w:rPr>
+          <w:rFonts w:ascii="Times New Roman" w:hAnsi="Times New Roman" w:cs="Times New Roman"/>
+          <w:lang w:val="en-US"/>
+        </w:rPr>
+        <w:t>singular file before committing changes to rest of the files</w:t>
+      </w:r>
+    </w:p>
+    <w:p>
+      <w:pPr>
+        <w:pStyle w:val="ListParagraph"/>
+        <w:numPr>
+          <w:ilvl w:val="0"/>
+          <w:numId w:val="8"/>
+        </w:numPr>
+        <w:rPr>
+          <w:rFonts w:ascii="Times New Roman" w:hAnsi="Times New Roman" w:cs="Times New Roman"/>
+          <w:b/>
+          <w:bCs/>
+          <w:lang w:val="en-US"/>
+        </w:rPr>
+      </w:pPr>
+      <w:r>
+        <w:rPr>
+          <w:rFonts w:ascii="Times New Roman" w:hAnsi="Times New Roman" w:cs="Times New Roman"/>
+          <w:lang w:val="en-US"/>
+        </w:rPr>
+        <w:t>Use threads to speed up workflow</w:t>
+      </w:r>
     </w:p>
     <w:p>
       <w:pPr>
@@ -1488,6 +1609,26 @@
         </w:rPr>
         <w:t>:</w:t>
       </w:r>
+      <w:r>
+        <w:rPr>
+          <w:rFonts w:ascii="Times New Roman" w:hAnsi="Times New Roman" w:cs="Times New Roman"/>
+          <w:b/>
+          <w:bCs/>
+          <w:sz w:val="28"/>
+          <w:szCs w:val="28"/>
+          <w:lang w:val="en-US"/>
+        </w:rPr>
+        <w:t xml:space="preserve"> </w:t>
+      </w:r>
+      <w:r>
+        <w:rPr>
+          <w:rFonts w:ascii="Times New Roman" w:hAnsi="Times New Roman" w:cs="Times New Roman"/>
+          <w:sz w:val="28"/>
+          <w:szCs w:val="28"/>
+          <w:lang w:val="en-US"/>
+        </w:rPr>
+        <w:t>10</w:t>
+      </w:r>
     </w:p>
     <w:p>
       <w:pPr>
@@ -1522,6 +1663,24 @@
         </w:rPr>
         <w:t>:</w:t>
       </w:r>
+      <w:r>
+        <w:rPr>
+          <w:rFonts w:ascii="Times New Roman" w:hAnsi="Times New Roman" w:cs="Times New Roman"/>
+          <w:b/>
+          <w:bCs/>
+          <w:sz w:val="28"/>
+          <w:szCs w:val="28"/>
+          <w:lang w:val="en-US"/>
+        </w:rPr>
+        <w:t xml:space="preserve"> </w:t>
+      </w:r>
+      <w:r>
+        <w:rPr>
+          <w:rFonts w:ascii="Times New Roman" w:hAnsi="Times New Roman" w:cs="Times New Roman"/>
+          <w:lang w:val="en-US"/>
+        </w:rPr>
+        <w:t>HIGH</w:t>
+      </w:r>
     </w:p>
     <w:p>
       <w:pPr>
@@ -1647,7 +1806,6 @@
           <w:szCs w:val="28"/>
           <w:lang w:val="en-US"/>
         </w:rPr>
-        <w:lastRenderedPageBreak/>
         <w:t>Criteria</w:t>
       </w:r>
       <w:r>
@@ -1914,8 +2072,8 @@
   <w:abstractNum w:abstractNumId="1" w15:restartNumberingAfterBreak="0">
     <w:nsid w:val="0DD55FE7"/>
     <w:multiLevelType w:val="hybridMultilevel"/>
-    <w:tmpl w:val="42341D0A"/>
-    <w:lvl w:ilvl="0" w:tplc="FFFFFFFF">
+    <w:tmpl w:val="DFA8CA9C"/>
+    <w:lvl w:ilvl="0" w:tplc="78FCF4D0">
       <w:start w:val="1"/>
       <w:numFmt w:val="decimal"/>
       <w:lvlText w:val="%1)"/>
@@ -1925,6 +2083,8 @@
       </w:pPr>
       <w:rPr>
         <w:rFonts w:hint="default"/>
+        <w:b w:val="0"/>
+        <w:bCs w:val="0"/>
       </w:rPr>
     </w:lvl>
     <w:lvl w:ilvl="1" w:tplc="FFFFFFFF" w:tentative="1">

</xml_diff>

<commit_message>
Added GUI user story
</commit_message>
<xml_diff>
--- a/Project Plan/UserStories.docx
+++ b/Project Plan/UserStories.docx
@@ -1627,7 +1627,16 @@
           <w:szCs w:val="28"/>
           <w:lang w:val="en-US"/>
         </w:rPr>
-        <w:t>10</w:t>
+        <w:t>1</w:t>
+      </w:r>
+      <w:r>
+        <w:rPr>
+          <w:rFonts w:ascii="Times New Roman" w:hAnsi="Times New Roman" w:cs="Times New Roman"/>
+          <w:sz w:val="28"/>
+          <w:szCs w:val="28"/>
+          <w:lang w:val="en-US"/>
+        </w:rPr>
+        <w:t>5</w:t>
       </w:r>
     </w:p>
     <w:p>
@@ -1705,15 +1714,52 @@
           <w:lang w:val="en-US"/>
         </w:rPr>
       </w:pPr>
-      <w:r>
-        <w:rPr>
-          <w:rFonts w:ascii="Times New Roman" w:hAnsi="Times New Roman" w:cs="Times New Roman"/>
-          <w:b/>
-          <w:bCs/>
-          <w:sz w:val="28"/>
-          <w:szCs w:val="28"/>
-          <w:lang w:val="en-US"/>
-        </w:rPr>
+    </w:p>
+    <w:p>
+      <w:pPr>
+        <w:rPr>
+          <w:rFonts w:ascii="Times New Roman" w:hAnsi="Times New Roman" w:cs="Times New Roman"/>
+          <w:b/>
+          <w:bCs/>
+          <w:sz w:val="28"/>
+          <w:szCs w:val="28"/>
+          <w:lang w:val="en-US"/>
+        </w:rPr>
+      </w:pPr>
+    </w:p>
+    <w:p>
+      <w:pPr>
+        <w:rPr>
+          <w:rFonts w:ascii="Times New Roman" w:hAnsi="Times New Roman" w:cs="Times New Roman"/>
+          <w:b/>
+          <w:bCs/>
+          <w:sz w:val="28"/>
+          <w:szCs w:val="28"/>
+          <w:lang w:val="en-US"/>
+        </w:rPr>
+      </w:pPr>
+    </w:p>
+    <w:p>
+      <w:pPr>
+        <w:rPr>
+          <w:rFonts w:ascii="Times New Roman" w:hAnsi="Times New Roman" w:cs="Times New Roman"/>
+          <w:b/>
+          <w:bCs/>
+          <w:sz w:val="28"/>
+          <w:szCs w:val="28"/>
+          <w:lang w:val="en-US"/>
+        </w:rPr>
+      </w:pPr>
+      <w:r>
+        <w:rPr>
+          <w:rFonts w:ascii="Times New Roman" w:hAnsi="Times New Roman" w:cs="Times New Roman"/>
+          <w:b/>
+          <w:bCs/>
+          <w:sz w:val="28"/>
+          <w:szCs w:val="28"/>
+          <w:lang w:val="en-US"/>
+        </w:rPr>
+        <w:lastRenderedPageBreak/>
         <w:t>Title</w:t>
       </w:r>
       <w:r>
@@ -1727,27 +1773,29 @@
         </w:rPr>
         <w:t>:</w:t>
       </w:r>
-    </w:p>
-    <w:p>
-      <w:pPr>
-        <w:rPr>
-          <w:rFonts w:ascii="Times New Roman" w:hAnsi="Times New Roman" w:cs="Times New Roman"/>
-          <w:b/>
-          <w:bCs/>
-          <w:sz w:val="28"/>
-          <w:szCs w:val="28"/>
-          <w:lang w:val="en-US"/>
-        </w:rPr>
-      </w:pPr>
-    </w:p>
-    <w:p>
-      <w:pPr>
-        <w:rPr>
-          <w:rFonts w:ascii="Times New Roman" w:hAnsi="Times New Roman" w:cs="Times New Roman"/>
-          <w:b/>
-          <w:bCs/>
-          <w:sz w:val="28"/>
-          <w:szCs w:val="28"/>
+      <w:r>
+        <w:rPr>
+          <w:rFonts w:ascii="Times New Roman" w:hAnsi="Times New Roman" w:cs="Times New Roman"/>
+          <w:b/>
+          <w:bCs/>
+          <w:sz w:val="28"/>
+          <w:szCs w:val="28"/>
+          <w:lang w:val="en-US"/>
+        </w:rPr>
+        <w:t xml:space="preserve"> </w:t>
+      </w:r>
+      <w:r>
+        <w:rPr>
+          <w:rFonts w:ascii="Times New Roman" w:hAnsi="Times New Roman" w:cs="Times New Roman"/>
+          <w:lang w:val="en-US"/>
+        </w:rPr>
+        <w:t>GUI</w:t>
+      </w:r>
+    </w:p>
+    <w:p>
+      <w:pPr>
+        <w:rPr>
+          <w:rFonts w:ascii="Times New Roman" w:hAnsi="Times New Roman" w:cs="Times New Roman"/>
           <w:lang w:val="en-US"/>
         </w:rPr>
       </w:pPr>
@@ -1773,18 +1821,40 @@
         </w:rPr>
         <w:t>:</w:t>
       </w:r>
-    </w:p>
-    <w:p>
-      <w:pPr>
-        <w:rPr>
-          <w:rFonts w:ascii="Times New Roman" w:hAnsi="Times New Roman" w:cs="Times New Roman"/>
-          <w:b/>
-          <w:bCs/>
-          <w:sz w:val="28"/>
-          <w:szCs w:val="28"/>
-          <w:lang w:val="en-US"/>
-        </w:rPr>
-      </w:pPr>
+      <w:r>
+        <w:rPr>
+          <w:rFonts w:ascii="Times New Roman" w:hAnsi="Times New Roman" w:cs="Times New Roman"/>
+          <w:b/>
+          <w:bCs/>
+          <w:sz w:val="28"/>
+          <w:szCs w:val="28"/>
+          <w:lang w:val="en-US"/>
+        </w:rPr>
+        <w:t xml:space="preserve"> </w:t>
+      </w:r>
+      <w:r>
+        <w:rPr>
+          <w:rFonts w:ascii="Times New Roman" w:hAnsi="Times New Roman" w:cs="Times New Roman"/>
+          <w:lang w:val="en-US"/>
+        </w:rPr>
+        <w:t xml:space="preserve">As a </w:t>
+      </w:r>
+      <w:proofErr w:type="gramStart"/>
+      <w:r>
+        <w:rPr>
+          <w:rFonts w:ascii="Times New Roman" w:hAnsi="Times New Roman" w:cs="Times New Roman"/>
+          <w:lang w:val="en-US"/>
+        </w:rPr>
+        <w:t>first time</w:t>
+      </w:r>
+      <w:proofErr w:type="gramEnd"/>
+      <w:r>
+        <w:rPr>
+          <w:rFonts w:ascii="Times New Roman" w:hAnsi="Times New Roman" w:cs="Times New Roman"/>
+          <w:lang w:val="en-US"/>
+        </w:rPr>
+        <w:t xml:space="preserve"> user I would like a more intuitive user interface to guide me so that I can fully utilize the capabilities of the software</w:t>
+      </w:r>
     </w:p>
     <w:p>
       <w:pPr>
@@ -1831,21 +1901,24 @@
           <w:rFonts w:ascii="Times New Roman" w:hAnsi="Times New Roman" w:cs="Times New Roman"/>
           <w:b/>
           <w:bCs/>
-          <w:sz w:val="28"/>
-          <w:szCs w:val="28"/>
-          <w:lang w:val="en-US"/>
-        </w:rPr>
-      </w:pPr>
-      <w:r>
-        <w:rPr>
-          <w:rFonts w:ascii="Times New Roman" w:hAnsi="Times New Roman" w:cs="Times New Roman"/>
-          <w:b/>
-          <w:bCs/>
-          <w:sz w:val="28"/>
-          <w:szCs w:val="28"/>
+          <w:lang w:val="en-US"/>
+        </w:rPr>
+      </w:pPr>
+      <w:r>
+        <w:rPr>
+          <w:rFonts w:ascii="Times New Roman" w:hAnsi="Times New Roman" w:cs="Times New Roman"/>
+          <w:b/>
+          <w:bCs/>
           <w:lang w:val="en-US"/>
         </w:rPr>
         <w:t xml:space="preserve"> </w:t>
+      </w:r>
+      <w:r>
+        <w:rPr>
+          <w:rFonts w:ascii="Times New Roman" w:hAnsi="Times New Roman" w:cs="Times New Roman"/>
+          <w:lang w:val="en-US"/>
+        </w:rPr>
+        <w:t>Update GUI using PyQT5 to give interface a native look and feel</w:t>
       </w:r>
     </w:p>
     <w:p>
@@ -1859,29 +1932,81 @@
           <w:rFonts w:ascii="Times New Roman" w:hAnsi="Times New Roman" w:cs="Times New Roman"/>
           <w:b/>
           <w:bCs/>
-          <w:sz w:val="28"/>
-          <w:szCs w:val="28"/>
-          <w:lang w:val="en-US"/>
-        </w:rPr>
-      </w:pPr>
-      <w:r>
-        <w:rPr>
-          <w:rFonts w:ascii="Times New Roman" w:hAnsi="Times New Roman" w:cs="Times New Roman"/>
-          <w:b/>
-          <w:bCs/>
-          <w:sz w:val="28"/>
-          <w:szCs w:val="28"/>
+          <w:lang w:val="en-US"/>
+        </w:rPr>
+      </w:pPr>
+      <w:r>
+        <w:rPr>
+          <w:rFonts w:ascii="Times New Roman" w:hAnsi="Times New Roman" w:cs="Times New Roman"/>
+          <w:b/>
+          <w:bCs/>
           <w:lang w:val="en-US"/>
         </w:rPr>
         <w:t xml:space="preserve"> </w:t>
       </w:r>
-    </w:p>
-    <w:p>
-      <w:pPr>
-        <w:rPr>
-          <w:rFonts w:ascii="Times New Roman" w:hAnsi="Times New Roman" w:cs="Times New Roman"/>
-          <w:b/>
-          <w:bCs/>
+      <w:r>
+        <w:rPr>
+          <w:rFonts w:ascii="Times New Roman" w:hAnsi="Times New Roman" w:cs="Times New Roman"/>
+          <w:lang w:val="en-US"/>
+        </w:rPr>
+        <w:t xml:space="preserve">Group buttons based on function type, i.e. buttons that manipulate the data based on velocity </w:t>
+      </w:r>
+      <w:r>
+        <w:rPr>
+          <w:rFonts w:ascii="Times New Roman" w:hAnsi="Times New Roman" w:cs="Times New Roman"/>
+          <w:lang w:val="en-US"/>
+        </w:rPr>
+        <w:t>will be in one group and so on</w:t>
+      </w:r>
+    </w:p>
+    <w:p>
+      <w:pPr>
+        <w:pStyle w:val="ListParagraph"/>
+        <w:numPr>
+          <w:ilvl w:val="0"/>
+          <w:numId w:val="9"/>
+        </w:numPr>
+        <w:rPr>
+          <w:rFonts w:ascii="Times New Roman" w:hAnsi="Times New Roman" w:cs="Times New Roman"/>
+          <w:b/>
+          <w:bCs/>
+          <w:lang w:val="en-US"/>
+        </w:rPr>
+      </w:pPr>
+      <w:r>
+        <w:rPr>
+          <w:rFonts w:ascii="Times New Roman" w:hAnsi="Times New Roman" w:cs="Times New Roman"/>
+          <w:lang w:val="en-US"/>
+        </w:rPr>
+        <w:t>Organize button groups into tabs</w:t>
+      </w:r>
+    </w:p>
+    <w:p>
+      <w:pPr>
+        <w:pStyle w:val="ListParagraph"/>
+        <w:numPr>
+          <w:ilvl w:val="0"/>
+          <w:numId w:val="9"/>
+        </w:numPr>
+        <w:rPr>
+          <w:rFonts w:ascii="Times New Roman" w:hAnsi="Times New Roman" w:cs="Times New Roman"/>
+          <w:b/>
+          <w:bCs/>
+          <w:lang w:val="en-US"/>
+        </w:rPr>
+      </w:pPr>
+      <w:r>
+        <w:rPr>
+          <w:rFonts w:ascii="Times New Roman" w:hAnsi="Times New Roman" w:cs="Times New Roman"/>
+          <w:lang w:val="en-US"/>
+        </w:rPr>
+        <w:t>Save and export changes into a file which can be loaded as a preset</w:t>
+      </w:r>
+    </w:p>
+    <w:p>
+      <w:pPr>
+        <w:rPr>
+          <w:rFonts w:ascii="Times New Roman" w:hAnsi="Times New Roman" w:cs="Times New Roman"/>
           <w:sz w:val="28"/>
           <w:szCs w:val="28"/>
           <w:lang w:val="en-US"/>
@@ -1909,6 +2034,24 @@
         </w:rPr>
         <w:t>:</w:t>
       </w:r>
+      <w:r>
+        <w:rPr>
+          <w:rFonts w:ascii="Times New Roman" w:hAnsi="Times New Roman" w:cs="Times New Roman"/>
+          <w:b/>
+          <w:bCs/>
+          <w:sz w:val="28"/>
+          <w:szCs w:val="28"/>
+          <w:lang w:val="en-US"/>
+        </w:rPr>
+        <w:t xml:space="preserve"> </w:t>
+      </w:r>
+      <w:r>
+        <w:rPr>
+          <w:rFonts w:ascii="Times New Roman" w:hAnsi="Times New Roman" w:cs="Times New Roman"/>
+          <w:lang w:val="en-US"/>
+        </w:rPr>
+        <w:t>8</w:t>
+      </w:r>
     </w:p>
     <w:p>
       <w:pPr>
@@ -1942,6 +2085,24 @@
           <w:lang w:val="en-US"/>
         </w:rPr>
         <w:t>:</w:t>
+      </w:r>
+      <w:r>
+        <w:rPr>
+          <w:rFonts w:ascii="Times New Roman" w:hAnsi="Times New Roman" w:cs="Times New Roman"/>
+          <w:b/>
+          <w:bCs/>
+          <w:sz w:val="28"/>
+          <w:szCs w:val="28"/>
+          <w:lang w:val="en-US"/>
+        </w:rPr>
+        <w:t xml:space="preserve"> </w:t>
+      </w:r>
+      <w:r>
+        <w:rPr>
+          <w:rFonts w:ascii="Times New Roman" w:hAnsi="Times New Roman" w:cs="Times New Roman"/>
+          <w:lang w:val="en-US"/>
+        </w:rPr>
+        <w:t>MEDIUM</w:t>
       </w:r>
     </w:p>
     <w:p>
@@ -2523,8 +2684,8 @@
   <w:abstractNum w:abstractNumId="6" w15:restartNumberingAfterBreak="0">
     <w:nsid w:val="51765F55"/>
     <w:multiLevelType w:val="hybridMultilevel"/>
-    <w:tmpl w:val="42341D0A"/>
-    <w:lvl w:ilvl="0" w:tplc="FFFFFFFF">
+    <w:tmpl w:val="99E6B776"/>
+    <w:lvl w:ilvl="0" w:tplc="9A80C514">
       <w:start w:val="1"/>
       <w:numFmt w:val="decimal"/>
       <w:lvlText w:val="%1)"/>
@@ -2534,6 +2695,8 @@
       </w:pPr>
       <w:rPr>
         <w:rFonts w:hint="default"/>
+        <w:b w:val="0"/>
+        <w:bCs w:val="0"/>
       </w:rPr>
     </w:lvl>
     <w:lvl w:ilvl="1" w:tplc="FFFFFFFF" w:tentative="1">

</xml_diff>

<commit_message>
Added descriptive list of issues with Gprpy, as well as Libraries to be used with the new fixes
</commit_message>
<xml_diff>
--- a/Project Plan/UserStories.docx
+++ b/Project Plan/UserStories.docx
@@ -2103,6 +2103,1942 @@
           <w:lang w:val="en-US"/>
         </w:rPr>
         <w:t>MEDIUM</w:t>
+      </w:r>
+    </w:p>
+    <w:p>
+      <w:pPr>
+        <w:rPr>
+          <w:rFonts w:ascii="Times New Roman" w:hAnsi="Times New Roman" w:cs="Times New Roman"/>
+          <w:b/>
+          <w:bCs/>
+          <w:sz w:val="28"/>
+          <w:szCs w:val="28"/>
+          <w:lang w:val="en-US"/>
+        </w:rPr>
+      </w:pPr>
+    </w:p>
+    <w:p>
+      <w:pPr>
+        <w:rPr>
+          <w:rFonts w:ascii="Times New Roman" w:hAnsi="Times New Roman" w:cs="Times New Roman"/>
+          <w:b/>
+          <w:bCs/>
+          <w:sz w:val="28"/>
+          <w:szCs w:val="28"/>
+          <w:lang w:val="en-US"/>
+        </w:rPr>
+      </w:pPr>
+    </w:p>
+    <w:p>
+      <w:pPr>
+        <w:rPr>
+          <w:rFonts w:ascii="Times New Roman" w:hAnsi="Times New Roman" w:cs="Times New Roman"/>
+          <w:b/>
+          <w:bCs/>
+          <w:sz w:val="28"/>
+          <w:szCs w:val="28"/>
+          <w:lang w:val="en-US"/>
+        </w:rPr>
+      </w:pPr>
+    </w:p>
+    <w:p>
+      <w:pPr>
+        <w:rPr>
+          <w:rFonts w:ascii="Times New Roman" w:hAnsi="Times New Roman" w:cs="Times New Roman"/>
+          <w:b/>
+          <w:bCs/>
+          <w:sz w:val="28"/>
+          <w:szCs w:val="28"/>
+          <w:lang w:val="en-US"/>
+        </w:rPr>
+      </w:pPr>
+    </w:p>
+    <w:p>
+      <w:pPr>
+        <w:rPr>
+          <w:rFonts w:ascii="Times New Roman" w:hAnsi="Times New Roman" w:cs="Times New Roman"/>
+          <w:b/>
+          <w:bCs/>
+          <w:sz w:val="28"/>
+          <w:szCs w:val="28"/>
+          <w:lang w:val="en-US"/>
+        </w:rPr>
+      </w:pPr>
+    </w:p>
+    <w:p>
+      <w:pPr>
+        <w:rPr>
+          <w:rFonts w:ascii="Times New Roman" w:hAnsi="Times New Roman" w:cs="Times New Roman"/>
+          <w:b/>
+          <w:bCs/>
+          <w:sz w:val="28"/>
+          <w:szCs w:val="28"/>
+          <w:lang w:val="en-US"/>
+        </w:rPr>
+      </w:pPr>
+    </w:p>
+    <w:p>
+      <w:pPr>
+        <w:rPr>
+          <w:rFonts w:ascii="Times New Roman" w:hAnsi="Times New Roman" w:cs="Times New Roman"/>
+          <w:b/>
+          <w:bCs/>
+          <w:sz w:val="28"/>
+          <w:szCs w:val="28"/>
+          <w:lang w:val="en-US"/>
+        </w:rPr>
+      </w:pPr>
+    </w:p>
+    <w:p>
+      <w:pPr>
+        <w:rPr>
+          <w:rFonts w:ascii="Times New Roman" w:hAnsi="Times New Roman" w:cs="Times New Roman"/>
+          <w:b/>
+          <w:bCs/>
+          <w:sz w:val="28"/>
+          <w:szCs w:val="28"/>
+          <w:lang w:val="en-US"/>
+        </w:rPr>
+      </w:pPr>
+    </w:p>
+    <w:p>
+      <w:pPr>
+        <w:rPr>
+          <w:rFonts w:ascii="Times New Roman" w:hAnsi="Times New Roman" w:cs="Times New Roman"/>
+          <w:b/>
+          <w:bCs/>
+          <w:sz w:val="28"/>
+          <w:szCs w:val="28"/>
+          <w:lang w:val="en-US"/>
+        </w:rPr>
+      </w:pPr>
+    </w:p>
+    <w:p>
+      <w:pPr>
+        <w:rPr>
+          <w:rFonts w:ascii="Times New Roman" w:hAnsi="Times New Roman" w:cs="Times New Roman"/>
+          <w:b/>
+          <w:bCs/>
+          <w:sz w:val="28"/>
+          <w:szCs w:val="28"/>
+          <w:lang w:val="en-US"/>
+        </w:rPr>
+      </w:pPr>
+    </w:p>
+    <w:p>
+      <w:pPr>
+        <w:rPr>
+          <w:rFonts w:ascii="Times New Roman" w:hAnsi="Times New Roman" w:cs="Times New Roman"/>
+          <w:b/>
+          <w:bCs/>
+          <w:sz w:val="28"/>
+          <w:szCs w:val="28"/>
+          <w:lang w:val="en-US"/>
+        </w:rPr>
+      </w:pPr>
+    </w:p>
+    <w:p>
+      <w:pPr>
+        <w:rPr>
+          <w:rFonts w:ascii="Times New Roman" w:hAnsi="Times New Roman" w:cs="Times New Roman"/>
+          <w:b/>
+          <w:bCs/>
+          <w:sz w:val="28"/>
+          <w:szCs w:val="28"/>
+          <w:lang w:val="en-US"/>
+        </w:rPr>
+      </w:pPr>
+    </w:p>
+    <w:p>
+      <w:pPr>
+        <w:rPr>
+          <w:rFonts w:ascii="Times New Roman" w:hAnsi="Times New Roman" w:cs="Times New Roman"/>
+          <w:b/>
+          <w:bCs/>
+          <w:sz w:val="28"/>
+          <w:szCs w:val="28"/>
+          <w:lang w:val="en-US"/>
+        </w:rPr>
+      </w:pPr>
+    </w:p>
+    <w:p>
+      <w:pPr>
+        <w:rPr>
+          <w:rFonts w:ascii="Times New Roman" w:hAnsi="Times New Roman" w:cs="Times New Roman"/>
+          <w:b/>
+          <w:bCs/>
+          <w:sz w:val="28"/>
+          <w:szCs w:val="28"/>
+          <w:lang w:val="en-US"/>
+        </w:rPr>
+      </w:pPr>
+    </w:p>
+    <w:p>
+      <w:pPr>
+        <w:rPr>
+          <w:rFonts w:ascii="Times New Roman" w:hAnsi="Times New Roman" w:cs="Times New Roman"/>
+          <w:b/>
+          <w:bCs/>
+          <w:sz w:val="28"/>
+          <w:szCs w:val="28"/>
+          <w:lang w:val="en-US"/>
+        </w:rPr>
+      </w:pPr>
+    </w:p>
+    <w:p>
+      <w:pPr>
+        <w:rPr>
+          <w:rFonts w:ascii="Times New Roman" w:hAnsi="Times New Roman" w:cs="Times New Roman"/>
+          <w:b/>
+          <w:bCs/>
+          <w:sz w:val="28"/>
+          <w:szCs w:val="28"/>
+          <w:lang w:val="en-US"/>
+        </w:rPr>
+      </w:pPr>
+    </w:p>
+    <w:p>
+      <w:pPr>
+        <w:rPr>
+          <w:rFonts w:ascii="Times New Roman" w:hAnsi="Times New Roman" w:cs="Times New Roman"/>
+          <w:b/>
+          <w:bCs/>
+          <w:sz w:val="28"/>
+          <w:szCs w:val="28"/>
+          <w:lang w:val="en-US"/>
+        </w:rPr>
+      </w:pPr>
+    </w:p>
+    <w:p>
+      <w:pPr>
+        <w:rPr>
+          <w:rFonts w:ascii="Times New Roman" w:hAnsi="Times New Roman" w:cs="Times New Roman"/>
+          <w:b/>
+          <w:bCs/>
+          <w:sz w:val="32"/>
+          <w:szCs w:val="32"/>
+          <w:lang w:val="en-US"/>
+        </w:rPr>
+      </w:pPr>
+      <w:r>
+        <w:rPr>
+          <w:rFonts w:ascii="Times New Roman" w:hAnsi="Times New Roman" w:cs="Times New Roman"/>
+          <w:b/>
+          <w:bCs/>
+          <w:sz w:val="32"/>
+          <w:szCs w:val="32"/>
+          <w:lang w:val="en-US"/>
+        </w:rPr>
+        <w:lastRenderedPageBreak/>
+        <w:t>Issues</w:t>
+      </w:r>
+    </w:p>
+    <w:p>
+      <w:pPr>
+        <w:rPr>
+          <w:rFonts w:ascii="Times New Roman" w:hAnsi="Times New Roman" w:cs="Times New Roman"/>
+          <w:b/>
+          <w:bCs/>
+          <w:sz w:val="28"/>
+          <w:szCs w:val="28"/>
+          <w:lang w:val="en-US"/>
+        </w:rPr>
+      </w:pPr>
+      <w:r>
+        <w:rPr>
+          <w:rFonts w:ascii="Times New Roman" w:hAnsi="Times New Roman" w:cs="Times New Roman"/>
+          <w:b/>
+          <w:bCs/>
+          <w:sz w:val="28"/>
+          <w:szCs w:val="28"/>
+          <w:lang w:val="en-US"/>
+        </w:rPr>
+        <w:t xml:space="preserve">A. </w:t>
+      </w:r>
+      <w:r>
+        <w:rPr>
+          <w:rFonts w:ascii="Times New Roman" w:hAnsi="Times New Roman" w:cs="Times New Roman"/>
+          <w:b/>
+          <w:bCs/>
+          <w:sz w:val="28"/>
+          <w:szCs w:val="28"/>
+          <w:lang w:val="en-US"/>
+        </w:rPr>
+        <w:t>Capstone Project</w:t>
+      </w:r>
+    </w:p>
+    <w:p>
+      <w:pPr>
+        <w:ind w:left="360"/>
+        <w:rPr>
+          <w:rFonts w:ascii="Times New Roman" w:hAnsi="Times New Roman" w:cs="Times New Roman"/>
+          <w:lang w:val="en-US"/>
+        </w:rPr>
+      </w:pPr>
+      <w:r>
+        <w:rPr>
+          <w:rFonts w:ascii="Times New Roman" w:hAnsi="Times New Roman" w:cs="Times New Roman"/>
+          <w:lang w:val="en-US"/>
+        </w:rPr>
+        <w:t xml:space="preserve">The first iteration of GPR.PY was developed as a part of my capstone </w:t>
+      </w:r>
+      <w:proofErr w:type="gramStart"/>
+      <w:r>
+        <w:rPr>
+          <w:rFonts w:ascii="Times New Roman" w:hAnsi="Times New Roman" w:cs="Times New Roman"/>
+          <w:lang w:val="en-US"/>
+        </w:rPr>
+        <w:t>project, and</w:t>
+      </w:r>
+      <w:proofErr w:type="gramEnd"/>
+      <w:r>
+        <w:rPr>
+          <w:rFonts w:ascii="Times New Roman" w:hAnsi="Times New Roman" w:cs="Times New Roman"/>
+          <w:lang w:val="en-US"/>
+        </w:rPr>
+        <w:t xml:space="preserve"> aimed at </w:t>
+      </w:r>
+      <w:proofErr w:type="spellStart"/>
+      <w:r>
+        <w:rPr>
+          <w:rFonts w:ascii="Times New Roman" w:hAnsi="Times New Roman" w:cs="Times New Roman"/>
+          <w:lang w:val="en-US"/>
+        </w:rPr>
+        <w:t>acheieving</w:t>
+      </w:r>
+      <w:proofErr w:type="spellEnd"/>
+      <w:r>
+        <w:rPr>
+          <w:rFonts w:ascii="Times New Roman" w:hAnsi="Times New Roman" w:cs="Times New Roman"/>
+          <w:lang w:val="en-US"/>
+        </w:rPr>
+        <w:t xml:space="preserve"> the same goals that are listed above. However, due to several limitations in the libraries used and poor design choices the project failed to meet some targets. Although the final product was working, it was not ready for real-world deployment. The issues with the previous project are as follows:</w:t>
+      </w:r>
+    </w:p>
+    <w:p>
+      <w:pPr>
+        <w:rPr>
+          <w:rFonts w:ascii="Times New Roman" w:hAnsi="Times New Roman" w:cs="Times New Roman"/>
+          <w:lang w:val="en-US"/>
+        </w:rPr>
+      </w:pPr>
+    </w:p>
+    <w:p>
+      <w:pPr>
+        <w:pStyle w:val="ListParagraph"/>
+        <w:numPr>
+          <w:ilvl w:val="0"/>
+          <w:numId w:val="10"/>
+        </w:numPr>
+        <w:rPr>
+          <w:rFonts w:ascii="Times New Roman" w:hAnsi="Times New Roman" w:cs="Times New Roman"/>
+          <w:b/>
+          <w:bCs/>
+          <w:lang w:val="en-US"/>
+        </w:rPr>
+      </w:pPr>
+      <w:proofErr w:type="spellStart"/>
+      <w:r>
+        <w:rPr>
+          <w:rFonts w:ascii="Times New Roman" w:hAnsi="Times New Roman" w:cs="Times New Roman"/>
+          <w:b/>
+          <w:bCs/>
+          <w:lang w:val="en-US"/>
+        </w:rPr>
+        <w:t>Incompatibilty</w:t>
+      </w:r>
+      <w:proofErr w:type="spellEnd"/>
+      <w:r>
+        <w:rPr>
+          <w:rFonts w:ascii="Times New Roman" w:hAnsi="Times New Roman" w:cs="Times New Roman"/>
+          <w:b/>
+          <w:bCs/>
+          <w:lang w:val="en-US"/>
+        </w:rPr>
+        <w:t xml:space="preserve"> with MacOS</w:t>
+      </w:r>
+    </w:p>
+    <w:p>
+      <w:pPr>
+        <w:ind w:left="720"/>
+        <w:rPr>
+          <w:rFonts w:ascii="Times New Roman" w:hAnsi="Times New Roman" w:cs="Times New Roman"/>
+          <w:lang w:val="en-US"/>
+        </w:rPr>
+      </w:pPr>
+      <w:r>
+        <w:rPr>
+          <w:rFonts w:ascii="Times New Roman" w:hAnsi="Times New Roman" w:cs="Times New Roman"/>
+          <w:lang w:val="en-US"/>
+        </w:rPr>
+        <w:t xml:space="preserve">This was due to conflicts with </w:t>
+      </w:r>
+      <w:proofErr w:type="spellStart"/>
+      <w:r>
+        <w:rPr>
+          <w:rFonts w:ascii="Times New Roman" w:hAnsi="Times New Roman" w:cs="Times New Roman"/>
+          <w:i/>
+          <w:iCs/>
+          <w:lang w:val="en-US"/>
+        </w:rPr>
+        <w:t>mayavi</w:t>
+      </w:r>
+      <w:proofErr w:type="spellEnd"/>
+      <w:r>
+        <w:rPr>
+          <w:rFonts w:ascii="Times New Roman" w:hAnsi="Times New Roman" w:cs="Times New Roman"/>
+          <w:lang w:val="en-US"/>
+        </w:rPr>
+        <w:t xml:space="preserve"> libraries which resulted in the program crashing on </w:t>
+      </w:r>
+      <w:proofErr w:type="gramStart"/>
+      <w:r>
+        <w:rPr>
+          <w:rFonts w:ascii="Times New Roman" w:hAnsi="Times New Roman" w:cs="Times New Roman"/>
+          <w:lang w:val="en-US"/>
+        </w:rPr>
+        <w:t>launch .</w:t>
+      </w:r>
+      <w:proofErr w:type="gramEnd"/>
+      <w:r>
+        <w:rPr>
+          <w:rFonts w:ascii="Times New Roman" w:hAnsi="Times New Roman" w:cs="Times New Roman"/>
+          <w:lang w:val="en-US"/>
+        </w:rPr>
+        <w:t xml:space="preserve"> Despite reinstalling the correct version, the problem continued to persist. The temporary fix was to </w:t>
+      </w:r>
+      <w:proofErr w:type="spellStart"/>
+      <w:proofErr w:type="gramStart"/>
+      <w:r>
+        <w:rPr>
+          <w:rFonts w:ascii="Times New Roman" w:hAnsi="Times New Roman" w:cs="Times New Roman"/>
+          <w:lang w:val="en-US"/>
+        </w:rPr>
+        <w:t>removed</w:t>
+      </w:r>
+      <w:proofErr w:type="spellEnd"/>
+      <w:proofErr w:type="gramEnd"/>
+      <w:r>
+        <w:rPr>
+          <w:rFonts w:ascii="Times New Roman" w:hAnsi="Times New Roman" w:cs="Times New Roman"/>
+          <w:lang w:val="en-US"/>
+        </w:rPr>
+        <w:t xml:space="preserve"> the import statement entirely. This however, removed the 3D cube visualization capabilities of the program on MacOS.</w:t>
+      </w:r>
+    </w:p>
+    <w:p>
+      <w:pPr>
+        <w:ind w:left="720"/>
+        <w:rPr>
+          <w:rFonts w:ascii="Times New Roman" w:hAnsi="Times New Roman" w:cs="Times New Roman"/>
+          <w:lang w:val="en-US"/>
+        </w:rPr>
+      </w:pPr>
+      <w:r>
+        <w:rPr>
+          <w:rFonts w:ascii="Times New Roman" w:hAnsi="Times New Roman" w:cs="Times New Roman"/>
+          <w:noProof/>
+          <w:lang w:val="en-US"/>
+        </w:rPr>
+        <w:drawing>
+          <wp:inline distT="0" distB="0" distL="0" distR="0" wp14:anchorId="30C7F944" wp14:editId="02B26E03">
+            <wp:extent cx="5731510" cy="3283585"/>
+            <wp:effectExtent l="0" t="0" r="0" b="5715"/>
+            <wp:docPr id="1025035813" name="Picture 1" descr="A screenshot of a computer program&#10;&#10;AI-generated content may be incorrect."/>
+            <wp:cNvGraphicFramePr>
+              <a:graphicFrameLocks xmlns:a="http://schemas.openxmlformats.org/drawingml/2006/main" noChangeAspect="1"/>
+            </wp:cNvGraphicFramePr>
+            <a:graphic xmlns:a="http://schemas.openxmlformats.org/drawingml/2006/main">
+              <a:graphicData uri="http://schemas.openxmlformats.org/drawingml/2006/picture">
+                <pic:pic xmlns:pic="http://schemas.openxmlformats.org/drawingml/2006/picture">
+                  <pic:nvPicPr>
+                    <pic:cNvPr id="1025035813" name="Picture 1" descr="A screenshot of a computer program&#10;&#10;AI-generated content may be incorrect."/>
+                    <pic:cNvPicPr/>
+                  </pic:nvPicPr>
+                  <pic:blipFill>
+                    <a:blip r:embed="rId5">
+                      <a:extLst>
+                        <a:ext uri="{28A0092B-C50C-407E-A947-70E740481C1C}">
+                          <a14:useLocalDpi xmlns:a14="http://schemas.microsoft.com/office/drawing/2010/main" val="0"/>
+                        </a:ext>
+                      </a:extLst>
+                    </a:blip>
+                    <a:stretch>
+                      <a:fillRect/>
+                    </a:stretch>
+                  </pic:blipFill>
+                  <pic:spPr>
+                    <a:xfrm>
+                      <a:off x="0" y="0"/>
+                      <a:ext cx="5731510" cy="3283585"/>
+                    </a:xfrm>
+                    <a:prstGeom prst="rect">
+                      <a:avLst/>
+                    </a:prstGeom>
+                  </pic:spPr>
+                </pic:pic>
+              </a:graphicData>
+            </a:graphic>
+          </wp:inline>
+        </w:drawing>
+      </w:r>
+    </w:p>
+    <w:p>
+      <w:pPr>
+        <w:pStyle w:val="ListParagraph"/>
+        <w:numPr>
+          <w:ilvl w:val="0"/>
+          <w:numId w:val="10"/>
+        </w:numPr>
+        <w:rPr>
+          <w:rFonts w:ascii="Times New Roman" w:hAnsi="Times New Roman" w:cs="Times New Roman"/>
+          <w:b/>
+          <w:bCs/>
+          <w:lang w:val="en-US"/>
+        </w:rPr>
+      </w:pPr>
+      <w:r>
+        <w:rPr>
+          <w:rFonts w:ascii="Times New Roman" w:hAnsi="Times New Roman" w:cs="Times New Roman"/>
+          <w:b/>
+          <w:bCs/>
+          <w:lang w:val="en-US"/>
+        </w:rPr>
+        <w:t>Batch Processing - Memory Leaks</w:t>
+      </w:r>
+    </w:p>
+    <w:p>
+      <w:pPr>
+        <w:ind w:left="720"/>
+        <w:rPr>
+          <w:rFonts w:ascii="Times New Roman" w:hAnsi="Times New Roman" w:cs="Times New Roman"/>
+          <w:lang w:val="en-US"/>
+        </w:rPr>
+      </w:pPr>
+      <w:r>
+        <w:rPr>
+          <w:rFonts w:ascii="Times New Roman" w:hAnsi="Times New Roman" w:cs="Times New Roman"/>
+          <w:lang w:val="en-US"/>
+        </w:rPr>
+        <w:t>The program also implemented a batch processing feature that enabled users to enter a set of parameters in a series of text fields, and those changes would be applied to the folder containing the GPR data. The original script was developed by William Wadsworth and Dr Something from the University of Laval. To speed up the process, threads were utilized and resulted in 60% faster processing times. However, it would result in memory leaks and requires a “force quit” to end the program after one run.</w:t>
+      </w:r>
+    </w:p>
+    <w:p>
+      <w:pPr>
+        <w:ind w:left="720"/>
+        <w:rPr>
+          <w:rFonts w:ascii="Times New Roman" w:hAnsi="Times New Roman" w:cs="Times New Roman"/>
+          <w:lang w:val="en-US"/>
+        </w:rPr>
+      </w:pPr>
+    </w:p>
+    <w:p>
+      <w:pPr>
+        <w:ind w:left="360"/>
+        <w:rPr>
+          <w:rFonts w:ascii="Times New Roman" w:hAnsi="Times New Roman" w:cs="Times New Roman"/>
+          <w:lang w:val="en-US"/>
+        </w:rPr>
+      </w:pPr>
+      <w:r>
+        <w:rPr>
+          <w:rFonts w:ascii="Times New Roman" w:hAnsi="Times New Roman" w:cs="Times New Roman"/>
+          <w:noProof/>
+          <w:lang w:val="en-US"/>
+        </w:rPr>
+        <w:lastRenderedPageBreak/>
+        <w:drawing>
+          <wp:inline distT="0" distB="0" distL="0" distR="0" wp14:anchorId="1233276F" wp14:editId="43EED89B">
+            <wp:extent cx="5731510" cy="3676015"/>
+            <wp:effectExtent l="0" t="0" r="0" b="0"/>
+            <wp:docPr id="1531882688" name="Picture 2" descr="A screenshot of a computer&#10;&#10;AI-generated content may be incorrect."/>
+            <wp:cNvGraphicFramePr>
+              <a:graphicFrameLocks xmlns:a="http://schemas.openxmlformats.org/drawingml/2006/main" noChangeAspect="1"/>
+            </wp:cNvGraphicFramePr>
+            <a:graphic xmlns:a="http://schemas.openxmlformats.org/drawingml/2006/main">
+              <a:graphicData uri="http://schemas.openxmlformats.org/drawingml/2006/picture">
+                <pic:pic xmlns:pic="http://schemas.openxmlformats.org/drawingml/2006/picture">
+                  <pic:nvPicPr>
+                    <pic:cNvPr id="1531882688" name="Picture 2" descr="A screenshot of a computer&#10;&#10;AI-generated content may be incorrect."/>
+                    <pic:cNvPicPr/>
+                  </pic:nvPicPr>
+                  <pic:blipFill>
+                    <a:blip r:embed="rId6" cstate="print">
+                      <a:extLst>
+                        <a:ext uri="{28A0092B-C50C-407E-A947-70E740481C1C}">
+                          <a14:useLocalDpi xmlns:a14="http://schemas.microsoft.com/office/drawing/2010/main" val="0"/>
+                        </a:ext>
+                      </a:extLst>
+                    </a:blip>
+                    <a:stretch>
+                      <a:fillRect/>
+                    </a:stretch>
+                  </pic:blipFill>
+                  <pic:spPr>
+                    <a:xfrm>
+                      <a:off x="0" y="0"/>
+                      <a:ext cx="5731510" cy="3676015"/>
+                    </a:xfrm>
+                    <a:prstGeom prst="rect">
+                      <a:avLst/>
+                    </a:prstGeom>
+                  </pic:spPr>
+                </pic:pic>
+              </a:graphicData>
+            </a:graphic>
+          </wp:inline>
+        </w:drawing>
+      </w:r>
+    </w:p>
+    <w:p>
+      <w:pPr>
+        <w:pStyle w:val="ListParagraph"/>
+        <w:numPr>
+          <w:ilvl w:val="0"/>
+          <w:numId w:val="10"/>
+        </w:numPr>
+        <w:rPr>
+          <w:rFonts w:ascii="Times New Roman" w:hAnsi="Times New Roman" w:cs="Times New Roman"/>
+          <w:b/>
+          <w:bCs/>
+          <w:lang w:val="en-US"/>
+        </w:rPr>
+      </w:pPr>
+      <w:r>
+        <w:rPr>
+          <w:rFonts w:ascii="Times New Roman" w:hAnsi="Times New Roman" w:cs="Times New Roman"/>
+          <w:b/>
+          <w:bCs/>
+          <w:lang w:val="en-US"/>
+        </w:rPr>
+        <w:t>Interpolation</w:t>
+      </w:r>
+    </w:p>
+    <w:p>
+      <w:pPr>
+        <w:ind w:left="720"/>
+        <w:rPr>
+          <w:rFonts w:ascii="Times New Roman" w:hAnsi="Times New Roman" w:cs="Times New Roman"/>
+          <w:lang w:val="en-US"/>
+        </w:rPr>
+      </w:pPr>
+      <w:r>
+        <w:rPr>
+          <w:rFonts w:ascii="Times New Roman" w:hAnsi="Times New Roman" w:cs="Times New Roman"/>
+          <w:lang w:val="en-US"/>
+        </w:rPr>
+        <w:t xml:space="preserve">This step utilized the makeDataCube.py file, and because of the memory leaks created an incorrect matrix. Resulting in the cubing step, which already would take 2-4 hours to finish, getting stuck in an infinite loop. </w:t>
+      </w:r>
+    </w:p>
+    <w:p>
+      <w:pPr>
+        <w:rPr>
+          <w:rFonts w:ascii="Times New Roman" w:hAnsi="Times New Roman" w:cs="Times New Roman"/>
+          <w:lang w:val="en-US"/>
+        </w:rPr>
+      </w:pPr>
+    </w:p>
+    <w:p>
+      <w:pPr>
+        <w:pStyle w:val="ListParagraph"/>
+        <w:numPr>
+          <w:ilvl w:val="0"/>
+          <w:numId w:val="10"/>
+        </w:numPr>
+        <w:rPr>
+          <w:rFonts w:ascii="Times New Roman" w:hAnsi="Times New Roman" w:cs="Times New Roman"/>
+          <w:b/>
+          <w:bCs/>
+          <w:lang w:val="en-US"/>
+        </w:rPr>
+      </w:pPr>
+      <w:r>
+        <w:rPr>
+          <w:rFonts w:ascii="Times New Roman" w:hAnsi="Times New Roman" w:cs="Times New Roman"/>
+          <w:b/>
+          <w:bCs/>
+          <w:lang w:val="en-US"/>
+        </w:rPr>
+        <w:t>Cube slicing</w:t>
+      </w:r>
+    </w:p>
+    <w:p>
+      <w:pPr>
+        <w:ind w:left="720"/>
+        <w:rPr>
+          <w:rFonts w:ascii="Times New Roman" w:hAnsi="Times New Roman" w:cs="Times New Roman"/>
+          <w:lang w:val="en-US"/>
+        </w:rPr>
+      </w:pPr>
+      <w:r>
+        <w:rPr>
+          <w:rFonts w:ascii="Times New Roman" w:hAnsi="Times New Roman" w:cs="Times New Roman"/>
+          <w:lang w:val="en-US"/>
+        </w:rPr>
+        <w:t xml:space="preserve">One of the features requested was to be able to slice a 3D cube at set intervals and obtain the coordinates at each slice. This however would go on longer than intended resulting in memory overloads and crashing </w:t>
+      </w:r>
+      <w:proofErr w:type="spellStart"/>
+      <w:r>
+        <w:rPr>
+          <w:rFonts w:ascii="Times New Roman" w:hAnsi="Times New Roman" w:cs="Times New Roman"/>
+          <w:lang w:val="en-US"/>
+        </w:rPr>
+        <w:t>mayavi</w:t>
+      </w:r>
+      <w:proofErr w:type="spellEnd"/>
+      <w:r>
+        <w:rPr>
+          <w:rFonts w:ascii="Times New Roman" w:hAnsi="Times New Roman" w:cs="Times New Roman"/>
+          <w:lang w:val="en-US"/>
+        </w:rPr>
+        <w:t>. A workaround for this was to manually stop the slicing after 50.</w:t>
+      </w:r>
+    </w:p>
+    <w:p>
+      <w:pPr>
+        <w:rPr>
+          <w:rFonts w:ascii="Times New Roman" w:hAnsi="Times New Roman" w:cs="Times New Roman"/>
+          <w:lang w:val="en-US"/>
+        </w:rPr>
+      </w:pPr>
+    </w:p>
+    <w:p>
+      <w:pPr>
+        <w:pStyle w:val="ListParagraph"/>
+        <w:numPr>
+          <w:ilvl w:val="0"/>
+          <w:numId w:val="10"/>
+        </w:numPr>
+        <w:rPr>
+          <w:rFonts w:ascii="Times New Roman" w:hAnsi="Times New Roman" w:cs="Times New Roman"/>
+          <w:b/>
+          <w:bCs/>
+          <w:lang w:val="en-US"/>
+        </w:rPr>
+      </w:pPr>
+      <w:r>
+        <w:rPr>
+          <w:rFonts w:ascii="Times New Roman" w:hAnsi="Times New Roman" w:cs="Times New Roman"/>
+          <w:b/>
+          <w:bCs/>
+          <w:lang w:val="en-US"/>
+        </w:rPr>
+        <w:t>Design</w:t>
+      </w:r>
+    </w:p>
+    <w:p>
+      <w:pPr>
+        <w:ind w:left="720"/>
+        <w:rPr>
+          <w:rFonts w:ascii="Times New Roman" w:hAnsi="Times New Roman" w:cs="Times New Roman"/>
+          <w:lang w:val="en-US"/>
+        </w:rPr>
+      </w:pPr>
+      <w:r>
+        <w:rPr>
+          <w:rFonts w:ascii="Times New Roman" w:hAnsi="Times New Roman" w:cs="Times New Roman"/>
+          <w:lang w:val="en-US"/>
+        </w:rPr>
+        <w:t xml:space="preserve">Poor design decisions are the cause of some of the previous issues mentioned in Cube slicing, Batch processing and MacOS incompatibility. </w:t>
+      </w:r>
+    </w:p>
+    <w:p>
+      <w:pPr>
+        <w:pStyle w:val="ListParagraph"/>
+        <w:numPr>
+          <w:ilvl w:val="1"/>
+          <w:numId w:val="10"/>
+        </w:numPr>
+        <w:rPr>
+          <w:rFonts w:ascii="Times New Roman" w:hAnsi="Times New Roman" w:cs="Times New Roman"/>
+          <w:lang w:val="en-US"/>
+        </w:rPr>
+      </w:pPr>
+      <w:r>
+        <w:rPr>
+          <w:rFonts w:ascii="Times New Roman" w:hAnsi="Times New Roman" w:cs="Times New Roman"/>
+          <w:lang w:val="en-US"/>
+        </w:rPr>
+        <w:t>Placing all functions and classes in one file did not permit for changes to be made to variables, buttons or the functions without unintended errors.</w:t>
+      </w:r>
+    </w:p>
+    <w:p>
+      <w:pPr>
+        <w:pStyle w:val="ListParagraph"/>
+        <w:numPr>
+          <w:ilvl w:val="1"/>
+          <w:numId w:val="10"/>
+        </w:numPr>
+        <w:rPr>
+          <w:rFonts w:ascii="Times New Roman" w:hAnsi="Times New Roman" w:cs="Times New Roman"/>
+          <w:lang w:val="en-US"/>
+        </w:rPr>
+      </w:pPr>
+      <w:r>
+        <w:rPr>
+          <w:rFonts w:ascii="Times New Roman" w:hAnsi="Times New Roman" w:cs="Times New Roman"/>
+          <w:lang w:val="en-US"/>
+        </w:rPr>
+        <w:t xml:space="preserve">Using </w:t>
+      </w:r>
+      <w:proofErr w:type="spellStart"/>
+      <w:r>
+        <w:rPr>
+          <w:rFonts w:ascii="Times New Roman" w:hAnsi="Times New Roman" w:cs="Times New Roman"/>
+          <w:i/>
+          <w:iCs/>
+          <w:lang w:val="en-US"/>
+        </w:rPr>
+        <w:t>tkinter</w:t>
+      </w:r>
+      <w:proofErr w:type="spellEnd"/>
+      <w:r>
+        <w:rPr>
+          <w:rFonts w:ascii="Times New Roman" w:hAnsi="Times New Roman" w:cs="Times New Roman"/>
+          <w:lang w:val="en-US"/>
+        </w:rPr>
+        <w:t xml:space="preserve"> for the UI constrained development since it is </w:t>
+      </w:r>
+      <w:proofErr w:type="spellStart"/>
+      <w:r>
+        <w:rPr>
+          <w:rFonts w:ascii="Times New Roman" w:hAnsi="Times New Roman" w:cs="Times New Roman"/>
+          <w:lang w:val="en-US"/>
+        </w:rPr>
+        <w:t>uncompatible</w:t>
+      </w:r>
+      <w:proofErr w:type="spellEnd"/>
+      <w:r>
+        <w:rPr>
+          <w:rFonts w:ascii="Times New Roman" w:hAnsi="Times New Roman" w:cs="Times New Roman"/>
+          <w:lang w:val="en-US"/>
+        </w:rPr>
+        <w:t xml:space="preserve"> with certain libraries, especially when it came to the 3D visualization. This also made running </w:t>
+      </w:r>
+      <w:proofErr w:type="spellStart"/>
+      <w:r>
+        <w:rPr>
+          <w:rFonts w:ascii="Times New Roman" w:hAnsi="Times New Roman" w:cs="Times New Roman"/>
+          <w:i/>
+          <w:iCs/>
+          <w:lang w:val="en-US"/>
+        </w:rPr>
+        <w:t>mayavi</w:t>
+      </w:r>
+      <w:proofErr w:type="spellEnd"/>
+      <w:r>
+        <w:rPr>
+          <w:rFonts w:ascii="Times New Roman" w:hAnsi="Times New Roman" w:cs="Times New Roman"/>
+          <w:lang w:val="en-US"/>
+        </w:rPr>
+        <w:t xml:space="preserve"> considerably slow.</w:t>
+      </w:r>
+    </w:p>
+    <w:p>
+      <w:pPr>
+        <w:pStyle w:val="ListParagraph"/>
+        <w:numPr>
+          <w:ilvl w:val="1"/>
+          <w:numId w:val="10"/>
+        </w:numPr>
+        <w:rPr>
+          <w:rFonts w:ascii="Times New Roman" w:hAnsi="Times New Roman" w:cs="Times New Roman"/>
+          <w:lang w:val="en-US"/>
+        </w:rPr>
+      </w:pPr>
+      <w:r>
+        <w:rPr>
+          <w:rFonts w:ascii="Times New Roman" w:hAnsi="Times New Roman" w:cs="Times New Roman"/>
+          <w:lang w:val="en-US"/>
+        </w:rPr>
+        <w:lastRenderedPageBreak/>
+        <w:t xml:space="preserve">Using </w:t>
+      </w:r>
+      <w:proofErr w:type="spellStart"/>
+      <w:r>
+        <w:rPr>
+          <w:rFonts w:ascii="Times New Roman" w:hAnsi="Times New Roman" w:cs="Times New Roman"/>
+          <w:lang w:val="en-US"/>
+        </w:rPr>
+        <w:t>tkinter</w:t>
+      </w:r>
+      <w:proofErr w:type="spellEnd"/>
+      <w:r>
+        <w:rPr>
+          <w:rFonts w:ascii="Times New Roman" w:hAnsi="Times New Roman" w:cs="Times New Roman"/>
+          <w:lang w:val="en-US"/>
+        </w:rPr>
+        <w:t xml:space="preserve"> also resulted in different appearances for Mac and Windows. Required concessions to be made to the design of UI such as, making Collapsible panes instead of Tabs for the different button groups</w:t>
+      </w:r>
+    </w:p>
+    <w:p>
+      <w:pPr>
+        <w:ind w:left="720"/>
+        <w:rPr>
+          <w:rFonts w:ascii="Times New Roman" w:hAnsi="Times New Roman" w:cs="Times New Roman"/>
+          <w:b/>
+          <w:bCs/>
+          <w:lang w:val="en-US"/>
+        </w:rPr>
+      </w:pPr>
+      <w:r>
+        <w:rPr>
+          <w:rFonts w:ascii="Times New Roman" w:hAnsi="Times New Roman" w:cs="Times New Roman"/>
+          <w:b/>
+          <w:bCs/>
+          <w:lang w:val="en-US"/>
+        </w:rPr>
+        <w:t>Mac Version:</w:t>
+      </w:r>
+    </w:p>
+    <w:p>
+      <w:pPr>
+        <w:ind w:left="720"/>
+        <w:rPr>
+          <w:rFonts w:ascii="Times New Roman" w:hAnsi="Times New Roman" w:cs="Times New Roman"/>
+          <w:lang w:val="en-US"/>
+        </w:rPr>
+      </w:pPr>
+      <w:r>
+        <w:rPr>
+          <w:rFonts w:ascii="Times New Roman" w:hAnsi="Times New Roman" w:cs="Times New Roman"/>
+          <w:noProof/>
+          <w:lang w:val="en-US"/>
+        </w:rPr>
+        <w:drawing>
+          <wp:inline distT="0" distB="0" distL="0" distR="0" wp14:anchorId="771E18DE" wp14:editId="58ACF821">
+            <wp:extent cx="5731510" cy="3227070"/>
+            <wp:effectExtent l="0" t="0" r="0" b="0"/>
+            <wp:docPr id="2074968455" name="Picture 3" descr="A screenshot of a computer&#10;&#10;AI-generated content may be incorrect."/>
+            <wp:cNvGraphicFramePr>
+              <a:graphicFrameLocks xmlns:a="http://schemas.openxmlformats.org/drawingml/2006/main" noChangeAspect="1"/>
+            </wp:cNvGraphicFramePr>
+            <a:graphic xmlns:a="http://schemas.openxmlformats.org/drawingml/2006/main">
+              <a:graphicData uri="http://schemas.openxmlformats.org/drawingml/2006/picture">
+                <pic:pic xmlns:pic="http://schemas.openxmlformats.org/drawingml/2006/picture">
+                  <pic:nvPicPr>
+                    <pic:cNvPr id="2074968455" name="Picture 3" descr="A screenshot of a computer&#10;&#10;AI-generated content may be incorrect."/>
+                    <pic:cNvPicPr/>
+                  </pic:nvPicPr>
+                  <pic:blipFill>
+                    <a:blip r:embed="rId7" cstate="print">
+                      <a:extLst>
+                        <a:ext uri="{28A0092B-C50C-407E-A947-70E740481C1C}">
+                          <a14:useLocalDpi xmlns:a14="http://schemas.microsoft.com/office/drawing/2010/main" val="0"/>
+                        </a:ext>
+                      </a:extLst>
+                    </a:blip>
+                    <a:stretch>
+                      <a:fillRect/>
+                    </a:stretch>
+                  </pic:blipFill>
+                  <pic:spPr>
+                    <a:xfrm>
+                      <a:off x="0" y="0"/>
+                      <a:ext cx="5731510" cy="3227070"/>
+                    </a:xfrm>
+                    <a:prstGeom prst="rect">
+                      <a:avLst/>
+                    </a:prstGeom>
+                  </pic:spPr>
+                </pic:pic>
+              </a:graphicData>
+            </a:graphic>
+          </wp:inline>
+        </w:drawing>
+      </w:r>
+    </w:p>
+    <w:p>
+      <w:pPr>
+        <w:ind w:left="720"/>
+        <w:rPr>
+          <w:rFonts w:ascii="Times New Roman" w:hAnsi="Times New Roman" w:cs="Times New Roman"/>
+          <w:b/>
+          <w:bCs/>
+          <w:lang w:val="en-US"/>
+        </w:rPr>
+      </w:pPr>
+      <w:r>
+        <w:rPr>
+          <w:rFonts w:ascii="Times New Roman" w:hAnsi="Times New Roman" w:cs="Times New Roman"/>
+          <w:b/>
+          <w:bCs/>
+          <w:lang w:val="en-US"/>
+        </w:rPr>
+        <w:t>Windows Version:</w:t>
+      </w:r>
+    </w:p>
+    <w:p>
+      <w:pPr>
+        <w:ind w:left="720"/>
+        <w:rPr>
+          <w:rFonts w:ascii="Times New Roman" w:hAnsi="Times New Roman" w:cs="Times New Roman"/>
+          <w:lang w:val="en-US"/>
+        </w:rPr>
+      </w:pPr>
+      <w:r>
+        <w:rPr>
+          <w:rFonts w:ascii="Times New Roman" w:hAnsi="Times New Roman" w:cs="Times New Roman"/>
+          <w:noProof/>
+          <w:lang w:val="en-US"/>
+        </w:rPr>
+        <w:drawing>
+          <wp:inline distT="0" distB="0" distL="0" distR="0" wp14:anchorId="7EB7F103" wp14:editId="71A5F6EC">
+            <wp:extent cx="5731510" cy="2863215"/>
+            <wp:effectExtent l="0" t="0" r="0" b="0"/>
+            <wp:docPr id="703638256" name="Picture 4" descr="A screenshot of a computer&#10;&#10;AI-generated content may be incorrect."/>
+            <wp:cNvGraphicFramePr>
+              <a:graphicFrameLocks xmlns:a="http://schemas.openxmlformats.org/drawingml/2006/main" noChangeAspect="1"/>
+            </wp:cNvGraphicFramePr>
+            <a:graphic xmlns:a="http://schemas.openxmlformats.org/drawingml/2006/main">
+              <a:graphicData uri="http://schemas.openxmlformats.org/drawingml/2006/picture">
+                <pic:pic xmlns:pic="http://schemas.openxmlformats.org/drawingml/2006/picture">
+                  <pic:nvPicPr>
+                    <pic:cNvPr id="703638256" name="Picture 4" descr="A screenshot of a computer&#10;&#10;AI-generated content may be incorrect."/>
+                    <pic:cNvPicPr/>
+                  </pic:nvPicPr>
+                  <pic:blipFill>
+                    <a:blip r:embed="rId8">
+                      <a:extLst>
+                        <a:ext uri="{28A0092B-C50C-407E-A947-70E740481C1C}">
+                          <a14:useLocalDpi xmlns:a14="http://schemas.microsoft.com/office/drawing/2010/main" val="0"/>
+                        </a:ext>
+                      </a:extLst>
+                    </a:blip>
+                    <a:stretch>
+                      <a:fillRect/>
+                    </a:stretch>
+                  </pic:blipFill>
+                  <pic:spPr>
+                    <a:xfrm>
+                      <a:off x="0" y="0"/>
+                      <a:ext cx="5731510" cy="2863215"/>
+                    </a:xfrm>
+                    <a:prstGeom prst="rect">
+                      <a:avLst/>
+                    </a:prstGeom>
+                  </pic:spPr>
+                </pic:pic>
+              </a:graphicData>
+            </a:graphic>
+          </wp:inline>
+        </w:drawing>
+      </w:r>
+    </w:p>
+    <w:p>
+      <w:pPr>
+        <w:ind w:left="720"/>
+        <w:rPr>
+          <w:rFonts w:ascii="Times New Roman" w:hAnsi="Times New Roman" w:cs="Times New Roman"/>
+          <w:lang w:val="en-US"/>
+        </w:rPr>
+      </w:pPr>
+    </w:p>
+    <w:p>
+      <w:pPr>
+        <w:ind w:left="720"/>
+        <w:rPr>
+          <w:rFonts w:ascii="Times New Roman" w:hAnsi="Times New Roman" w:cs="Times New Roman"/>
+          <w:lang w:val="en-US"/>
+        </w:rPr>
+      </w:pPr>
+    </w:p>
+    <w:p>
+      <w:pPr>
+        <w:ind w:left="720"/>
+        <w:rPr>
+          <w:rFonts w:ascii="Times New Roman" w:hAnsi="Times New Roman" w:cs="Times New Roman"/>
+          <w:lang w:val="en-US"/>
+        </w:rPr>
+      </w:pPr>
+    </w:p>
+    <w:p>
+      <w:pPr>
+        <w:rPr>
+          <w:rFonts w:ascii="Times New Roman" w:hAnsi="Times New Roman" w:cs="Times New Roman"/>
+          <w:lang w:val="en-US"/>
+        </w:rPr>
+      </w:pPr>
+    </w:p>
+    <w:p>
+      <w:pPr>
+        <w:rPr>
+          <w:rFonts w:ascii="Times New Roman" w:hAnsi="Times New Roman" w:cs="Times New Roman"/>
+          <w:b/>
+          <w:bCs/>
+          <w:sz w:val="28"/>
+          <w:szCs w:val="28"/>
+          <w:lang w:val="en-US"/>
+        </w:rPr>
+      </w:pPr>
+      <w:r>
+        <w:rPr>
+          <w:rFonts w:ascii="Times New Roman" w:hAnsi="Times New Roman" w:cs="Times New Roman"/>
+          <w:b/>
+          <w:bCs/>
+          <w:sz w:val="28"/>
+          <w:szCs w:val="28"/>
+          <w:lang w:val="en-US"/>
+        </w:rPr>
+        <w:lastRenderedPageBreak/>
+        <w:t>B. gpr.py</w:t>
+      </w:r>
+    </w:p>
+    <w:p>
+      <w:pPr>
+        <w:pStyle w:val="ListParagraph"/>
+        <w:numPr>
+          <w:ilvl w:val="0"/>
+          <w:numId w:val="11"/>
+        </w:numPr>
+        <w:rPr>
+          <w:rFonts w:ascii="Times New Roman" w:hAnsi="Times New Roman" w:cs="Times New Roman"/>
+          <w:b/>
+          <w:bCs/>
+          <w:lang w:val="en-US"/>
+        </w:rPr>
+      </w:pPr>
+      <w:r>
+        <w:rPr>
+          <w:rFonts w:ascii="Times New Roman" w:hAnsi="Times New Roman" w:cs="Times New Roman"/>
+          <w:b/>
+          <w:bCs/>
+          <w:lang w:val="en-US"/>
+        </w:rPr>
+        <w:t>UI</w:t>
+      </w:r>
+    </w:p>
+    <w:p>
+      <w:pPr>
+        <w:pStyle w:val="ListParagraph"/>
+        <w:rPr>
+          <w:rFonts w:ascii="Times New Roman" w:hAnsi="Times New Roman" w:cs="Times New Roman"/>
+          <w:lang w:val="en-US"/>
+        </w:rPr>
+      </w:pPr>
+      <w:r>
+        <w:rPr>
+          <w:rFonts w:ascii="Times New Roman" w:hAnsi="Times New Roman" w:cs="Times New Roman"/>
+          <w:lang w:val="en-US"/>
+        </w:rPr>
+        <w:t>The current UI is outdated and disorganized. Acts as a high barrier to entry for non-technical users, or users with little to none programming experience.</w:t>
+      </w:r>
+    </w:p>
+    <w:p>
+      <w:pPr>
+        <w:pStyle w:val="ListParagraph"/>
+        <w:rPr>
+          <w:rFonts w:ascii="Times New Roman" w:hAnsi="Times New Roman" w:cs="Times New Roman"/>
+          <w:lang w:val="en-US"/>
+        </w:rPr>
+      </w:pPr>
+      <w:r>
+        <w:rPr>
+          <w:rFonts w:ascii="Times New Roman" w:hAnsi="Times New Roman" w:cs="Times New Roman"/>
+          <w:lang w:val="en-US"/>
+        </w:rPr>
+        <w:t xml:space="preserve">Since button layout is seemingly random, </w:t>
+      </w:r>
+      <w:proofErr w:type="gramStart"/>
+      <w:r>
+        <w:rPr>
+          <w:rFonts w:ascii="Times New Roman" w:hAnsi="Times New Roman" w:cs="Times New Roman"/>
+          <w:lang w:val="en-US"/>
+        </w:rPr>
+        <w:t>first time</w:t>
+      </w:r>
+      <w:proofErr w:type="gramEnd"/>
+      <w:r>
+        <w:rPr>
+          <w:rFonts w:ascii="Times New Roman" w:hAnsi="Times New Roman" w:cs="Times New Roman"/>
+          <w:lang w:val="en-US"/>
+        </w:rPr>
+        <w:t xml:space="preserve"> users take time to figure out workflow and understand button functionality</w:t>
+      </w:r>
+    </w:p>
+    <w:p>
+      <w:pPr>
+        <w:pStyle w:val="ListParagraph"/>
+        <w:rPr>
+          <w:rFonts w:ascii="Times New Roman" w:hAnsi="Times New Roman" w:cs="Times New Roman"/>
+          <w:lang w:val="en-US"/>
+        </w:rPr>
+      </w:pPr>
+      <w:r>
+        <w:rPr>
+          <w:rFonts w:ascii="Times New Roman" w:hAnsi="Times New Roman" w:cs="Times New Roman"/>
+          <w:noProof/>
+          <w:lang w:val="en-US"/>
+        </w:rPr>
+        <w:drawing>
+          <wp:inline distT="0" distB="0" distL="0" distR="0" wp14:anchorId="06FEBF3D" wp14:editId="75FB323E">
+            <wp:extent cx="5731510" cy="2910205"/>
+            <wp:effectExtent l="0" t="0" r="0" b="0"/>
+            <wp:docPr id="1869858423" name="Picture 5" descr="A screenshot of a computer&#10;&#10;AI-generated content may be incorrect."/>
+            <wp:cNvGraphicFramePr>
+              <a:graphicFrameLocks xmlns:a="http://schemas.openxmlformats.org/drawingml/2006/main" noChangeAspect="1"/>
+            </wp:cNvGraphicFramePr>
+            <a:graphic xmlns:a="http://schemas.openxmlformats.org/drawingml/2006/main">
+              <a:graphicData uri="http://schemas.openxmlformats.org/drawingml/2006/picture">
+                <pic:pic xmlns:pic="http://schemas.openxmlformats.org/drawingml/2006/picture">
+                  <pic:nvPicPr>
+                    <pic:cNvPr id="1869858423" name="Picture 5" descr="A screenshot of a computer&#10;&#10;AI-generated content may be incorrect."/>
+                    <pic:cNvPicPr/>
+                  </pic:nvPicPr>
+                  <pic:blipFill>
+                    <a:blip r:embed="rId9">
+                      <a:extLst>
+                        <a:ext uri="{28A0092B-C50C-407E-A947-70E740481C1C}">
+                          <a14:useLocalDpi xmlns:a14="http://schemas.microsoft.com/office/drawing/2010/main" val="0"/>
+                        </a:ext>
+                      </a:extLst>
+                    </a:blip>
+                    <a:stretch>
+                      <a:fillRect/>
+                    </a:stretch>
+                  </pic:blipFill>
+                  <pic:spPr>
+                    <a:xfrm>
+                      <a:off x="0" y="0"/>
+                      <a:ext cx="5731510" cy="2910205"/>
+                    </a:xfrm>
+                    <a:prstGeom prst="rect">
+                      <a:avLst/>
+                    </a:prstGeom>
+                  </pic:spPr>
+                </pic:pic>
+              </a:graphicData>
+            </a:graphic>
+          </wp:inline>
+        </w:drawing>
+      </w:r>
+    </w:p>
+    <w:p>
+      <w:pPr>
+        <w:ind w:left="360"/>
+        <w:rPr>
+          <w:rFonts w:ascii="Times New Roman" w:hAnsi="Times New Roman" w:cs="Times New Roman"/>
+          <w:b/>
+          <w:bCs/>
+          <w:lang w:val="en-US"/>
+        </w:rPr>
+      </w:pPr>
+    </w:p>
+    <w:p>
+      <w:pPr>
+        <w:pStyle w:val="ListParagraph"/>
+        <w:numPr>
+          <w:ilvl w:val="0"/>
+          <w:numId w:val="11"/>
+        </w:numPr>
+        <w:rPr>
+          <w:rFonts w:ascii="Times New Roman" w:hAnsi="Times New Roman" w:cs="Times New Roman"/>
+          <w:b/>
+          <w:bCs/>
+          <w:lang w:val="en-US"/>
+        </w:rPr>
+      </w:pPr>
+      <w:r>
+        <w:rPr>
+          <w:rFonts w:ascii="Times New Roman" w:hAnsi="Times New Roman" w:cs="Times New Roman"/>
+          <w:b/>
+          <w:bCs/>
+          <w:lang w:val="en-US"/>
+        </w:rPr>
+        <w:t>Interpolation</w:t>
+      </w:r>
+    </w:p>
+    <w:p>
+      <w:pPr>
+        <w:pStyle w:val="ListParagraph"/>
+        <w:rPr>
+          <w:rFonts w:ascii="Times New Roman" w:hAnsi="Times New Roman" w:cs="Times New Roman"/>
+          <w:lang w:val="en-US"/>
+        </w:rPr>
+      </w:pPr>
+      <w:r>
+        <w:rPr>
+          <w:rFonts w:ascii="Times New Roman" w:hAnsi="Times New Roman" w:cs="Times New Roman"/>
+          <w:lang w:val="en-US"/>
+        </w:rPr>
+        <w:t xml:space="preserve">This is the function of combining a series of </w:t>
+      </w:r>
+      <w:proofErr w:type="spellStart"/>
+      <w:r>
+        <w:rPr>
+          <w:rFonts w:ascii="Times New Roman" w:hAnsi="Times New Roman" w:cs="Times New Roman"/>
+          <w:lang w:val="en-US"/>
+        </w:rPr>
+        <w:t>gpr</w:t>
+      </w:r>
+      <w:proofErr w:type="spellEnd"/>
+      <w:r>
+        <w:rPr>
+          <w:rFonts w:ascii="Times New Roman" w:hAnsi="Times New Roman" w:cs="Times New Roman"/>
+          <w:lang w:val="en-US"/>
+        </w:rPr>
+        <w:t xml:space="preserve"> files and creating a 3D cube of the </w:t>
+      </w:r>
+      <w:proofErr w:type="gramStart"/>
+      <w:r>
+        <w:rPr>
+          <w:rFonts w:ascii="Times New Roman" w:hAnsi="Times New Roman" w:cs="Times New Roman"/>
+          <w:lang w:val="en-US"/>
+        </w:rPr>
+        <w:t>area, and</w:t>
+      </w:r>
+      <w:proofErr w:type="gramEnd"/>
+      <w:r>
+        <w:rPr>
+          <w:rFonts w:ascii="Times New Roman" w:hAnsi="Times New Roman" w:cs="Times New Roman"/>
+          <w:lang w:val="en-US"/>
+        </w:rPr>
+        <w:t xml:space="preserve"> is stored in the makeDataCube.py file. </w:t>
+      </w:r>
+      <w:proofErr w:type="gramStart"/>
+      <w:r>
+        <w:rPr>
+          <w:rFonts w:ascii="Times New Roman" w:hAnsi="Times New Roman" w:cs="Times New Roman"/>
+          <w:lang w:val="en-US"/>
+        </w:rPr>
+        <w:t>However</w:t>
+      </w:r>
+      <w:proofErr w:type="gramEnd"/>
+      <w:r>
+        <w:rPr>
+          <w:rFonts w:ascii="Times New Roman" w:hAnsi="Times New Roman" w:cs="Times New Roman"/>
+          <w:lang w:val="en-US"/>
+        </w:rPr>
+        <w:t xml:space="preserve"> this functionality is not integrated into the </w:t>
+      </w:r>
+      <w:proofErr w:type="spellStart"/>
+      <w:r>
+        <w:rPr>
+          <w:rFonts w:ascii="Times New Roman" w:hAnsi="Times New Roman" w:cs="Times New Roman"/>
+          <w:lang w:val="en-US"/>
+        </w:rPr>
+        <w:t>GPRpy</w:t>
+      </w:r>
+      <w:proofErr w:type="spellEnd"/>
+      <w:r>
+        <w:rPr>
+          <w:rFonts w:ascii="Times New Roman" w:hAnsi="Times New Roman" w:cs="Times New Roman"/>
+          <w:lang w:val="en-US"/>
+        </w:rPr>
+        <w:t xml:space="preserve"> program and requires additional scripting. On its own the program takes hours to complete, does not have a progress bar and has no way of stopping the process midway.</w:t>
+      </w:r>
+    </w:p>
+    <w:p>
+      <w:pPr>
+        <w:pStyle w:val="ListParagraph"/>
+        <w:rPr>
+          <w:rFonts w:ascii="Times New Roman" w:hAnsi="Times New Roman" w:cs="Times New Roman"/>
+          <w:lang w:val="en-US"/>
+        </w:rPr>
+      </w:pPr>
+    </w:p>
+    <w:p>
+      <w:pPr>
+        <w:pStyle w:val="ListParagraph"/>
+        <w:numPr>
+          <w:ilvl w:val="0"/>
+          <w:numId w:val="11"/>
+        </w:numPr>
+        <w:rPr>
+          <w:rFonts w:ascii="Times New Roman" w:hAnsi="Times New Roman" w:cs="Times New Roman"/>
+          <w:b/>
+          <w:bCs/>
+          <w:lang w:val="en-US"/>
+        </w:rPr>
+      </w:pPr>
+      <w:r>
+        <w:rPr>
+          <w:rFonts w:ascii="Times New Roman" w:hAnsi="Times New Roman" w:cs="Times New Roman"/>
+          <w:b/>
+          <w:bCs/>
+          <w:lang w:val="en-US"/>
+        </w:rPr>
+        <w:t>LiDAR correctio</w:t>
+      </w:r>
+      <w:r>
+        <w:rPr>
+          <w:rFonts w:ascii="Times New Roman" w:hAnsi="Times New Roman" w:cs="Times New Roman"/>
+          <w:b/>
+          <w:bCs/>
+          <w:lang w:val="en-US"/>
+        </w:rPr>
+        <w:t>n</w:t>
+      </w:r>
+    </w:p>
+    <w:p>
+      <w:pPr>
+        <w:ind w:left="720"/>
+        <w:rPr>
+          <w:rFonts w:ascii="Times New Roman" w:hAnsi="Times New Roman" w:cs="Times New Roman"/>
+          <w:lang w:val="en-US"/>
+        </w:rPr>
+      </w:pPr>
+      <w:r>
+        <w:rPr>
+          <w:rFonts w:ascii="Times New Roman" w:hAnsi="Times New Roman" w:cs="Times New Roman"/>
+          <w:lang w:val="en-US"/>
+        </w:rPr>
+        <w:t xml:space="preserve">Since GPR data does not account for elevation of terrain, finding accurate positions of unmarked graves becomes difficult. This results in extra being spent to locate them via excavations, which is not feasible for small scale non-profit organizations that are known to do work related to this area. By incorporating LiDAR images of the landform and adjusting the </w:t>
+      </w:r>
+      <w:proofErr w:type="spellStart"/>
+      <w:r>
+        <w:rPr>
+          <w:rFonts w:ascii="Times New Roman" w:hAnsi="Times New Roman" w:cs="Times New Roman"/>
+          <w:lang w:val="en-US"/>
+        </w:rPr>
+        <w:t>gpr</w:t>
+      </w:r>
+      <w:proofErr w:type="spellEnd"/>
+      <w:r>
+        <w:rPr>
+          <w:rFonts w:ascii="Times New Roman" w:hAnsi="Times New Roman" w:cs="Times New Roman"/>
+          <w:lang w:val="en-US"/>
+        </w:rPr>
+        <w:t xml:space="preserve"> data for elevation, the positions of these graves are more precise. There are paid software alternatives, but licenses for them cost large sums of money and is not within the purchasing power of organizations with poor funding. William proposed this project with the goal of creating an </w:t>
+      </w:r>
+      <w:proofErr w:type="gramStart"/>
+      <w:r>
+        <w:rPr>
+          <w:rFonts w:ascii="Times New Roman" w:hAnsi="Times New Roman" w:cs="Times New Roman"/>
+          <w:lang w:val="en-US"/>
+        </w:rPr>
+        <w:t>open source</w:t>
+      </w:r>
+      <w:proofErr w:type="gramEnd"/>
+      <w:r>
+        <w:rPr>
+          <w:rFonts w:ascii="Times New Roman" w:hAnsi="Times New Roman" w:cs="Times New Roman"/>
+          <w:lang w:val="en-US"/>
+        </w:rPr>
+        <w:t xml:space="preserve"> version that can be distributed for free amongst such organizations like the IPIA and help in the discovery of unmarked graves</w:t>
+      </w:r>
+    </w:p>
+    <w:p>
+      <w:pPr>
+        <w:ind w:left="720"/>
+        <w:rPr>
+          <w:rFonts w:ascii="Times New Roman" w:hAnsi="Times New Roman" w:cs="Times New Roman"/>
+          <w:lang w:val="en-US"/>
+        </w:rPr>
+      </w:pPr>
+    </w:p>
+    <w:p>
+      <w:pPr>
+        <w:rPr>
+          <w:rFonts w:ascii="Times New Roman" w:hAnsi="Times New Roman" w:cs="Times New Roman"/>
+          <w:b/>
+          <w:bCs/>
+          <w:sz w:val="32"/>
+          <w:szCs w:val="32"/>
+          <w:lang w:val="en-US"/>
+        </w:rPr>
+      </w:pPr>
+      <w:r>
+        <w:rPr>
+          <w:rFonts w:ascii="Times New Roman" w:hAnsi="Times New Roman" w:cs="Times New Roman"/>
+          <w:b/>
+          <w:bCs/>
+          <w:sz w:val="32"/>
+          <w:szCs w:val="32"/>
+          <w:lang w:val="en-US"/>
+        </w:rPr>
+        <w:lastRenderedPageBreak/>
+        <w:t xml:space="preserve">Goals </w:t>
+      </w:r>
+    </w:p>
+    <w:p>
+      <w:pPr>
+        <w:pStyle w:val="ListParagraph"/>
+        <w:numPr>
+          <w:ilvl w:val="0"/>
+          <w:numId w:val="12"/>
+        </w:numPr>
+        <w:rPr>
+          <w:rFonts w:ascii="Times New Roman" w:hAnsi="Times New Roman" w:cs="Times New Roman"/>
+          <w:b/>
+          <w:bCs/>
+          <w:lang w:val="en-US"/>
+        </w:rPr>
+      </w:pPr>
+      <w:r>
+        <w:rPr>
+          <w:rFonts w:ascii="Times New Roman" w:hAnsi="Times New Roman" w:cs="Times New Roman"/>
+          <w:b/>
+          <w:bCs/>
+          <w:lang w:val="en-US"/>
+        </w:rPr>
+        <w:t>Improve UI</w:t>
+      </w:r>
+    </w:p>
+    <w:p>
+      <w:pPr>
+        <w:pStyle w:val="ListParagraph"/>
+        <w:ind w:left="1080"/>
+        <w:rPr>
+          <w:rFonts w:ascii="Times New Roman" w:hAnsi="Times New Roman" w:cs="Times New Roman"/>
+          <w:lang w:val="en-US"/>
+        </w:rPr>
+      </w:pPr>
+      <w:r>
+        <w:rPr>
+          <w:rFonts w:ascii="Times New Roman" w:hAnsi="Times New Roman" w:cs="Times New Roman"/>
+          <w:lang w:val="en-US"/>
+        </w:rPr>
+        <w:t xml:space="preserve">Utilize modern UI libraries to give a modern and familiar look and feel to the program. Organize functions and elements to reduce clutter and increase the space available to display GPR data. It also allows user to create their own workflow. We will achieve this by grouping buttons by function type and placing them into separate tab groups. This permits users to pick and choose what changes aspect of the GPR data they will want to work with first. </w:t>
+      </w:r>
+    </w:p>
+    <w:p>
+      <w:pPr>
+        <w:rPr>
+          <w:rFonts w:ascii="Times New Roman" w:hAnsi="Times New Roman" w:cs="Times New Roman"/>
+          <w:lang w:val="en-US"/>
+        </w:rPr>
+      </w:pPr>
+    </w:p>
+    <w:p>
+      <w:pPr>
+        <w:pStyle w:val="ListParagraph"/>
+        <w:numPr>
+          <w:ilvl w:val="0"/>
+          <w:numId w:val="12"/>
+        </w:numPr>
+        <w:rPr>
+          <w:rFonts w:ascii="Times New Roman" w:hAnsi="Times New Roman" w:cs="Times New Roman"/>
+          <w:b/>
+          <w:bCs/>
+          <w:lang w:val="en-US"/>
+        </w:rPr>
+      </w:pPr>
+      <w:r>
+        <w:rPr>
+          <w:rFonts w:ascii="Times New Roman" w:hAnsi="Times New Roman" w:cs="Times New Roman"/>
+          <w:b/>
+          <w:bCs/>
+          <w:lang w:val="en-US"/>
+        </w:rPr>
+        <w:t>Faster Performance</w:t>
+      </w:r>
+    </w:p>
+    <w:p>
+      <w:pPr>
+        <w:pStyle w:val="ListParagraph"/>
+        <w:ind w:left="1080"/>
+        <w:rPr>
+          <w:rFonts w:ascii="Times New Roman" w:hAnsi="Times New Roman" w:cs="Times New Roman"/>
+          <w:lang w:val="en-US"/>
+        </w:rPr>
+      </w:pPr>
+      <w:r>
+        <w:rPr>
+          <w:rFonts w:ascii="Times New Roman" w:hAnsi="Times New Roman" w:cs="Times New Roman"/>
+          <w:lang w:val="en-US"/>
+        </w:rPr>
+        <w:t xml:space="preserve">The current processing times for the </w:t>
+      </w:r>
+      <w:proofErr w:type="spellStart"/>
+      <w:r>
+        <w:rPr>
+          <w:rFonts w:ascii="Times New Roman" w:hAnsi="Times New Roman" w:cs="Times New Roman"/>
+          <w:i/>
+          <w:iCs/>
+          <w:lang w:val="en-US"/>
+        </w:rPr>
+        <w:t>makeDataCube</w:t>
+      </w:r>
+      <w:proofErr w:type="spellEnd"/>
+      <w:r>
+        <w:rPr>
+          <w:rFonts w:ascii="Times New Roman" w:hAnsi="Times New Roman" w:cs="Times New Roman"/>
+          <w:lang w:val="en-US"/>
+        </w:rPr>
+        <w:t xml:space="preserve">, and batch processing functions takes hours or several minutes, respectively. This makes implementing changes in data parameters difficult, since errors are not apparent until the function is done. We hope to accomplish this by reworking the functions themselves either by using alternative methods to create the data cube or to implement threads. This will hopefully speed up the </w:t>
+      </w:r>
+      <w:proofErr w:type="gramStart"/>
+      <w:r>
+        <w:rPr>
+          <w:rFonts w:ascii="Times New Roman" w:hAnsi="Times New Roman" w:cs="Times New Roman"/>
+          <w:lang w:val="en-US"/>
+        </w:rPr>
+        <w:t>workflow  and</w:t>
+      </w:r>
+      <w:proofErr w:type="gramEnd"/>
+      <w:r>
+        <w:rPr>
+          <w:rFonts w:ascii="Times New Roman" w:hAnsi="Times New Roman" w:cs="Times New Roman"/>
+          <w:lang w:val="en-US"/>
+        </w:rPr>
+        <w:t xml:space="preserve"> permit faster iterations.</w:t>
+      </w:r>
+    </w:p>
+    <w:p>
+      <w:pPr>
+        <w:rPr>
+          <w:rFonts w:ascii="Times New Roman" w:hAnsi="Times New Roman" w:cs="Times New Roman"/>
+          <w:lang w:val="en-US"/>
+        </w:rPr>
+      </w:pPr>
+    </w:p>
+    <w:p>
+      <w:pPr>
+        <w:pStyle w:val="ListParagraph"/>
+        <w:numPr>
+          <w:ilvl w:val="0"/>
+          <w:numId w:val="12"/>
+        </w:numPr>
+        <w:rPr>
+          <w:rFonts w:ascii="Times New Roman" w:hAnsi="Times New Roman" w:cs="Times New Roman"/>
+          <w:b/>
+          <w:bCs/>
+          <w:lang w:val="en-US"/>
+        </w:rPr>
+      </w:pPr>
+      <w:r>
+        <w:rPr>
+          <w:rFonts w:ascii="Times New Roman" w:hAnsi="Times New Roman" w:cs="Times New Roman"/>
+          <w:b/>
+          <w:bCs/>
+          <w:lang w:val="en-US"/>
+        </w:rPr>
+        <w:t>3D manipulation</w:t>
+      </w:r>
+    </w:p>
+    <w:p>
+      <w:pPr>
+        <w:pStyle w:val="ListParagraph"/>
+        <w:ind w:left="1080"/>
+        <w:rPr>
+          <w:rFonts w:ascii="Times New Roman" w:hAnsi="Times New Roman" w:cs="Times New Roman"/>
+          <w:lang w:val="en-US"/>
+        </w:rPr>
+      </w:pPr>
+      <w:r>
+        <w:rPr>
+          <w:rFonts w:ascii="Times New Roman" w:hAnsi="Times New Roman" w:cs="Times New Roman"/>
+          <w:lang w:val="en-US"/>
+        </w:rPr>
+        <w:t xml:space="preserve">One of the main uses of the GPR data is to combine the collected data into a cube, via an interpolation function. This cube is then sliced, viewed in different modes to identify disturbances in the soil. However, this is only possible by using different software causing a </w:t>
+      </w:r>
+      <w:proofErr w:type="spellStart"/>
+      <w:r>
+        <w:rPr>
+          <w:rFonts w:ascii="Times New Roman" w:hAnsi="Times New Roman" w:cs="Times New Roman"/>
+          <w:lang w:val="en-US"/>
+        </w:rPr>
+        <w:t>slow down</w:t>
+      </w:r>
+      <w:proofErr w:type="spellEnd"/>
+      <w:r>
+        <w:rPr>
+          <w:rFonts w:ascii="Times New Roman" w:hAnsi="Times New Roman" w:cs="Times New Roman"/>
+          <w:lang w:val="en-US"/>
+        </w:rPr>
+        <w:t xml:space="preserve"> in the data extraction process due to the steep learning curve. By incorporating a </w:t>
+      </w:r>
+      <w:proofErr w:type="gramStart"/>
+      <w:r>
+        <w:rPr>
+          <w:rFonts w:ascii="Times New Roman" w:hAnsi="Times New Roman" w:cs="Times New Roman"/>
+          <w:lang w:val="en-US"/>
+        </w:rPr>
+        <w:t>stripped down</w:t>
+      </w:r>
+      <w:proofErr w:type="gramEnd"/>
+      <w:r>
+        <w:rPr>
+          <w:rFonts w:ascii="Times New Roman" w:hAnsi="Times New Roman" w:cs="Times New Roman"/>
+          <w:lang w:val="en-US"/>
+        </w:rPr>
+        <w:t xml:space="preserve"> version of a 3D visualization software, that includes only the functions necessary for this workflow, we can make the entire process much smoother for non-technical users. </w:t>
+      </w:r>
+    </w:p>
+    <w:p>
+      <w:pPr>
+        <w:rPr>
+          <w:rFonts w:ascii="Times New Roman" w:hAnsi="Times New Roman" w:cs="Times New Roman"/>
+          <w:lang w:val="en-US"/>
+        </w:rPr>
+      </w:pPr>
+    </w:p>
+    <w:p>
+      <w:pPr>
+        <w:pStyle w:val="ListParagraph"/>
+        <w:numPr>
+          <w:ilvl w:val="0"/>
+          <w:numId w:val="12"/>
+        </w:numPr>
+        <w:rPr>
+          <w:rFonts w:ascii="Times New Roman" w:hAnsi="Times New Roman" w:cs="Times New Roman"/>
+          <w:b/>
+          <w:bCs/>
+          <w:lang w:val="en-US"/>
+        </w:rPr>
+      </w:pPr>
+      <w:r>
+        <w:rPr>
+          <w:rFonts w:ascii="Times New Roman" w:hAnsi="Times New Roman" w:cs="Times New Roman"/>
+          <w:b/>
+          <w:bCs/>
+          <w:lang w:val="en-US"/>
+        </w:rPr>
+        <w:t>Elevation correction</w:t>
+      </w:r>
+    </w:p>
+    <w:p>
+      <w:pPr>
+        <w:pStyle w:val="ListParagraph"/>
+        <w:ind w:left="1080"/>
+        <w:rPr>
+          <w:rFonts w:ascii="Times New Roman" w:hAnsi="Times New Roman" w:cs="Times New Roman"/>
+          <w:lang w:val="en-US"/>
+        </w:rPr>
+      </w:pPr>
+      <w:r>
+        <w:rPr>
+          <w:rFonts w:ascii="Times New Roman" w:hAnsi="Times New Roman" w:cs="Times New Roman"/>
+          <w:lang w:val="en-US"/>
+        </w:rPr>
+        <w:t xml:space="preserve">One of the main challenges with GPR data is that elevation of the terrain is not measured. This makes accurately locating structures underground difficult. Elevation correction solutions do </w:t>
+      </w:r>
+      <w:proofErr w:type="gramStart"/>
+      <w:r>
+        <w:rPr>
+          <w:rFonts w:ascii="Times New Roman" w:hAnsi="Times New Roman" w:cs="Times New Roman"/>
+          <w:lang w:val="en-US"/>
+        </w:rPr>
+        <w:t>exist, but</w:t>
+      </w:r>
+      <w:proofErr w:type="gramEnd"/>
+      <w:r>
+        <w:rPr>
+          <w:rFonts w:ascii="Times New Roman" w:hAnsi="Times New Roman" w:cs="Times New Roman"/>
+          <w:lang w:val="en-US"/>
+        </w:rPr>
+        <w:t xml:space="preserve"> are locked behind paywall or paid licenses which is difficult for </w:t>
+      </w:r>
+      <w:proofErr w:type="spellStart"/>
+      <w:r>
+        <w:rPr>
+          <w:rFonts w:ascii="Times New Roman" w:hAnsi="Times New Roman" w:cs="Times New Roman"/>
+          <w:lang w:val="en-US"/>
+        </w:rPr>
+        <w:t>orgainzations</w:t>
+      </w:r>
+      <w:proofErr w:type="spellEnd"/>
+      <w:r>
+        <w:rPr>
+          <w:rFonts w:ascii="Times New Roman" w:hAnsi="Times New Roman" w:cs="Times New Roman"/>
+          <w:lang w:val="en-US"/>
+        </w:rPr>
+        <w:t xml:space="preserve"> will low funding to procure. We hope to identify an effective solution by using LiDAR imagery to help adjust the elevation. </w:t>
+      </w:r>
+    </w:p>
+    <w:p>
+      <w:pPr>
+        <w:rPr>
+          <w:rFonts w:ascii="Times New Roman" w:hAnsi="Times New Roman" w:cs="Times New Roman"/>
+          <w:b/>
+          <w:bCs/>
+          <w:lang w:val="en-US"/>
+        </w:rPr>
+      </w:pPr>
+    </w:p>
+    <w:p>
+      <w:pPr>
+        <w:rPr>
+          <w:rFonts w:ascii="Times New Roman" w:hAnsi="Times New Roman" w:cs="Times New Roman"/>
+          <w:b/>
+          <w:bCs/>
+          <w:lang w:val="en-US"/>
+        </w:rPr>
+      </w:pPr>
+    </w:p>
+    <w:p>
+      <w:pPr>
+        <w:rPr>
+          <w:rFonts w:ascii="Times New Roman" w:hAnsi="Times New Roman" w:cs="Times New Roman"/>
+          <w:b/>
+          <w:bCs/>
+          <w:lang w:val="en-US"/>
+        </w:rPr>
+      </w:pPr>
+    </w:p>
+    <w:p>
+      <w:pPr>
+        <w:pStyle w:val="ListParagraph"/>
+        <w:numPr>
+          <w:ilvl w:val="0"/>
+          <w:numId w:val="13"/>
+        </w:numPr>
+        <w:rPr>
+          <w:rFonts w:ascii="Times New Roman" w:hAnsi="Times New Roman" w:cs="Times New Roman"/>
+          <w:b/>
+          <w:bCs/>
+          <w:lang w:val="en-US"/>
+        </w:rPr>
+      </w:pPr>
+      <w:r>
+        <w:rPr>
+          <w:rFonts w:ascii="Times New Roman" w:hAnsi="Times New Roman" w:cs="Times New Roman"/>
+          <w:b/>
+          <w:bCs/>
+          <w:lang w:val="en-US"/>
+        </w:rPr>
+        <w:lastRenderedPageBreak/>
+        <w:t>Libraries</w:t>
+      </w:r>
+    </w:p>
+    <w:p>
+      <w:pPr>
+        <w:pStyle w:val="ListParagraph"/>
+        <w:rPr>
+          <w:rFonts w:ascii="Times New Roman" w:hAnsi="Times New Roman" w:cs="Times New Roman"/>
+          <w:b/>
+          <w:bCs/>
+          <w:lang w:val="en-US"/>
+        </w:rPr>
+      </w:pPr>
+    </w:p>
+    <w:p>
+      <w:pPr>
+        <w:pStyle w:val="ListParagraph"/>
+        <w:rPr>
+          <w:rFonts w:ascii="Times New Roman" w:hAnsi="Times New Roman" w:cs="Times New Roman"/>
+          <w:lang w:val="en-US"/>
+        </w:rPr>
+      </w:pPr>
+      <w:hyperlink r:id="rId10" w:history="1">
+        <w:r>
+          <w:rPr>
+            <w:rStyle w:val="Hyperlink"/>
+            <w:rFonts w:ascii="Times New Roman" w:hAnsi="Times New Roman" w:cs="Times New Roman"/>
+            <w:b/>
+            <w:bCs/>
+            <w:lang w:val="en-US"/>
+          </w:rPr>
+          <w:t>PyQT5</w:t>
+        </w:r>
+      </w:hyperlink>
+      <w:r>
+        <w:rPr>
+          <w:rFonts w:ascii="Times New Roman" w:hAnsi="Times New Roman" w:cs="Times New Roman"/>
+          <w:lang w:val="en-US"/>
+        </w:rPr>
+        <w:t xml:space="preserve"> will be the main library used to create the UI. This is a useful library that contains various GUI modules and many other modules such as support for rendering graphics using </w:t>
+      </w:r>
+      <w:proofErr w:type="spellStart"/>
+      <w:r>
+        <w:rPr>
+          <w:rFonts w:ascii="Times New Roman" w:hAnsi="Times New Roman" w:cs="Times New Roman"/>
+          <w:lang w:val="en-US"/>
+        </w:rPr>
+        <w:t>QtOpenGL</w:t>
+      </w:r>
+      <w:proofErr w:type="spellEnd"/>
+      <w:r>
+        <w:rPr>
+          <w:rFonts w:ascii="Times New Roman" w:hAnsi="Times New Roman" w:cs="Times New Roman"/>
+          <w:lang w:val="en-US"/>
+        </w:rPr>
+        <w:t xml:space="preserve">, database management using </w:t>
+      </w:r>
+      <w:proofErr w:type="spellStart"/>
+      <w:r>
+        <w:rPr>
+          <w:rFonts w:ascii="Times New Roman" w:hAnsi="Times New Roman" w:cs="Times New Roman"/>
+          <w:lang w:val="en-US"/>
+        </w:rPr>
+        <w:t>QtSql</w:t>
+      </w:r>
+      <w:proofErr w:type="spellEnd"/>
+      <w:r>
+        <w:rPr>
+          <w:rFonts w:ascii="Times New Roman" w:hAnsi="Times New Roman" w:cs="Times New Roman"/>
+          <w:lang w:val="en-US"/>
+        </w:rPr>
+        <w:t xml:space="preserve"> and working with xml files with </w:t>
+      </w:r>
+      <w:proofErr w:type="spellStart"/>
+      <w:r>
+        <w:rPr>
+          <w:rFonts w:ascii="Times New Roman" w:hAnsi="Times New Roman" w:cs="Times New Roman"/>
+          <w:lang w:val="en-US"/>
+        </w:rPr>
+        <w:t>QtXml</w:t>
+      </w:r>
+      <w:proofErr w:type="spellEnd"/>
+      <w:r>
+        <w:rPr>
+          <w:rFonts w:ascii="Times New Roman" w:hAnsi="Times New Roman" w:cs="Times New Roman"/>
+          <w:lang w:val="en-US"/>
+        </w:rPr>
+        <w:t xml:space="preserve"> just to name a few</w:t>
+      </w:r>
+    </w:p>
+    <w:p>
+      <w:pPr>
+        <w:pStyle w:val="ListParagraph"/>
+        <w:rPr>
+          <w:rFonts w:ascii="Times New Roman" w:hAnsi="Times New Roman" w:cs="Times New Roman"/>
+          <w:lang w:val="en-US"/>
+        </w:rPr>
+      </w:pPr>
+    </w:p>
+    <w:p>
+      <w:pPr>
+        <w:pStyle w:val="ListParagraph"/>
+        <w:rPr>
+          <w:rFonts w:ascii="Times New Roman" w:hAnsi="Times New Roman" w:cs="Times New Roman"/>
+          <w:lang w:val="en-US"/>
+        </w:rPr>
+      </w:pPr>
+      <w:r>
+        <w:rPr>
+          <w:rFonts w:ascii="Times New Roman" w:hAnsi="Times New Roman" w:cs="Times New Roman"/>
+          <w:lang w:val="en-US"/>
+        </w:rPr>
+        <w:t xml:space="preserve">This program will employ a Model View Controller (MVC) architecture to structure the code. </w:t>
+      </w:r>
+    </w:p>
+    <w:p>
+      <w:pPr>
+        <w:pStyle w:val="ListParagraph"/>
+        <w:rPr>
+          <w:rFonts w:ascii="Times New Roman" w:hAnsi="Times New Roman" w:cs="Times New Roman"/>
+          <w:lang w:val="en-US"/>
+        </w:rPr>
+      </w:pPr>
+    </w:p>
+    <w:p>
+      <w:pPr>
+        <w:pStyle w:val="ListParagraph"/>
+        <w:rPr>
+          <w:rFonts w:ascii="Times New Roman" w:hAnsi="Times New Roman" w:cs="Times New Roman"/>
+          <w:lang w:val="en-US"/>
+        </w:rPr>
+      </w:pPr>
+      <w:hyperlink r:id="rId11" w:history="1">
+        <w:proofErr w:type="spellStart"/>
+        <w:r>
+          <w:rPr>
+            <w:rStyle w:val="Hyperlink"/>
+            <w:rFonts w:ascii="Times New Roman" w:hAnsi="Times New Roman" w:cs="Times New Roman"/>
+            <w:lang w:val="en-US"/>
+          </w:rPr>
+          <w:t>WhiteBoxTools</w:t>
+        </w:r>
+        <w:proofErr w:type="spellEnd"/>
+      </w:hyperlink>
+      <w:r>
+        <w:rPr>
+          <w:rFonts w:ascii="Times New Roman" w:hAnsi="Times New Roman" w:cs="Times New Roman"/>
+          <w:lang w:val="en-US"/>
+        </w:rPr>
+        <w:t xml:space="preserve"> will be the library used to help with LiDAR visualization and manipulation</w:t>
       </w:r>
     </w:p>
     <w:p>
@@ -2142,6 +4078,95 @@
 <file path=word/numbering.xml><?xml version="1.0" encoding="utf-8"?>
 <w:numbering xmlns:wpc="http://schemas.microsoft.com/office/word/2010/wordprocessingCanvas" xmlns:cx="http://schemas.microsoft.com/office/drawing/2014/chartex" xmlns:cx1="http://schemas.microsoft.com/office/drawing/2015/9/8/chartex" xmlns:cx2="http://schemas.microsoft.com/office/drawing/2015/10/21/chartex" xmlns:cx3="http://schemas.microsoft.com/office/drawing/2016/5/9/chartex" xmlns:cx4="http://schemas.microsoft.com/office/drawing/2016/5/10/chartex" xmlns:cx5="http://schemas.microsoft.com/office/drawing/2016/5/11/chartex" xmlns:cx6="http://schemas.microsoft.com/office/drawing/2016/5/12/chartex" xmlns:cx7="http://schemas.microsoft.com/office/drawing/2016/5/13/chartex" xmlns:cx8="http://schemas.microsoft.com/office/drawing/2016/5/14/chartex" xmlns:mc="http://schemas.openxmlformats.org/markup-compatibility/2006" xmlns:aink="http://schemas.microsoft.com/office/drawing/2016/ink" xmlns:am3d="http://schemas.microsoft.com/office/drawing/2017/model3d" xmlns:o="urn:schemas-microsoft-com:office:office" xmlns:oel="http://schemas.microsoft.com/office/2019/extlst" xmlns:r="http://schemas.openxmlformats.org/officeDocument/2006/relationships" xmlns:m="http://schemas.openxmlformats.org/officeDocument/2006/math" xmlns:v="urn:schemas-microsoft-com:vml" xmlns:wp14="http://schemas.microsoft.com/office/word/2010/wordprocessingDrawing" xmlns:wp="http://schemas.openxmlformats.org/drawingml/2006/wordprocessingDrawing" xmlns:w10="urn:schemas-microsoft-com:office:word" xmlns:w="http://schemas.openxmlformats.org/wordprocessingml/2006/main" xmlns:w14="http://schemas.microsoft.com/office/word/2010/wordml" xmlns:w15="http://schemas.microsoft.com/office/word/2012/wordml" xmlns:w16cex="http://schemas.microsoft.com/office/word/2018/wordml/cex" xmlns:w16cid="http://schemas.microsoft.com/office/word/2016/wordml/cid" xmlns:w16="http://schemas.microsoft.com/office/word/2018/wordml" xmlns:w16du="http://schemas.microsoft.com/office/word/2023/wordml/word16du" xmlns:w16sdtdh="http://schemas.microsoft.com/office/word/2020/wordml/sdtdatahash" xmlns:w16sdtfl="http://schemas.microsoft.com/office/word/2024/wordml/sdtformatlock" xmlns:w16se="http://schemas.microsoft.com/office/word/2015/wordml/symex" xmlns:wpg="http://schemas.microsoft.com/office/word/2010/wordprocessingGroup" xmlns:wpi="http://schemas.microsoft.com/office/word/2010/wordprocessingInk" xmlns:wne="http://schemas.microsoft.com/office/word/2006/wordml" xmlns:wps="http://schemas.microsoft.com/office/word/2010/wordprocessingShape" mc:Ignorable="w14 w15 w16se w16cid w16 w16cex w16sdtdh w16sdtfl w16du wp14">
   <w:abstractNum w:abstractNumId="0" w15:restartNumberingAfterBreak="0">
+    <w:nsid w:val="08A021B0"/>
+    <w:multiLevelType w:val="hybridMultilevel"/>
+    <w:tmpl w:val="164221EE"/>
+    <w:lvl w:ilvl="0" w:tplc="08090011">
+      <w:start w:val="1"/>
+      <w:numFmt w:val="decimal"/>
+      <w:lvlText w:val="%1)"/>
+      <w:lvlJc w:val="left"/>
+      <w:pPr>
+        <w:ind w:left="720" w:hanging="360"/>
+      </w:pPr>
+      <w:rPr>
+        <w:rFonts w:hint="default"/>
+      </w:rPr>
+    </w:lvl>
+    <w:lvl w:ilvl="1" w:tplc="08090019" w:tentative="1">
+      <w:start w:val="1"/>
+      <w:numFmt w:val="lowerLetter"/>
+      <w:lvlText w:val="%2."/>
+      <w:lvlJc w:val="left"/>
+      <w:pPr>
+        <w:ind w:left="1440" w:hanging="360"/>
+      </w:pPr>
+    </w:lvl>
+    <w:lvl w:ilvl="2" w:tplc="0809001B" w:tentative="1">
+      <w:start w:val="1"/>
+      <w:numFmt w:val="lowerRoman"/>
+      <w:lvlText w:val="%3."/>
+      <w:lvlJc w:val="right"/>
+      <w:pPr>
+        <w:ind w:left="2160" w:hanging="180"/>
+      </w:pPr>
+    </w:lvl>
+    <w:lvl w:ilvl="3" w:tplc="0809000F" w:tentative="1">
+      <w:start w:val="1"/>
+      <w:numFmt w:val="decimal"/>
+      <w:lvlText w:val="%4."/>
+      <w:lvlJc w:val="left"/>
+      <w:pPr>
+        <w:ind w:left="2880" w:hanging="360"/>
+      </w:pPr>
+    </w:lvl>
+    <w:lvl w:ilvl="4" w:tplc="08090019" w:tentative="1">
+      <w:start w:val="1"/>
+      <w:numFmt w:val="lowerLetter"/>
+      <w:lvlText w:val="%5."/>
+      <w:lvlJc w:val="left"/>
+      <w:pPr>
+        <w:ind w:left="3600" w:hanging="360"/>
+      </w:pPr>
+    </w:lvl>
+    <w:lvl w:ilvl="5" w:tplc="0809001B" w:tentative="1">
+      <w:start w:val="1"/>
+      <w:numFmt w:val="lowerRoman"/>
+      <w:lvlText w:val="%6."/>
+      <w:lvlJc w:val="right"/>
+      <w:pPr>
+        <w:ind w:left="4320" w:hanging="180"/>
+      </w:pPr>
+    </w:lvl>
+    <w:lvl w:ilvl="6" w:tplc="0809000F" w:tentative="1">
+      <w:start w:val="1"/>
+      <w:numFmt w:val="decimal"/>
+      <w:lvlText w:val="%7."/>
+      <w:lvlJc w:val="left"/>
+      <w:pPr>
+        <w:ind w:left="5040" w:hanging="360"/>
+      </w:pPr>
+    </w:lvl>
+    <w:lvl w:ilvl="7" w:tplc="08090019" w:tentative="1">
+      <w:start w:val="1"/>
+      <w:numFmt w:val="lowerLetter"/>
+      <w:lvlText w:val="%8."/>
+      <w:lvlJc w:val="left"/>
+      <w:pPr>
+        <w:ind w:left="5760" w:hanging="360"/>
+      </w:pPr>
+    </w:lvl>
+    <w:lvl w:ilvl="8" w:tplc="0809001B" w:tentative="1">
+      <w:start w:val="1"/>
+      <w:numFmt w:val="lowerRoman"/>
+      <w:lvlText w:val="%9."/>
+      <w:lvlJc w:val="right"/>
+      <w:pPr>
+        <w:ind w:left="6480" w:hanging="180"/>
+      </w:pPr>
+    </w:lvl>
+  </w:abstractNum>
+  <w:abstractNum w:abstractNumId="1" w15:restartNumberingAfterBreak="0">
     <w:nsid w:val="08BF25B2"/>
     <w:multiLevelType w:val="hybridMultilevel"/>
     <w:tmpl w:val="42341D0A"/>
@@ -2230,7 +4255,7 @@
       </w:pPr>
     </w:lvl>
   </w:abstractNum>
-  <w:abstractNum w:abstractNumId="1" w15:restartNumberingAfterBreak="0">
+  <w:abstractNum w:abstractNumId="2" w15:restartNumberingAfterBreak="0">
     <w:nsid w:val="0DD55FE7"/>
     <w:multiLevelType w:val="hybridMultilevel"/>
     <w:tmpl w:val="DFA8CA9C"/>
@@ -2321,7 +4346,185 @@
       </w:pPr>
     </w:lvl>
   </w:abstractNum>
-  <w:abstractNum w:abstractNumId="2" w15:restartNumberingAfterBreak="0">
+  <w:abstractNum w:abstractNumId="3" w15:restartNumberingAfterBreak="0">
+    <w:nsid w:val="10123529"/>
+    <w:multiLevelType w:val="hybridMultilevel"/>
+    <w:tmpl w:val="8F6A7B46"/>
+    <w:lvl w:ilvl="0" w:tplc="03620A3A">
+      <w:start w:val="1"/>
+      <w:numFmt w:val="decimal"/>
+      <w:lvlText w:val="%1)"/>
+      <w:lvlJc w:val="left"/>
+      <w:pPr>
+        <w:ind w:left="1080" w:hanging="360"/>
+      </w:pPr>
+      <w:rPr>
+        <w:rFonts w:hint="default"/>
+      </w:rPr>
+    </w:lvl>
+    <w:lvl w:ilvl="1" w:tplc="08090019" w:tentative="1">
+      <w:start w:val="1"/>
+      <w:numFmt w:val="lowerLetter"/>
+      <w:lvlText w:val="%2."/>
+      <w:lvlJc w:val="left"/>
+      <w:pPr>
+        <w:ind w:left="1800" w:hanging="360"/>
+      </w:pPr>
+    </w:lvl>
+    <w:lvl w:ilvl="2" w:tplc="0809001B" w:tentative="1">
+      <w:start w:val="1"/>
+      <w:numFmt w:val="lowerRoman"/>
+      <w:lvlText w:val="%3."/>
+      <w:lvlJc w:val="right"/>
+      <w:pPr>
+        <w:ind w:left="2520" w:hanging="180"/>
+      </w:pPr>
+    </w:lvl>
+    <w:lvl w:ilvl="3" w:tplc="0809000F" w:tentative="1">
+      <w:start w:val="1"/>
+      <w:numFmt w:val="decimal"/>
+      <w:lvlText w:val="%4."/>
+      <w:lvlJc w:val="left"/>
+      <w:pPr>
+        <w:ind w:left="3240" w:hanging="360"/>
+      </w:pPr>
+    </w:lvl>
+    <w:lvl w:ilvl="4" w:tplc="08090019" w:tentative="1">
+      <w:start w:val="1"/>
+      <w:numFmt w:val="lowerLetter"/>
+      <w:lvlText w:val="%5."/>
+      <w:lvlJc w:val="left"/>
+      <w:pPr>
+        <w:ind w:left="3960" w:hanging="360"/>
+      </w:pPr>
+    </w:lvl>
+    <w:lvl w:ilvl="5" w:tplc="0809001B" w:tentative="1">
+      <w:start w:val="1"/>
+      <w:numFmt w:val="lowerRoman"/>
+      <w:lvlText w:val="%6."/>
+      <w:lvlJc w:val="right"/>
+      <w:pPr>
+        <w:ind w:left="4680" w:hanging="180"/>
+      </w:pPr>
+    </w:lvl>
+    <w:lvl w:ilvl="6" w:tplc="0809000F" w:tentative="1">
+      <w:start w:val="1"/>
+      <w:numFmt w:val="decimal"/>
+      <w:lvlText w:val="%7."/>
+      <w:lvlJc w:val="left"/>
+      <w:pPr>
+        <w:ind w:left="5400" w:hanging="360"/>
+      </w:pPr>
+    </w:lvl>
+    <w:lvl w:ilvl="7" w:tplc="08090019" w:tentative="1">
+      <w:start w:val="1"/>
+      <w:numFmt w:val="lowerLetter"/>
+      <w:lvlText w:val="%8."/>
+      <w:lvlJc w:val="left"/>
+      <w:pPr>
+        <w:ind w:left="6120" w:hanging="360"/>
+      </w:pPr>
+    </w:lvl>
+    <w:lvl w:ilvl="8" w:tplc="0809001B" w:tentative="1">
+      <w:start w:val="1"/>
+      <w:numFmt w:val="lowerRoman"/>
+      <w:lvlText w:val="%9."/>
+      <w:lvlJc w:val="right"/>
+      <w:pPr>
+        <w:ind w:left="6840" w:hanging="180"/>
+      </w:pPr>
+    </w:lvl>
+  </w:abstractNum>
+  <w:abstractNum w:abstractNumId="4" w15:restartNumberingAfterBreak="0">
+    <w:nsid w:val="1847208B"/>
+    <w:multiLevelType w:val="hybridMultilevel"/>
+    <w:tmpl w:val="C4AA41D4"/>
+    <w:lvl w:ilvl="0" w:tplc="08090015">
+      <w:start w:val="1"/>
+      <w:numFmt w:val="upperLetter"/>
+      <w:lvlText w:val="%1."/>
+      <w:lvlJc w:val="left"/>
+      <w:pPr>
+        <w:ind w:left="720" w:hanging="360"/>
+      </w:pPr>
+      <w:rPr>
+        <w:rFonts w:hint="default"/>
+      </w:rPr>
+    </w:lvl>
+    <w:lvl w:ilvl="1" w:tplc="08090019" w:tentative="1">
+      <w:start w:val="1"/>
+      <w:numFmt w:val="lowerLetter"/>
+      <w:lvlText w:val="%2."/>
+      <w:lvlJc w:val="left"/>
+      <w:pPr>
+        <w:ind w:left="1440" w:hanging="360"/>
+      </w:pPr>
+    </w:lvl>
+    <w:lvl w:ilvl="2" w:tplc="0809001B" w:tentative="1">
+      <w:start w:val="1"/>
+      <w:numFmt w:val="lowerRoman"/>
+      <w:lvlText w:val="%3."/>
+      <w:lvlJc w:val="right"/>
+      <w:pPr>
+        <w:ind w:left="2160" w:hanging="180"/>
+      </w:pPr>
+    </w:lvl>
+    <w:lvl w:ilvl="3" w:tplc="0809000F" w:tentative="1">
+      <w:start w:val="1"/>
+      <w:numFmt w:val="decimal"/>
+      <w:lvlText w:val="%4."/>
+      <w:lvlJc w:val="left"/>
+      <w:pPr>
+        <w:ind w:left="2880" w:hanging="360"/>
+      </w:pPr>
+    </w:lvl>
+    <w:lvl w:ilvl="4" w:tplc="08090019" w:tentative="1">
+      <w:start w:val="1"/>
+      <w:numFmt w:val="lowerLetter"/>
+      <w:lvlText w:val="%5."/>
+      <w:lvlJc w:val="left"/>
+      <w:pPr>
+        <w:ind w:left="3600" w:hanging="360"/>
+      </w:pPr>
+    </w:lvl>
+    <w:lvl w:ilvl="5" w:tplc="0809001B" w:tentative="1">
+      <w:start w:val="1"/>
+      <w:numFmt w:val="lowerRoman"/>
+      <w:lvlText w:val="%6."/>
+      <w:lvlJc w:val="right"/>
+      <w:pPr>
+        <w:ind w:left="4320" w:hanging="180"/>
+      </w:pPr>
+    </w:lvl>
+    <w:lvl w:ilvl="6" w:tplc="0809000F" w:tentative="1">
+      <w:start w:val="1"/>
+      <w:numFmt w:val="decimal"/>
+      <w:lvlText w:val="%7."/>
+      <w:lvlJc w:val="left"/>
+      <w:pPr>
+        <w:ind w:left="5040" w:hanging="360"/>
+      </w:pPr>
+    </w:lvl>
+    <w:lvl w:ilvl="7" w:tplc="08090019" w:tentative="1">
+      <w:start w:val="1"/>
+      <w:numFmt w:val="lowerLetter"/>
+      <w:lvlText w:val="%8."/>
+      <w:lvlJc w:val="left"/>
+      <w:pPr>
+        <w:ind w:left="5760" w:hanging="360"/>
+      </w:pPr>
+    </w:lvl>
+    <w:lvl w:ilvl="8" w:tplc="0809001B" w:tentative="1">
+      <w:start w:val="1"/>
+      <w:numFmt w:val="lowerRoman"/>
+      <w:lvlText w:val="%9."/>
+      <w:lvlJc w:val="right"/>
+      <w:pPr>
+        <w:ind w:left="6480" w:hanging="180"/>
+      </w:pPr>
+    </w:lvl>
+  </w:abstractNum>
+  <w:abstractNum w:abstractNumId="5" w15:restartNumberingAfterBreak="0">
     <w:nsid w:val="283C4B13"/>
     <w:multiLevelType w:val="hybridMultilevel"/>
     <w:tmpl w:val="42341D0A"/>
@@ -2410,7 +4613,7 @@
       </w:pPr>
     </w:lvl>
   </w:abstractNum>
-  <w:abstractNum w:abstractNumId="3" w15:restartNumberingAfterBreak="0">
+  <w:abstractNum w:abstractNumId="6" w15:restartNumberingAfterBreak="0">
     <w:nsid w:val="2B134009"/>
     <w:multiLevelType w:val="hybridMultilevel"/>
     <w:tmpl w:val="449C685C"/>
@@ -2499,7 +4702,7 @@
       </w:pPr>
     </w:lvl>
   </w:abstractNum>
-  <w:abstractNum w:abstractNumId="4" w15:restartNumberingAfterBreak="0">
+  <w:abstractNum w:abstractNumId="7" w15:restartNumberingAfterBreak="0">
     <w:nsid w:val="36535AB5"/>
     <w:multiLevelType w:val="hybridMultilevel"/>
     <w:tmpl w:val="A7108D42"/>
@@ -2592,7 +4795,7 @@
       </w:pPr>
     </w:lvl>
   </w:abstractNum>
-  <w:abstractNum w:abstractNumId="5" w15:restartNumberingAfterBreak="0">
+  <w:abstractNum w:abstractNumId="8" w15:restartNumberingAfterBreak="0">
     <w:nsid w:val="439620E4"/>
     <w:multiLevelType w:val="hybridMultilevel"/>
     <w:tmpl w:val="42341D0A"/>
@@ -2681,7 +4884,7 @@
       </w:pPr>
     </w:lvl>
   </w:abstractNum>
-  <w:abstractNum w:abstractNumId="6" w15:restartNumberingAfterBreak="0">
+  <w:abstractNum w:abstractNumId="9" w15:restartNumberingAfterBreak="0">
     <w:nsid w:val="51765F55"/>
     <w:multiLevelType w:val="hybridMultilevel"/>
     <w:tmpl w:val="99E6B776"/>
@@ -2772,7 +4975,7 @@
       </w:pPr>
     </w:lvl>
   </w:abstractNum>
-  <w:abstractNum w:abstractNumId="7" w15:restartNumberingAfterBreak="0">
+  <w:abstractNum w:abstractNumId="10" w15:restartNumberingAfterBreak="0">
     <w:nsid w:val="696B7F60"/>
     <w:multiLevelType w:val="hybridMultilevel"/>
     <w:tmpl w:val="AD6A2826"/>
@@ -2861,7 +5064,96 @@
       </w:pPr>
     </w:lvl>
   </w:abstractNum>
-  <w:abstractNum w:abstractNumId="8" w15:restartNumberingAfterBreak="0">
+  <w:abstractNum w:abstractNumId="11" w15:restartNumberingAfterBreak="0">
+    <w:nsid w:val="740E0BE0"/>
+    <w:multiLevelType w:val="hybridMultilevel"/>
+    <w:tmpl w:val="F104DA8A"/>
+    <w:lvl w:ilvl="0" w:tplc="08090011">
+      <w:start w:val="1"/>
+      <w:numFmt w:val="decimal"/>
+      <w:lvlText w:val="%1)"/>
+      <w:lvlJc w:val="left"/>
+      <w:pPr>
+        <w:ind w:left="720" w:hanging="360"/>
+      </w:pPr>
+      <w:rPr>
+        <w:rFonts w:hint="default"/>
+      </w:rPr>
+    </w:lvl>
+    <w:lvl w:ilvl="1" w:tplc="08090019">
+      <w:start w:val="1"/>
+      <w:numFmt w:val="lowerLetter"/>
+      <w:lvlText w:val="%2."/>
+      <w:lvlJc w:val="left"/>
+      <w:pPr>
+        <w:ind w:left="1440" w:hanging="360"/>
+      </w:pPr>
+    </w:lvl>
+    <w:lvl w:ilvl="2" w:tplc="0809001B" w:tentative="1">
+      <w:start w:val="1"/>
+      <w:numFmt w:val="lowerRoman"/>
+      <w:lvlText w:val="%3."/>
+      <w:lvlJc w:val="right"/>
+      <w:pPr>
+        <w:ind w:left="2160" w:hanging="180"/>
+      </w:pPr>
+    </w:lvl>
+    <w:lvl w:ilvl="3" w:tplc="0809000F" w:tentative="1">
+      <w:start w:val="1"/>
+      <w:numFmt w:val="decimal"/>
+      <w:lvlText w:val="%4."/>
+      <w:lvlJc w:val="left"/>
+      <w:pPr>
+        <w:ind w:left="2880" w:hanging="360"/>
+      </w:pPr>
+    </w:lvl>
+    <w:lvl w:ilvl="4" w:tplc="08090019" w:tentative="1">
+      <w:start w:val="1"/>
+      <w:numFmt w:val="lowerLetter"/>
+      <w:lvlText w:val="%5."/>
+      <w:lvlJc w:val="left"/>
+      <w:pPr>
+        <w:ind w:left="3600" w:hanging="360"/>
+      </w:pPr>
+    </w:lvl>
+    <w:lvl w:ilvl="5" w:tplc="0809001B" w:tentative="1">
+      <w:start w:val="1"/>
+      <w:numFmt w:val="lowerRoman"/>
+      <w:lvlText w:val="%6."/>
+      <w:lvlJc w:val="right"/>
+      <w:pPr>
+        <w:ind w:left="4320" w:hanging="180"/>
+      </w:pPr>
+    </w:lvl>
+    <w:lvl w:ilvl="6" w:tplc="0809000F" w:tentative="1">
+      <w:start w:val="1"/>
+      <w:numFmt w:val="decimal"/>
+      <w:lvlText w:val="%7."/>
+      <w:lvlJc w:val="left"/>
+      <w:pPr>
+        <w:ind w:left="5040" w:hanging="360"/>
+      </w:pPr>
+    </w:lvl>
+    <w:lvl w:ilvl="7" w:tplc="08090019" w:tentative="1">
+      <w:start w:val="1"/>
+      <w:numFmt w:val="lowerLetter"/>
+      <w:lvlText w:val="%8."/>
+      <w:lvlJc w:val="left"/>
+      <w:pPr>
+        <w:ind w:left="5760" w:hanging="360"/>
+      </w:pPr>
+    </w:lvl>
+    <w:lvl w:ilvl="8" w:tplc="0809001B" w:tentative="1">
+      <w:start w:val="1"/>
+      <w:numFmt w:val="lowerRoman"/>
+      <w:lvlText w:val="%9."/>
+      <w:lvlJc w:val="right"/>
+      <w:pPr>
+        <w:ind w:left="6480" w:hanging="180"/>
+      </w:pPr>
+    </w:lvl>
+  </w:abstractNum>
+  <w:abstractNum w:abstractNumId="12" w15:restartNumberingAfterBreak="0">
     <w:nsid w:val="7C866A32"/>
     <w:multiLevelType w:val="hybridMultilevel"/>
     <w:tmpl w:val="42341D0A"/>
@@ -2951,31 +5243,43 @@
     </w:lvl>
   </w:abstractNum>
   <w:num w:numId="1" w16cid:durableId="1730036337">
+    <w:abstractNumId w:val="6"/>
+  </w:num>
+  <w:num w:numId="2" w16cid:durableId="741178958">
+    <w:abstractNumId w:val="10"/>
+  </w:num>
+  <w:num w:numId="3" w16cid:durableId="494226674">
+    <w:abstractNumId w:val="1"/>
+  </w:num>
+  <w:num w:numId="4" w16cid:durableId="380324371">
+    <w:abstractNumId w:val="7"/>
+  </w:num>
+  <w:num w:numId="5" w16cid:durableId="2096584282">
+    <w:abstractNumId w:val="8"/>
+  </w:num>
+  <w:num w:numId="6" w16cid:durableId="1858687752">
+    <w:abstractNumId w:val="5"/>
+  </w:num>
+  <w:num w:numId="7" w16cid:durableId="1255746879">
+    <w:abstractNumId w:val="12"/>
+  </w:num>
+  <w:num w:numId="8" w16cid:durableId="1753576511">
+    <w:abstractNumId w:val="2"/>
+  </w:num>
+  <w:num w:numId="9" w16cid:durableId="105277600">
+    <w:abstractNumId w:val="9"/>
+  </w:num>
+  <w:num w:numId="10" w16cid:durableId="1319265623">
+    <w:abstractNumId w:val="11"/>
+  </w:num>
+  <w:num w:numId="11" w16cid:durableId="1133017783">
+    <w:abstractNumId w:val="0"/>
+  </w:num>
+  <w:num w:numId="12" w16cid:durableId="1712193578">
     <w:abstractNumId w:val="3"/>
   </w:num>
-  <w:num w:numId="2" w16cid:durableId="741178958">
-    <w:abstractNumId w:val="7"/>
-  </w:num>
-  <w:num w:numId="3" w16cid:durableId="494226674">
-    <w:abstractNumId w:val="0"/>
-  </w:num>
-  <w:num w:numId="4" w16cid:durableId="380324371">
+  <w:num w:numId="13" w16cid:durableId="322587771">
     <w:abstractNumId w:val="4"/>
-  </w:num>
-  <w:num w:numId="5" w16cid:durableId="2096584282">
-    <w:abstractNumId w:val="5"/>
-  </w:num>
-  <w:num w:numId="6" w16cid:durableId="1858687752">
-    <w:abstractNumId w:val="2"/>
-  </w:num>
-  <w:num w:numId="7" w16cid:durableId="1255746879">
-    <w:abstractNumId w:val="8"/>
-  </w:num>
-  <w:num w:numId="8" w16cid:durableId="1753576511">
-    <w:abstractNumId w:val="1"/>
-  </w:num>
-  <w:num w:numId="9" w16cid:durableId="105277600">
-    <w:abstractNumId w:val="6"/>
   </w:num>
 </w:numbering>
 </file>
@@ -3897,6 +6201,17 @@
       <w:spacing w:val="5"/>
     </w:rPr>
   </w:style>
+  <w:style w:type="character" w:styleId="Hyperlink">
+    <w:name w:val="Hyperlink"/>
+    <w:basedOn w:val="DefaultParagraphFont"/>
+    <w:uiPriority w:val="99"/>
+    <w:unhideWhenUsed/>
+    <w:rsid w:val="005F41BB"/>
+    <w:rPr>
+      <w:color w:val="467886" w:themeColor="hyperlink"/>
+      <w:u w:val="single"/>
+    </w:rPr>
+  </w:style>
 </w:styles>
 </file>
 

</xml_diff>

<commit_message>
Broke down user epics into smaller stories
</commit_message>
<xml_diff>
--- a/Project Plan/UserStories.docx
+++ b/Project Plan/UserStories.docx
@@ -37,6 +37,17 @@
           <w:lang w:val="en-US"/>
         </w:rPr>
       </w:pPr>
+      <w:r>
+        <w:rPr>
+          <w:rFonts w:ascii="Times New Roman" w:hAnsi="Times New Roman" w:cs="Times New Roman"/>
+          <w:b/>
+          <w:bCs/>
+          <w:sz w:val="36"/>
+          <w:szCs w:val="36"/>
+          <w:lang w:val="en-US"/>
+        </w:rPr>
+        <w:t>EPIC #1:</w:t>
+      </w:r>
     </w:p>
     <w:p>
       <w:pPr>
@@ -184,18 +195,25 @@
     </w:p>
     <w:p>
       <w:pPr>
-        <w:pStyle w:val="ListParagraph"/>
-        <w:numPr>
-          <w:ilvl w:val="0"/>
-          <w:numId w:val="3"/>
-        </w:numPr>
-        <w:rPr>
-          <w:rFonts w:ascii="Times New Roman" w:hAnsi="Times New Roman" w:cs="Times New Roman"/>
-          <w:b/>
-          <w:bCs/>
-          <w:lang w:val="en-US"/>
-        </w:rPr>
-      </w:pPr>
+        <w:ind w:left="360"/>
+        <w:rPr>
+          <w:rFonts w:ascii="Times New Roman" w:hAnsi="Times New Roman" w:cs="Times New Roman"/>
+          <w:b/>
+          <w:bCs/>
+          <w:lang w:val="en-US"/>
+        </w:rPr>
+      </w:pPr>
+      <w:r>
+        <w:rPr>
+          <w:rFonts w:ascii="Times New Roman" w:hAnsi="Times New Roman" w:cs="Times New Roman"/>
+          <w:b/>
+          <w:bCs/>
+          <w:sz w:val="28"/>
+          <w:szCs w:val="28"/>
+          <w:lang w:val="en-US"/>
+        </w:rPr>
+        <w:t xml:space="preserve">Story #1: </w:t>
+      </w:r>
       <w:r>
         <w:rPr>
           <w:rFonts w:ascii="Times New Roman" w:hAnsi="Times New Roman" w:cs="Times New Roman"/>
@@ -217,21 +235,141 @@
     </w:p>
     <w:p>
       <w:pPr>
-        <w:pStyle w:val="ListParagraph"/>
-        <w:numPr>
-          <w:ilvl w:val="0"/>
-          <w:numId w:val="3"/>
-        </w:numPr>
-        <w:rPr>
-          <w:rFonts w:ascii="Times New Roman" w:hAnsi="Times New Roman" w:cs="Times New Roman"/>
-          <w:lang w:val="en-US"/>
-        </w:rPr>
-      </w:pPr>
-      <w:r>
-        <w:rPr>
-          <w:rFonts w:ascii="Times New Roman" w:hAnsi="Times New Roman" w:cs="Times New Roman"/>
-          <w:b/>
-          <w:bCs/>
+        <w:ind w:left="360"/>
+        <w:rPr>
+          <w:rFonts w:ascii="Times New Roman" w:hAnsi="Times New Roman" w:cs="Times New Roman"/>
+          <w:lang w:val="en-US"/>
+        </w:rPr>
+      </w:pPr>
+      <w:r>
+        <w:rPr>
+          <w:rFonts w:ascii="Times New Roman" w:hAnsi="Times New Roman" w:cs="Times New Roman"/>
+          <w:b/>
+          <w:bCs/>
+          <w:sz w:val="28"/>
+          <w:szCs w:val="28"/>
+          <w:lang w:val="en-US"/>
+        </w:rPr>
+        <w:t xml:space="preserve">User Story: </w:t>
+      </w:r>
+      <w:r>
+        <w:rPr>
+          <w:rFonts w:ascii="Times New Roman" w:hAnsi="Times New Roman" w:cs="Times New Roman"/>
+          <w:lang w:val="en-US"/>
+        </w:rPr>
+        <w:t xml:space="preserve">As a user I want to be able to load my LiDAR files into the program </w:t>
+      </w:r>
+      <w:r>
+        <w:rPr>
+          <w:rFonts w:ascii="Times New Roman" w:hAnsi="Times New Roman" w:cs="Times New Roman"/>
+          <w:lang w:val="en-US"/>
+        </w:rPr>
+        <w:t xml:space="preserve">so that I don’t have to use another software for it </w:t>
+      </w:r>
+    </w:p>
+    <w:p>
+      <w:pPr>
+        <w:ind w:left="360"/>
+        <w:rPr>
+          <w:rFonts w:ascii="Times New Roman" w:hAnsi="Times New Roman" w:cs="Times New Roman"/>
+          <w:b/>
+          <w:bCs/>
+          <w:lang w:val="en-US"/>
+        </w:rPr>
+      </w:pPr>
+      <w:r>
+        <w:rPr>
+          <w:rFonts w:ascii="Times New Roman" w:hAnsi="Times New Roman" w:cs="Times New Roman"/>
+          <w:b/>
+          <w:bCs/>
+          <w:lang w:val="en-US"/>
+        </w:rPr>
+        <w:t>Points: 2</w:t>
+      </w:r>
+    </w:p>
+    <w:p>
+      <w:pPr>
+        <w:ind w:left="360"/>
+        <w:rPr>
+          <w:rFonts w:ascii="Times New Roman" w:hAnsi="Times New Roman" w:cs="Times New Roman"/>
+          <w:b/>
+          <w:bCs/>
+          <w:lang w:val="en-US"/>
+        </w:rPr>
+      </w:pPr>
+      <w:r>
+        <w:rPr>
+          <w:rFonts w:ascii="Times New Roman" w:hAnsi="Times New Roman" w:cs="Times New Roman"/>
+          <w:b/>
+          <w:bCs/>
+          <w:lang w:val="en-US"/>
+        </w:rPr>
+        <w:t>Priority: Low</w:t>
+      </w:r>
+    </w:p>
+    <w:p>
+      <w:pPr>
+        <w:ind w:left="360"/>
+        <w:rPr>
+          <w:rFonts w:ascii="Times New Roman" w:hAnsi="Times New Roman" w:cs="Times New Roman"/>
+          <w:b/>
+          <w:bCs/>
+          <w:sz w:val="28"/>
+          <w:szCs w:val="28"/>
+          <w:lang w:val="en-US"/>
+        </w:rPr>
+      </w:pPr>
+    </w:p>
+    <w:p>
+      <w:pPr>
+        <w:ind w:left="360"/>
+        <w:rPr>
+          <w:rFonts w:ascii="Times New Roman" w:hAnsi="Times New Roman" w:cs="Times New Roman"/>
+          <w:b/>
+          <w:bCs/>
+          <w:lang w:val="en-US"/>
+        </w:rPr>
+      </w:pPr>
+      <w:r>
+        <w:rPr>
+          <w:rFonts w:ascii="Times New Roman" w:hAnsi="Times New Roman" w:cs="Times New Roman"/>
+          <w:b/>
+          <w:bCs/>
+          <w:sz w:val="28"/>
+          <w:szCs w:val="28"/>
+          <w:lang w:val="en-US"/>
+        </w:rPr>
+        <w:t>Story #</w:t>
+      </w:r>
+      <w:r>
+        <w:rPr>
+          <w:rFonts w:ascii="Times New Roman" w:hAnsi="Times New Roman" w:cs="Times New Roman"/>
+          <w:b/>
+          <w:bCs/>
+          <w:sz w:val="28"/>
+          <w:szCs w:val="28"/>
+          <w:lang w:val="en-US"/>
+        </w:rPr>
+        <w:t>2</w:t>
+      </w:r>
+      <w:r>
+        <w:rPr>
+          <w:rFonts w:ascii="Times New Roman" w:hAnsi="Times New Roman" w:cs="Times New Roman"/>
+          <w:b/>
+          <w:bCs/>
+          <w:sz w:val="28"/>
+          <w:szCs w:val="28"/>
+          <w:lang w:val="en-US"/>
+        </w:rPr>
+        <w:t xml:space="preserve">: </w:t>
+      </w:r>
+      <w:r>
+        <w:rPr>
+          <w:rFonts w:ascii="Times New Roman" w:hAnsi="Times New Roman" w:cs="Times New Roman"/>
+          <w:b/>
+          <w:bCs/>
+          <w:sz w:val="28"/>
+          <w:szCs w:val="28"/>
           <w:lang w:val="en-US"/>
         </w:rPr>
         <w:t xml:space="preserve"> </w:t>
@@ -246,56 +384,370 @@
     </w:p>
     <w:p>
       <w:pPr>
-        <w:pStyle w:val="ListParagraph"/>
-        <w:numPr>
-          <w:ilvl w:val="0"/>
-          <w:numId w:val="3"/>
-        </w:numPr>
-        <w:rPr>
-          <w:rFonts w:ascii="Times New Roman" w:hAnsi="Times New Roman" w:cs="Times New Roman"/>
-          <w:lang w:val="en-US"/>
-        </w:rPr>
-      </w:pPr>
-      <w:r>
-        <w:rPr>
-          <w:rFonts w:ascii="Times New Roman" w:hAnsi="Times New Roman" w:cs="Times New Roman"/>
-          <w:lang w:val="en-US"/>
-        </w:rPr>
-        <w:t>Get elevation of points in LiDAR image</w:t>
-      </w:r>
-    </w:p>
-    <w:p>
-      <w:pPr>
-        <w:pStyle w:val="ListParagraph"/>
-        <w:numPr>
-          <w:ilvl w:val="0"/>
-          <w:numId w:val="3"/>
-        </w:numPr>
-        <w:rPr>
-          <w:rFonts w:ascii="Times New Roman" w:hAnsi="Times New Roman" w:cs="Times New Roman"/>
-          <w:lang w:val="en-US"/>
-        </w:rPr>
-      </w:pPr>
-      <w:r>
-        <w:rPr>
-          <w:rFonts w:ascii="Times New Roman" w:hAnsi="Times New Roman" w:cs="Times New Roman"/>
-          <w:lang w:val="en-US"/>
-        </w:rPr>
-        <w:t>Get difference in elevation between origin and LiDAR image</w:t>
-      </w:r>
-    </w:p>
-    <w:p>
-      <w:pPr>
-        <w:pStyle w:val="ListParagraph"/>
-        <w:numPr>
-          <w:ilvl w:val="0"/>
-          <w:numId w:val="3"/>
-        </w:numPr>
-        <w:rPr>
-          <w:rFonts w:ascii="Times New Roman" w:hAnsi="Times New Roman" w:cs="Times New Roman"/>
-          <w:lang w:val="en-US"/>
-        </w:rPr>
-      </w:pPr>
+        <w:ind w:left="360"/>
+        <w:rPr>
+          <w:rFonts w:ascii="Times New Roman" w:hAnsi="Times New Roman" w:cs="Times New Roman"/>
+          <w:lang w:val="en-US"/>
+        </w:rPr>
+      </w:pPr>
+      <w:r>
+        <w:rPr>
+          <w:rFonts w:ascii="Times New Roman" w:hAnsi="Times New Roman" w:cs="Times New Roman"/>
+          <w:b/>
+          <w:bCs/>
+          <w:sz w:val="28"/>
+          <w:szCs w:val="28"/>
+          <w:lang w:val="en-US"/>
+        </w:rPr>
+        <w:t xml:space="preserve">User Story: </w:t>
+      </w:r>
+      <w:r>
+        <w:rPr>
+          <w:rFonts w:ascii="Times New Roman" w:hAnsi="Times New Roman" w:cs="Times New Roman"/>
+          <w:lang w:val="en-US"/>
+        </w:rPr>
+        <w:t>As a user I want to be able to view the LiDAR data in 3D so that I can understand the shape of that land and find areas of interest</w:t>
+      </w:r>
+    </w:p>
+    <w:p>
+      <w:pPr>
+        <w:ind w:left="360"/>
+        <w:rPr>
+          <w:rFonts w:ascii="Times New Roman" w:hAnsi="Times New Roman" w:cs="Times New Roman"/>
+          <w:b/>
+          <w:bCs/>
+          <w:lang w:val="en-US"/>
+        </w:rPr>
+      </w:pPr>
+      <w:r>
+        <w:rPr>
+          <w:rFonts w:ascii="Times New Roman" w:hAnsi="Times New Roman" w:cs="Times New Roman"/>
+          <w:b/>
+          <w:bCs/>
+          <w:lang w:val="en-US"/>
+        </w:rPr>
+        <w:t>Points:</w:t>
+      </w:r>
+      <w:r>
+        <w:rPr>
+          <w:rFonts w:ascii="Times New Roman" w:hAnsi="Times New Roman" w:cs="Times New Roman"/>
+          <w:b/>
+          <w:bCs/>
+          <w:lang w:val="en-US"/>
+        </w:rPr>
+        <w:t xml:space="preserve"> 4</w:t>
+      </w:r>
+    </w:p>
+    <w:p>
+      <w:pPr>
+        <w:ind w:left="360"/>
+        <w:rPr>
+          <w:rFonts w:ascii="Times New Roman" w:hAnsi="Times New Roman" w:cs="Times New Roman"/>
+          <w:b/>
+          <w:bCs/>
+          <w:lang w:val="en-US"/>
+        </w:rPr>
+      </w:pPr>
+      <w:r>
+        <w:rPr>
+          <w:rFonts w:ascii="Times New Roman" w:hAnsi="Times New Roman" w:cs="Times New Roman"/>
+          <w:b/>
+          <w:bCs/>
+          <w:lang w:val="en-US"/>
+        </w:rPr>
+        <w:t>Priority:</w:t>
+      </w:r>
+      <w:r>
+        <w:rPr>
+          <w:rFonts w:ascii="Times New Roman" w:hAnsi="Times New Roman" w:cs="Times New Roman"/>
+          <w:b/>
+          <w:bCs/>
+          <w:lang w:val="en-US"/>
+        </w:rPr>
+        <w:t xml:space="preserve"> </w:t>
+      </w:r>
+      <w:r>
+        <w:rPr>
+          <w:rFonts w:ascii="Times New Roman" w:hAnsi="Times New Roman" w:cs="Times New Roman"/>
+          <w:b/>
+          <w:bCs/>
+          <w:lang w:val="en-US"/>
+        </w:rPr>
+        <w:t>Low</w:t>
+      </w:r>
+    </w:p>
+    <w:p>
+      <w:pPr>
+        <w:ind w:left="360"/>
+        <w:rPr>
+          <w:rFonts w:ascii="Times New Roman" w:hAnsi="Times New Roman" w:cs="Times New Roman"/>
+          <w:b/>
+          <w:bCs/>
+          <w:lang w:val="en-US"/>
+        </w:rPr>
+      </w:pPr>
+    </w:p>
+    <w:p>
+      <w:pPr>
+        <w:ind w:left="360"/>
+        <w:rPr>
+          <w:rFonts w:ascii="Times New Roman" w:hAnsi="Times New Roman" w:cs="Times New Roman"/>
+          <w:lang w:val="en-US"/>
+        </w:rPr>
+      </w:pPr>
+      <w:r>
+        <w:rPr>
+          <w:rFonts w:ascii="Times New Roman" w:hAnsi="Times New Roman" w:cs="Times New Roman"/>
+          <w:b/>
+          <w:bCs/>
+          <w:sz w:val="28"/>
+          <w:szCs w:val="28"/>
+          <w:lang w:val="en-US"/>
+        </w:rPr>
+        <w:t>Story #</w:t>
+      </w:r>
+      <w:r>
+        <w:rPr>
+          <w:rFonts w:ascii="Times New Roman" w:hAnsi="Times New Roman" w:cs="Times New Roman"/>
+          <w:b/>
+          <w:bCs/>
+          <w:sz w:val="28"/>
+          <w:szCs w:val="28"/>
+          <w:lang w:val="en-US"/>
+        </w:rPr>
+        <w:t>3</w:t>
+      </w:r>
+      <w:r>
+        <w:rPr>
+          <w:rFonts w:ascii="Times New Roman" w:hAnsi="Times New Roman" w:cs="Times New Roman"/>
+          <w:b/>
+          <w:bCs/>
+          <w:sz w:val="28"/>
+          <w:szCs w:val="28"/>
+          <w:lang w:val="en-US"/>
+        </w:rPr>
+        <w:t xml:space="preserve">: </w:t>
+      </w:r>
+      <w:r>
+        <w:rPr>
+          <w:rFonts w:ascii="Times New Roman" w:hAnsi="Times New Roman" w:cs="Times New Roman"/>
+          <w:b/>
+          <w:bCs/>
+          <w:sz w:val="28"/>
+          <w:szCs w:val="28"/>
+          <w:lang w:val="en-US"/>
+        </w:rPr>
+        <w:t xml:space="preserve"> </w:t>
+      </w:r>
+      <w:r>
+        <w:rPr>
+          <w:rFonts w:ascii="Times New Roman" w:hAnsi="Times New Roman" w:cs="Times New Roman"/>
+          <w:lang w:val="en-US"/>
+        </w:rPr>
+        <w:t>Get elevation of</w:t>
+      </w:r>
+      <w:r>
+        <w:rPr>
+          <w:rFonts w:ascii="Times New Roman" w:hAnsi="Times New Roman" w:cs="Times New Roman"/>
+          <w:lang w:val="en-US"/>
+        </w:rPr>
+        <w:t xml:space="preserve"> a</w:t>
+      </w:r>
+      <w:r>
+        <w:rPr>
+          <w:rFonts w:ascii="Times New Roman" w:hAnsi="Times New Roman" w:cs="Times New Roman"/>
+          <w:lang w:val="en-US"/>
+        </w:rPr>
+        <w:t xml:space="preserve"> point</w:t>
+      </w:r>
+      <w:r>
+        <w:rPr>
+          <w:rFonts w:ascii="Times New Roman" w:hAnsi="Times New Roman" w:cs="Times New Roman"/>
+          <w:lang w:val="en-US"/>
+        </w:rPr>
+        <w:t>(</w:t>
+      </w:r>
+      <w:r>
+        <w:rPr>
+          <w:rFonts w:ascii="Times New Roman" w:hAnsi="Times New Roman" w:cs="Times New Roman"/>
+          <w:lang w:val="en-US"/>
+        </w:rPr>
+        <w:t>s</w:t>
+      </w:r>
+      <w:r>
+        <w:rPr>
+          <w:rFonts w:ascii="Times New Roman" w:hAnsi="Times New Roman" w:cs="Times New Roman"/>
+          <w:lang w:val="en-US"/>
+        </w:rPr>
+        <w:t>)</w:t>
+      </w:r>
+      <w:r>
+        <w:rPr>
+          <w:rFonts w:ascii="Times New Roman" w:hAnsi="Times New Roman" w:cs="Times New Roman"/>
+          <w:lang w:val="en-US"/>
+        </w:rPr>
+        <w:t xml:space="preserve"> in LiDAR image</w:t>
+      </w:r>
+    </w:p>
+    <w:p>
+      <w:pPr>
+        <w:ind w:left="360"/>
+        <w:rPr>
+          <w:rFonts w:ascii="Times New Roman" w:hAnsi="Times New Roman" w:cs="Times New Roman"/>
+          <w:lang w:val="en-US"/>
+        </w:rPr>
+      </w:pPr>
+      <w:r>
+        <w:rPr>
+          <w:rFonts w:ascii="Times New Roman" w:hAnsi="Times New Roman" w:cs="Times New Roman"/>
+          <w:b/>
+          <w:bCs/>
+          <w:sz w:val="28"/>
+          <w:szCs w:val="28"/>
+          <w:lang w:val="en-US"/>
+        </w:rPr>
+        <w:t xml:space="preserve">User Story: </w:t>
+      </w:r>
+      <w:r>
+        <w:rPr>
+          <w:rFonts w:ascii="Times New Roman" w:hAnsi="Times New Roman" w:cs="Times New Roman"/>
+          <w:lang w:val="en-US"/>
+        </w:rPr>
+        <w:t>As a user I want to be able to extract the elevation of a particular point, or multiple points so that I can use that information in my research and reports</w:t>
+      </w:r>
+    </w:p>
+    <w:p>
+      <w:pPr>
+        <w:ind w:left="360"/>
+        <w:rPr>
+          <w:rFonts w:ascii="Times New Roman" w:hAnsi="Times New Roman" w:cs="Times New Roman"/>
+          <w:b/>
+          <w:bCs/>
+          <w:lang w:val="en-US"/>
+        </w:rPr>
+      </w:pPr>
+      <w:r>
+        <w:rPr>
+          <w:rFonts w:ascii="Times New Roman" w:hAnsi="Times New Roman" w:cs="Times New Roman"/>
+          <w:b/>
+          <w:bCs/>
+          <w:lang w:val="en-US"/>
+        </w:rPr>
+        <w:t>Points:</w:t>
+      </w:r>
+      <w:r>
+        <w:rPr>
+          <w:rFonts w:ascii="Times New Roman" w:hAnsi="Times New Roman" w:cs="Times New Roman"/>
+          <w:b/>
+          <w:bCs/>
+          <w:lang w:val="en-US"/>
+        </w:rPr>
+        <w:t xml:space="preserve"> 2</w:t>
+      </w:r>
+    </w:p>
+    <w:p>
+      <w:pPr>
+        <w:ind w:left="360"/>
+        <w:rPr>
+          <w:rFonts w:ascii="Times New Roman" w:hAnsi="Times New Roman" w:cs="Times New Roman"/>
+          <w:b/>
+          <w:bCs/>
+          <w:lang w:val="en-US"/>
+        </w:rPr>
+      </w:pPr>
+      <w:r>
+        <w:rPr>
+          <w:rFonts w:ascii="Times New Roman" w:hAnsi="Times New Roman" w:cs="Times New Roman"/>
+          <w:b/>
+          <w:bCs/>
+          <w:lang w:val="en-US"/>
+        </w:rPr>
+        <w:t>Priority:</w:t>
+      </w:r>
+      <w:r>
+        <w:rPr>
+          <w:rFonts w:ascii="Times New Roman" w:hAnsi="Times New Roman" w:cs="Times New Roman"/>
+          <w:b/>
+          <w:bCs/>
+          <w:lang w:val="en-US"/>
+        </w:rPr>
+        <w:t xml:space="preserve"> </w:t>
+      </w:r>
+      <w:r>
+        <w:rPr>
+          <w:rFonts w:ascii="Times New Roman" w:hAnsi="Times New Roman" w:cs="Times New Roman"/>
+          <w:b/>
+          <w:bCs/>
+          <w:lang w:val="en-US"/>
+        </w:rPr>
+        <w:t>Low</w:t>
+      </w:r>
+    </w:p>
+    <w:p>
+      <w:pPr>
+        <w:ind w:left="360"/>
+        <w:rPr>
+          <w:rFonts w:ascii="Times New Roman" w:hAnsi="Times New Roman" w:cs="Times New Roman"/>
+          <w:b/>
+          <w:bCs/>
+          <w:sz w:val="28"/>
+          <w:szCs w:val="28"/>
+          <w:lang w:val="en-US"/>
+        </w:rPr>
+      </w:pPr>
+    </w:p>
+    <w:p>
+      <w:pPr>
+        <w:ind w:left="360"/>
+        <w:rPr>
+          <w:rFonts w:ascii="Times New Roman" w:hAnsi="Times New Roman" w:cs="Times New Roman"/>
+          <w:lang w:val="en-US"/>
+        </w:rPr>
+      </w:pPr>
+      <w:r>
+        <w:rPr>
+          <w:rFonts w:ascii="Times New Roman" w:hAnsi="Times New Roman" w:cs="Times New Roman"/>
+          <w:b/>
+          <w:bCs/>
+          <w:sz w:val="28"/>
+          <w:szCs w:val="28"/>
+          <w:lang w:val="en-US"/>
+        </w:rPr>
+        <w:t>Story #</w:t>
+      </w:r>
+      <w:r>
+        <w:rPr>
+          <w:rFonts w:ascii="Times New Roman" w:hAnsi="Times New Roman" w:cs="Times New Roman"/>
+          <w:b/>
+          <w:bCs/>
+          <w:sz w:val="28"/>
+          <w:szCs w:val="28"/>
+          <w:lang w:val="en-US"/>
+        </w:rPr>
+        <w:t>4</w:t>
+      </w:r>
+      <w:r>
+        <w:rPr>
+          <w:rFonts w:ascii="Times New Roman" w:hAnsi="Times New Roman" w:cs="Times New Roman"/>
+          <w:b/>
+          <w:bCs/>
+          <w:sz w:val="28"/>
+          <w:szCs w:val="28"/>
+          <w:lang w:val="en-US"/>
+        </w:rPr>
+        <w:t xml:space="preserve">: </w:t>
+      </w:r>
+      <w:r>
+        <w:rPr>
+          <w:rFonts w:ascii="Times New Roman" w:hAnsi="Times New Roman" w:cs="Times New Roman"/>
+          <w:b/>
+          <w:bCs/>
+          <w:sz w:val="28"/>
+          <w:szCs w:val="28"/>
+          <w:lang w:val="en-US"/>
+        </w:rPr>
+        <w:t xml:space="preserve"> </w:t>
+      </w:r>
       <w:r>
         <w:rPr>
           <w:rFonts w:ascii="Times New Roman" w:hAnsi="Times New Roman" w:cs="Times New Roman"/>
@@ -306,23 +758,451 @@
     </w:p>
     <w:p>
       <w:pPr>
-        <w:pStyle w:val="ListParagraph"/>
-        <w:numPr>
-          <w:ilvl w:val="0"/>
-          <w:numId w:val="3"/>
-        </w:numPr>
-        <w:rPr>
-          <w:rFonts w:ascii="Times New Roman" w:hAnsi="Times New Roman" w:cs="Times New Roman"/>
-          <w:lang w:val="en-US"/>
-        </w:rPr>
-      </w:pPr>
-      <w:r>
-        <w:rPr>
-          <w:rFonts w:ascii="Times New Roman" w:hAnsi="Times New Roman" w:cs="Times New Roman"/>
-          <w:lang w:val="en-US"/>
-        </w:rPr>
-        <w:t xml:space="preserve">Apply elevation correction to entire 3D cube </w:t>
-      </w:r>
+        <w:ind w:left="360"/>
+        <w:rPr>
+          <w:rFonts w:ascii="Times New Roman" w:hAnsi="Times New Roman" w:cs="Times New Roman"/>
+          <w:lang w:val="en-US"/>
+        </w:rPr>
+      </w:pPr>
+      <w:r>
+        <w:rPr>
+          <w:rFonts w:ascii="Times New Roman" w:hAnsi="Times New Roman" w:cs="Times New Roman"/>
+          <w:b/>
+          <w:bCs/>
+          <w:sz w:val="28"/>
+          <w:szCs w:val="28"/>
+          <w:lang w:val="en-US"/>
+        </w:rPr>
+        <w:t xml:space="preserve">User Story: </w:t>
+      </w:r>
+      <w:r>
+        <w:rPr>
+          <w:rFonts w:ascii="Times New Roman" w:hAnsi="Times New Roman" w:cs="Times New Roman"/>
+          <w:lang w:val="en-US"/>
+        </w:rPr>
+        <w:t xml:space="preserve">As a user I want to be able to </w:t>
+      </w:r>
+      <w:r>
+        <w:rPr>
+          <w:rFonts w:ascii="Times New Roman" w:hAnsi="Times New Roman" w:cs="Times New Roman"/>
+          <w:lang w:val="en-US"/>
+        </w:rPr>
+        <w:t>adjust the elevation value of one point in the GPR data with the elevation data from the LiDAR image, so that I can get an accurate reading of the depth value</w:t>
+      </w:r>
+    </w:p>
+    <w:p>
+      <w:pPr>
+        <w:ind w:left="360"/>
+        <w:rPr>
+          <w:rFonts w:ascii="Times New Roman" w:hAnsi="Times New Roman" w:cs="Times New Roman"/>
+          <w:b/>
+          <w:bCs/>
+          <w:lang w:val="en-US"/>
+        </w:rPr>
+      </w:pPr>
+      <w:r>
+        <w:rPr>
+          <w:rFonts w:ascii="Times New Roman" w:hAnsi="Times New Roman" w:cs="Times New Roman"/>
+          <w:b/>
+          <w:bCs/>
+          <w:lang w:val="en-US"/>
+        </w:rPr>
+        <w:lastRenderedPageBreak/>
+        <w:t xml:space="preserve">Points: </w:t>
+      </w:r>
+      <w:r>
+        <w:rPr>
+          <w:rFonts w:ascii="Times New Roman" w:hAnsi="Times New Roman" w:cs="Times New Roman"/>
+          <w:b/>
+          <w:bCs/>
+          <w:lang w:val="en-US"/>
+        </w:rPr>
+        <w:t>4</w:t>
+      </w:r>
+    </w:p>
+    <w:p>
+      <w:pPr>
+        <w:ind w:left="360"/>
+        <w:rPr>
+          <w:rFonts w:ascii="Times New Roman" w:hAnsi="Times New Roman" w:cs="Times New Roman"/>
+          <w:b/>
+          <w:bCs/>
+          <w:lang w:val="en-US"/>
+        </w:rPr>
+      </w:pPr>
+      <w:r>
+        <w:rPr>
+          <w:rFonts w:ascii="Times New Roman" w:hAnsi="Times New Roman" w:cs="Times New Roman"/>
+          <w:b/>
+          <w:bCs/>
+          <w:lang w:val="en-US"/>
+        </w:rPr>
+        <w:t xml:space="preserve">Priority: </w:t>
+      </w:r>
+      <w:r>
+        <w:rPr>
+          <w:rFonts w:ascii="Times New Roman" w:hAnsi="Times New Roman" w:cs="Times New Roman"/>
+          <w:b/>
+          <w:bCs/>
+          <w:lang w:val="en-US"/>
+        </w:rPr>
+        <w:t>High</w:t>
+      </w:r>
+    </w:p>
+    <w:p>
+      <w:pPr>
+        <w:ind w:left="360"/>
+        <w:rPr>
+          <w:rFonts w:ascii="Times New Roman" w:hAnsi="Times New Roman" w:cs="Times New Roman"/>
+          <w:b/>
+          <w:bCs/>
+          <w:lang w:val="en-US"/>
+        </w:rPr>
+      </w:pPr>
+    </w:p>
+    <w:p>
+      <w:pPr>
+        <w:ind w:left="360"/>
+        <w:rPr>
+          <w:rFonts w:ascii="Times New Roman" w:hAnsi="Times New Roman" w:cs="Times New Roman"/>
+          <w:lang w:val="en-US"/>
+        </w:rPr>
+      </w:pPr>
+      <w:r>
+        <w:rPr>
+          <w:rFonts w:ascii="Times New Roman" w:hAnsi="Times New Roman" w:cs="Times New Roman"/>
+          <w:b/>
+          <w:bCs/>
+          <w:sz w:val="28"/>
+          <w:szCs w:val="28"/>
+          <w:lang w:val="en-US"/>
+        </w:rPr>
+        <w:t>Story #</w:t>
+      </w:r>
+      <w:r>
+        <w:rPr>
+          <w:rFonts w:ascii="Times New Roman" w:hAnsi="Times New Roman" w:cs="Times New Roman"/>
+          <w:b/>
+          <w:bCs/>
+          <w:sz w:val="28"/>
+          <w:szCs w:val="28"/>
+          <w:lang w:val="en-US"/>
+        </w:rPr>
+        <w:t>5</w:t>
+      </w:r>
+      <w:r>
+        <w:rPr>
+          <w:rFonts w:ascii="Times New Roman" w:hAnsi="Times New Roman" w:cs="Times New Roman"/>
+          <w:b/>
+          <w:bCs/>
+          <w:sz w:val="28"/>
+          <w:szCs w:val="28"/>
+          <w:lang w:val="en-US"/>
+        </w:rPr>
+        <w:t xml:space="preserve">: </w:t>
+      </w:r>
+      <w:r>
+        <w:rPr>
+          <w:rFonts w:ascii="Times New Roman" w:hAnsi="Times New Roman" w:cs="Times New Roman"/>
+          <w:b/>
+          <w:bCs/>
+          <w:sz w:val="28"/>
+          <w:szCs w:val="28"/>
+          <w:lang w:val="en-US"/>
+        </w:rPr>
+        <w:t xml:space="preserve"> </w:t>
+      </w:r>
+      <w:r>
+        <w:rPr>
+          <w:rFonts w:ascii="Times New Roman" w:hAnsi="Times New Roman" w:cs="Times New Roman"/>
+          <w:lang w:val="en-US"/>
+        </w:rPr>
+        <w:t xml:space="preserve">Apply elevation correction to entire </w:t>
+      </w:r>
+      <w:r>
+        <w:rPr>
+          <w:rFonts w:ascii="Times New Roman" w:hAnsi="Times New Roman" w:cs="Times New Roman"/>
+          <w:lang w:val="en-US"/>
+        </w:rPr>
+        <w:t>slice</w:t>
+      </w:r>
+      <w:r>
+        <w:rPr>
+          <w:rFonts w:ascii="Times New Roman" w:hAnsi="Times New Roman" w:cs="Times New Roman"/>
+          <w:lang w:val="en-US"/>
+        </w:rPr>
+        <w:t xml:space="preserve"> </w:t>
+      </w:r>
+    </w:p>
+    <w:p>
+      <w:pPr>
+        <w:ind w:left="360"/>
+        <w:rPr>
+          <w:rFonts w:ascii="Times New Roman" w:hAnsi="Times New Roman" w:cs="Times New Roman"/>
+          <w:lang w:val="en-US"/>
+        </w:rPr>
+      </w:pPr>
+      <w:r>
+        <w:rPr>
+          <w:rFonts w:ascii="Times New Roman" w:hAnsi="Times New Roman" w:cs="Times New Roman"/>
+          <w:b/>
+          <w:bCs/>
+          <w:sz w:val="28"/>
+          <w:szCs w:val="28"/>
+          <w:lang w:val="en-US"/>
+        </w:rPr>
+        <w:t xml:space="preserve">User Story: </w:t>
+      </w:r>
+      <w:r>
+        <w:rPr>
+          <w:rFonts w:ascii="Times New Roman" w:hAnsi="Times New Roman" w:cs="Times New Roman"/>
+          <w:lang w:val="en-US"/>
+        </w:rPr>
+        <w:t xml:space="preserve">As a user I want to be able to </w:t>
+      </w:r>
+      <w:r>
+        <w:rPr>
+          <w:rFonts w:ascii="Times New Roman" w:hAnsi="Times New Roman" w:cs="Times New Roman"/>
+          <w:lang w:val="en-US"/>
+        </w:rPr>
+        <w:t>adjust the elevation value of one point in the GPR data with the elevation data from the LiDAR image, so that I can get an accurate reading of the depth value</w:t>
+      </w:r>
+    </w:p>
+    <w:p>
+      <w:pPr>
+        <w:ind w:left="360"/>
+        <w:rPr>
+          <w:rFonts w:ascii="Times New Roman" w:hAnsi="Times New Roman" w:cs="Times New Roman"/>
+          <w:b/>
+          <w:bCs/>
+          <w:lang w:val="en-US"/>
+        </w:rPr>
+      </w:pPr>
+      <w:r>
+        <w:rPr>
+          <w:rFonts w:ascii="Times New Roman" w:hAnsi="Times New Roman" w:cs="Times New Roman"/>
+          <w:b/>
+          <w:bCs/>
+          <w:lang w:val="en-US"/>
+        </w:rPr>
+        <w:t xml:space="preserve">Points: </w:t>
+      </w:r>
+      <w:r>
+        <w:rPr>
+          <w:rFonts w:ascii="Times New Roman" w:hAnsi="Times New Roman" w:cs="Times New Roman"/>
+          <w:b/>
+          <w:bCs/>
+          <w:lang w:val="en-US"/>
+        </w:rPr>
+        <w:t>6</w:t>
+      </w:r>
+    </w:p>
+    <w:p>
+      <w:pPr>
+        <w:ind w:left="360"/>
+        <w:rPr>
+          <w:rFonts w:ascii="Times New Roman" w:hAnsi="Times New Roman" w:cs="Times New Roman"/>
+          <w:b/>
+          <w:bCs/>
+          <w:lang w:val="en-US"/>
+        </w:rPr>
+      </w:pPr>
+      <w:r>
+        <w:rPr>
+          <w:rFonts w:ascii="Times New Roman" w:hAnsi="Times New Roman" w:cs="Times New Roman"/>
+          <w:b/>
+          <w:bCs/>
+          <w:lang w:val="en-US"/>
+        </w:rPr>
+        <w:t>Priority: Medium</w:t>
+      </w:r>
+    </w:p>
+    <w:p>
+      <w:pPr>
+        <w:ind w:left="360"/>
+        <w:rPr>
+          <w:rFonts w:ascii="Times New Roman" w:hAnsi="Times New Roman" w:cs="Times New Roman"/>
+          <w:b/>
+          <w:bCs/>
+          <w:lang w:val="en-US"/>
+        </w:rPr>
+      </w:pPr>
+    </w:p>
+    <w:p>
+      <w:pPr>
+        <w:ind w:left="360"/>
+        <w:rPr>
+          <w:rFonts w:ascii="Times New Roman" w:hAnsi="Times New Roman" w:cs="Times New Roman"/>
+          <w:lang w:val="en-US"/>
+        </w:rPr>
+      </w:pPr>
+      <w:r>
+        <w:rPr>
+          <w:rFonts w:ascii="Times New Roman" w:hAnsi="Times New Roman" w:cs="Times New Roman"/>
+          <w:b/>
+          <w:bCs/>
+          <w:sz w:val="28"/>
+          <w:szCs w:val="28"/>
+          <w:lang w:val="en-US"/>
+        </w:rPr>
+        <w:t>Story #</w:t>
+      </w:r>
+      <w:r>
+        <w:rPr>
+          <w:rFonts w:ascii="Times New Roman" w:hAnsi="Times New Roman" w:cs="Times New Roman"/>
+          <w:b/>
+          <w:bCs/>
+          <w:sz w:val="28"/>
+          <w:szCs w:val="28"/>
+          <w:lang w:val="en-US"/>
+        </w:rPr>
+        <w:t>6</w:t>
+      </w:r>
+      <w:r>
+        <w:rPr>
+          <w:rFonts w:ascii="Times New Roman" w:hAnsi="Times New Roman" w:cs="Times New Roman"/>
+          <w:b/>
+          <w:bCs/>
+          <w:sz w:val="28"/>
+          <w:szCs w:val="28"/>
+          <w:lang w:val="en-US"/>
+        </w:rPr>
+        <w:t xml:space="preserve">: </w:t>
+      </w:r>
+      <w:r>
+        <w:rPr>
+          <w:rFonts w:ascii="Times New Roman" w:hAnsi="Times New Roman" w:cs="Times New Roman"/>
+          <w:b/>
+          <w:bCs/>
+          <w:sz w:val="28"/>
+          <w:szCs w:val="28"/>
+          <w:lang w:val="en-US"/>
+        </w:rPr>
+        <w:t xml:space="preserve"> </w:t>
+      </w:r>
+      <w:r>
+        <w:rPr>
+          <w:rFonts w:ascii="Times New Roman" w:hAnsi="Times New Roman" w:cs="Times New Roman"/>
+          <w:lang w:val="en-US"/>
+        </w:rPr>
+        <w:t xml:space="preserve">Apply elevation correction to entire </w:t>
+      </w:r>
+      <w:r>
+        <w:rPr>
+          <w:rFonts w:ascii="Times New Roman" w:hAnsi="Times New Roman" w:cs="Times New Roman"/>
+          <w:lang w:val="en-US"/>
+        </w:rPr>
+        <w:t>GPR 3D cube</w:t>
+      </w:r>
+    </w:p>
+    <w:p>
+      <w:pPr>
+        <w:ind w:left="360"/>
+        <w:rPr>
+          <w:rFonts w:ascii="Times New Roman" w:hAnsi="Times New Roman" w:cs="Times New Roman"/>
+          <w:lang w:val="en-US"/>
+        </w:rPr>
+      </w:pPr>
+      <w:r>
+        <w:rPr>
+          <w:rFonts w:ascii="Times New Roman" w:hAnsi="Times New Roman" w:cs="Times New Roman"/>
+          <w:b/>
+          <w:bCs/>
+          <w:sz w:val="28"/>
+          <w:szCs w:val="28"/>
+          <w:lang w:val="en-US"/>
+        </w:rPr>
+        <w:t xml:space="preserve">User Story: </w:t>
+      </w:r>
+      <w:r>
+        <w:rPr>
+          <w:rFonts w:ascii="Times New Roman" w:hAnsi="Times New Roman" w:cs="Times New Roman"/>
+          <w:lang w:val="en-US"/>
+        </w:rPr>
+        <w:t xml:space="preserve">As a user I want to be able to </w:t>
+      </w:r>
+      <w:r>
+        <w:rPr>
+          <w:rFonts w:ascii="Times New Roman" w:hAnsi="Times New Roman" w:cs="Times New Roman"/>
+          <w:lang w:val="en-US"/>
+        </w:rPr>
+        <w:t xml:space="preserve">adjust the elevation value of one point in the GPR data with the elevation data from the LiDAR image, so that I can get an accurate </w:t>
+      </w:r>
+      <w:r>
+        <w:rPr>
+          <w:rFonts w:ascii="Times New Roman" w:hAnsi="Times New Roman" w:cs="Times New Roman"/>
+          <w:lang w:val="en-US"/>
+        </w:rPr>
+        <w:t>model of the landscape</w:t>
+      </w:r>
+    </w:p>
+    <w:p>
+      <w:pPr>
+        <w:ind w:left="360"/>
+        <w:rPr>
+          <w:rFonts w:ascii="Times New Roman" w:hAnsi="Times New Roman" w:cs="Times New Roman"/>
+          <w:b/>
+          <w:bCs/>
+          <w:lang w:val="en-US"/>
+        </w:rPr>
+      </w:pPr>
+      <w:r>
+        <w:rPr>
+          <w:rFonts w:ascii="Times New Roman" w:hAnsi="Times New Roman" w:cs="Times New Roman"/>
+          <w:b/>
+          <w:bCs/>
+          <w:lang w:val="en-US"/>
+        </w:rPr>
+        <w:t xml:space="preserve">Points: </w:t>
+      </w:r>
+      <w:r>
+        <w:rPr>
+          <w:rFonts w:ascii="Times New Roman" w:hAnsi="Times New Roman" w:cs="Times New Roman"/>
+          <w:b/>
+          <w:bCs/>
+          <w:lang w:val="en-US"/>
+        </w:rPr>
+        <w:t>8</w:t>
+      </w:r>
+    </w:p>
+    <w:p>
+      <w:pPr>
+        <w:ind w:left="360"/>
+        <w:rPr>
+          <w:rFonts w:ascii="Times New Roman" w:hAnsi="Times New Roman" w:cs="Times New Roman"/>
+          <w:b/>
+          <w:bCs/>
+          <w:lang w:val="en-US"/>
+        </w:rPr>
+      </w:pPr>
+      <w:r>
+        <w:rPr>
+          <w:rFonts w:ascii="Times New Roman" w:hAnsi="Times New Roman" w:cs="Times New Roman"/>
+          <w:b/>
+          <w:bCs/>
+          <w:lang w:val="en-US"/>
+        </w:rPr>
+        <w:t xml:space="preserve">Priority: </w:t>
+      </w:r>
+      <w:r>
+        <w:rPr>
+          <w:rFonts w:ascii="Times New Roman" w:hAnsi="Times New Roman" w:cs="Times New Roman"/>
+          <w:b/>
+          <w:bCs/>
+          <w:lang w:val="en-US"/>
+        </w:rPr>
+        <w:t>High</w:t>
+      </w:r>
+    </w:p>
+    <w:p>
+      <w:pPr>
+        <w:rPr>
+          <w:rFonts w:ascii="Times New Roman" w:hAnsi="Times New Roman" w:cs="Times New Roman"/>
+          <w:b/>
+          <w:bCs/>
+          <w:lang w:val="en-US"/>
+        </w:rPr>
+      </w:pPr>
     </w:p>
     <w:p>
       <w:pPr>
@@ -416,6 +1296,29 @@
       <w:pPr>
         <w:rPr>
           <w:rFonts w:ascii="Times New Roman" w:hAnsi="Times New Roman" w:cs="Times New Roman"/>
+          <w:b/>
+          <w:bCs/>
+          <w:sz w:val="28"/>
+          <w:szCs w:val="28"/>
+          <w:lang w:val="en-US"/>
+        </w:rPr>
+      </w:pPr>
+      <w:r>
+        <w:rPr>
+          <w:rFonts w:ascii="Times New Roman" w:hAnsi="Times New Roman" w:cs="Times New Roman"/>
+          <w:b/>
+          <w:bCs/>
+          <w:sz w:val="28"/>
+          <w:szCs w:val="28"/>
+          <w:lang w:val="en-US"/>
+        </w:rPr>
+        <w:t>EPIC #2:</w:t>
+      </w:r>
+    </w:p>
+    <w:p>
+      <w:pPr>
+        <w:rPr>
+          <w:rFonts w:ascii="Times New Roman" w:hAnsi="Times New Roman" w:cs="Times New Roman"/>
           <w:sz w:val="28"/>
           <w:szCs w:val="28"/>
           <w:lang w:val="en-US"/>
@@ -544,18 +1447,58 @@
     </w:p>
     <w:p>
       <w:pPr>
-        <w:pStyle w:val="ListParagraph"/>
-        <w:numPr>
-          <w:ilvl w:val="0"/>
-          <w:numId w:val="4"/>
-        </w:numPr>
-        <w:rPr>
-          <w:rFonts w:ascii="Times New Roman" w:hAnsi="Times New Roman" w:cs="Times New Roman"/>
-          <w:b/>
-          <w:bCs/>
-          <w:lang w:val="en-US"/>
-        </w:rPr>
-      </w:pPr>
+        <w:ind w:left="360"/>
+        <w:rPr>
+          <w:rFonts w:ascii="Times New Roman" w:hAnsi="Times New Roman" w:cs="Times New Roman"/>
+          <w:b/>
+          <w:bCs/>
+          <w:lang w:val="en-US"/>
+        </w:rPr>
+      </w:pPr>
+      <w:r>
+        <w:rPr>
+          <w:rFonts w:ascii="Times New Roman" w:hAnsi="Times New Roman" w:cs="Times New Roman"/>
+          <w:b/>
+          <w:bCs/>
+          <w:sz w:val="28"/>
+          <w:szCs w:val="28"/>
+          <w:lang w:val="en-US"/>
+        </w:rPr>
+        <w:t>Story #</w:t>
+      </w:r>
+      <w:r>
+        <w:rPr>
+          <w:rFonts w:ascii="Times New Roman" w:hAnsi="Times New Roman" w:cs="Times New Roman"/>
+          <w:b/>
+          <w:bCs/>
+          <w:sz w:val="28"/>
+          <w:szCs w:val="28"/>
+          <w:lang w:val="en-US"/>
+        </w:rPr>
+        <w:t>1</w:t>
+      </w:r>
+      <w:r>
+        <w:rPr>
+          <w:rFonts w:ascii="Times New Roman" w:hAnsi="Times New Roman" w:cs="Times New Roman"/>
+          <w:b/>
+          <w:bCs/>
+          <w:sz w:val="28"/>
+          <w:szCs w:val="28"/>
+          <w:lang w:val="en-US"/>
+        </w:rPr>
+        <w:t xml:space="preserve">: </w:t>
+      </w:r>
+      <w:r>
+        <w:rPr>
+          <w:rFonts w:ascii="Times New Roman" w:hAnsi="Times New Roman" w:cs="Times New Roman"/>
+          <w:b/>
+          <w:bCs/>
+          <w:sz w:val="28"/>
+          <w:szCs w:val="28"/>
+          <w:lang w:val="en-US"/>
+        </w:rPr>
+        <w:t xml:space="preserve"> </w:t>
+      </w:r>
       <w:r>
         <w:rPr>
           <w:rFonts w:ascii="Times New Roman" w:hAnsi="Times New Roman" w:cs="Times New Roman"/>
@@ -582,23 +1525,174 @@
     </w:p>
     <w:p>
       <w:pPr>
-        <w:pStyle w:val="ListParagraph"/>
-        <w:numPr>
-          <w:ilvl w:val="0"/>
-          <w:numId w:val="4"/>
-        </w:numPr>
-        <w:rPr>
-          <w:rFonts w:ascii="Times New Roman" w:hAnsi="Times New Roman" w:cs="Times New Roman"/>
-          <w:b/>
-          <w:bCs/>
-          <w:lang w:val="en-US"/>
-        </w:rPr>
-      </w:pPr>
-      <w:r>
-        <w:rPr>
-          <w:rFonts w:ascii="Times New Roman" w:hAnsi="Times New Roman" w:cs="Times New Roman"/>
-          <w:b/>
-          <w:bCs/>
+        <w:ind w:left="360"/>
+        <w:rPr>
+          <w:rFonts w:ascii="Times New Roman" w:hAnsi="Times New Roman" w:cs="Times New Roman"/>
+          <w:lang w:val="en-US"/>
+        </w:rPr>
+      </w:pPr>
+      <w:r>
+        <w:rPr>
+          <w:rFonts w:ascii="Times New Roman" w:hAnsi="Times New Roman" w:cs="Times New Roman"/>
+          <w:b/>
+          <w:bCs/>
+          <w:sz w:val="28"/>
+          <w:szCs w:val="28"/>
+          <w:lang w:val="en-US"/>
+        </w:rPr>
+        <w:t xml:space="preserve">User Story: </w:t>
+      </w:r>
+      <w:r>
+        <w:rPr>
+          <w:rFonts w:ascii="Times New Roman" w:hAnsi="Times New Roman" w:cs="Times New Roman"/>
+          <w:lang w:val="en-US"/>
+        </w:rPr>
+        <w:t xml:space="preserve">As a user I want to be able to </w:t>
+      </w:r>
+      <w:r>
+        <w:rPr>
+          <w:rFonts w:ascii="Times New Roman" w:hAnsi="Times New Roman" w:cs="Times New Roman"/>
+          <w:lang w:val="en-US"/>
+        </w:rPr>
+        <w:t xml:space="preserve">load in multiple </w:t>
+      </w:r>
+      <w:proofErr w:type="spellStart"/>
+      <w:r>
+        <w:rPr>
+          <w:rFonts w:ascii="Times New Roman" w:hAnsi="Times New Roman" w:cs="Times New Roman"/>
+          <w:lang w:val="en-US"/>
+        </w:rPr>
+        <w:t>gpr</w:t>
+      </w:r>
+      <w:proofErr w:type="spellEnd"/>
+      <w:r>
+        <w:rPr>
+          <w:rFonts w:ascii="Times New Roman" w:hAnsi="Times New Roman" w:cs="Times New Roman"/>
+          <w:lang w:val="en-US"/>
+        </w:rPr>
+        <w:t xml:space="preserve"> files so that I can create a 3D cube of all my data</w:t>
+      </w:r>
+    </w:p>
+    <w:p>
+      <w:pPr>
+        <w:ind w:left="360"/>
+        <w:rPr>
+          <w:rFonts w:ascii="Times New Roman" w:hAnsi="Times New Roman" w:cs="Times New Roman"/>
+          <w:b/>
+          <w:bCs/>
+          <w:lang w:val="en-US"/>
+        </w:rPr>
+      </w:pPr>
+      <w:r>
+        <w:rPr>
+          <w:rFonts w:ascii="Times New Roman" w:hAnsi="Times New Roman" w:cs="Times New Roman"/>
+          <w:b/>
+          <w:bCs/>
+          <w:lang w:val="en-US"/>
+        </w:rPr>
+        <w:t xml:space="preserve">Points: </w:t>
+      </w:r>
+      <w:r>
+        <w:rPr>
+          <w:rFonts w:ascii="Times New Roman" w:hAnsi="Times New Roman" w:cs="Times New Roman"/>
+          <w:b/>
+          <w:bCs/>
+          <w:lang w:val="en-US"/>
+        </w:rPr>
+        <w:t>2</w:t>
+      </w:r>
+    </w:p>
+    <w:p>
+      <w:pPr>
+        <w:ind w:left="360"/>
+        <w:rPr>
+          <w:rFonts w:ascii="Times New Roman" w:hAnsi="Times New Roman" w:cs="Times New Roman"/>
+          <w:b/>
+          <w:bCs/>
+          <w:lang w:val="en-US"/>
+        </w:rPr>
+      </w:pPr>
+      <w:r>
+        <w:rPr>
+          <w:rFonts w:ascii="Times New Roman" w:hAnsi="Times New Roman" w:cs="Times New Roman"/>
+          <w:b/>
+          <w:bCs/>
+          <w:lang w:val="en-US"/>
+        </w:rPr>
+        <w:lastRenderedPageBreak/>
+        <w:t xml:space="preserve">Priority: </w:t>
+      </w:r>
+      <w:r>
+        <w:rPr>
+          <w:rFonts w:ascii="Times New Roman" w:hAnsi="Times New Roman" w:cs="Times New Roman"/>
+          <w:b/>
+          <w:bCs/>
+          <w:lang w:val="en-US"/>
+        </w:rPr>
+        <w:t>Low</w:t>
+      </w:r>
+    </w:p>
+    <w:p>
+      <w:pPr>
+        <w:ind w:left="360"/>
+        <w:rPr>
+          <w:rFonts w:ascii="Times New Roman" w:hAnsi="Times New Roman" w:cs="Times New Roman"/>
+          <w:b/>
+          <w:bCs/>
+          <w:lang w:val="en-US"/>
+        </w:rPr>
+      </w:pPr>
+    </w:p>
+    <w:p>
+      <w:pPr>
+        <w:ind w:left="360"/>
+        <w:rPr>
+          <w:rFonts w:ascii="Times New Roman" w:hAnsi="Times New Roman" w:cs="Times New Roman"/>
+          <w:b/>
+          <w:bCs/>
+          <w:lang w:val="en-US"/>
+        </w:rPr>
+      </w:pPr>
+      <w:r>
+        <w:rPr>
+          <w:rFonts w:ascii="Times New Roman" w:hAnsi="Times New Roman" w:cs="Times New Roman"/>
+          <w:b/>
+          <w:bCs/>
+          <w:sz w:val="28"/>
+          <w:szCs w:val="28"/>
+          <w:lang w:val="en-US"/>
+        </w:rPr>
+        <w:t>Story #</w:t>
+      </w:r>
+      <w:r>
+        <w:rPr>
+          <w:rFonts w:ascii="Times New Roman" w:hAnsi="Times New Roman" w:cs="Times New Roman"/>
+          <w:b/>
+          <w:bCs/>
+          <w:sz w:val="28"/>
+          <w:szCs w:val="28"/>
+          <w:lang w:val="en-US"/>
+        </w:rPr>
+        <w:t>2</w:t>
+      </w:r>
+      <w:r>
+        <w:rPr>
+          <w:rFonts w:ascii="Times New Roman" w:hAnsi="Times New Roman" w:cs="Times New Roman"/>
+          <w:b/>
+          <w:bCs/>
+          <w:sz w:val="28"/>
+          <w:szCs w:val="28"/>
+          <w:lang w:val="en-US"/>
+        </w:rPr>
+        <w:t xml:space="preserve">: </w:t>
+      </w:r>
+      <w:r>
+        <w:rPr>
+          <w:rFonts w:ascii="Times New Roman" w:hAnsi="Times New Roman" w:cs="Times New Roman"/>
+          <w:b/>
+          <w:bCs/>
+          <w:sz w:val="28"/>
+          <w:szCs w:val="28"/>
           <w:lang w:val="en-US"/>
         </w:rPr>
         <w:t xml:space="preserve"> </w:t>
@@ -608,23 +1702,174 @@
           <w:rFonts w:ascii="Times New Roman" w:hAnsi="Times New Roman" w:cs="Times New Roman"/>
           <w:lang w:val="en-US"/>
         </w:rPr>
-        <w:t xml:space="preserve">Perform matrix manipulation to reduce sampling time </w:t>
-      </w:r>
-    </w:p>
-    <w:p>
-      <w:pPr>
-        <w:pStyle w:val="ListParagraph"/>
-        <w:numPr>
-          <w:ilvl w:val="0"/>
-          <w:numId w:val="4"/>
-        </w:numPr>
-        <w:rPr>
-          <w:rFonts w:ascii="Times New Roman" w:hAnsi="Times New Roman" w:cs="Times New Roman"/>
-          <w:b/>
-          <w:bCs/>
-          <w:lang w:val="en-US"/>
-        </w:rPr>
-      </w:pPr>
+        <w:t xml:space="preserve">Interpolate </w:t>
+      </w:r>
+      <w:proofErr w:type="spellStart"/>
+      <w:r>
+        <w:rPr>
+          <w:rFonts w:ascii="Times New Roman" w:hAnsi="Times New Roman" w:cs="Times New Roman"/>
+          <w:lang w:val="en-US"/>
+        </w:rPr>
+        <w:t>gpr</w:t>
+      </w:r>
+      <w:proofErr w:type="spellEnd"/>
+      <w:r>
+        <w:rPr>
+          <w:rFonts w:ascii="Times New Roman" w:hAnsi="Times New Roman" w:cs="Times New Roman"/>
+          <w:lang w:val="en-US"/>
+        </w:rPr>
+        <w:t xml:space="preserve"> data</w:t>
+      </w:r>
+      <w:r>
+        <w:rPr>
+          <w:rFonts w:ascii="Times New Roman" w:hAnsi="Times New Roman" w:cs="Times New Roman"/>
+          <w:lang w:val="en-US"/>
+        </w:rPr>
+        <w:t xml:space="preserve"> </w:t>
+      </w:r>
+    </w:p>
+    <w:p>
+      <w:pPr>
+        <w:ind w:left="360"/>
+        <w:rPr>
+          <w:rFonts w:ascii="Times New Roman" w:hAnsi="Times New Roman" w:cs="Times New Roman"/>
+          <w:lang w:val="en-US"/>
+        </w:rPr>
+      </w:pPr>
+      <w:r>
+        <w:rPr>
+          <w:rFonts w:ascii="Times New Roman" w:hAnsi="Times New Roman" w:cs="Times New Roman"/>
+          <w:b/>
+          <w:bCs/>
+          <w:sz w:val="28"/>
+          <w:szCs w:val="28"/>
+          <w:lang w:val="en-US"/>
+        </w:rPr>
+        <w:t xml:space="preserve">User Story: </w:t>
+      </w:r>
+      <w:r>
+        <w:rPr>
+          <w:rFonts w:ascii="Times New Roman" w:hAnsi="Times New Roman" w:cs="Times New Roman"/>
+          <w:lang w:val="en-US"/>
+        </w:rPr>
+        <w:t xml:space="preserve">As a user I want to be able to </w:t>
+      </w:r>
+      <w:r>
+        <w:rPr>
+          <w:rFonts w:ascii="Times New Roman" w:hAnsi="Times New Roman" w:cs="Times New Roman"/>
+          <w:lang w:val="en-US"/>
+        </w:rPr>
+        <w:t xml:space="preserve">interpolate my </w:t>
+      </w:r>
+      <w:proofErr w:type="spellStart"/>
+      <w:r>
+        <w:rPr>
+          <w:rFonts w:ascii="Times New Roman" w:hAnsi="Times New Roman" w:cs="Times New Roman"/>
+          <w:lang w:val="en-US"/>
+        </w:rPr>
+        <w:t>gpr</w:t>
+      </w:r>
+      <w:proofErr w:type="spellEnd"/>
+      <w:r>
+        <w:rPr>
+          <w:rFonts w:ascii="Times New Roman" w:hAnsi="Times New Roman" w:cs="Times New Roman"/>
+          <w:lang w:val="en-US"/>
+        </w:rPr>
+        <w:t xml:space="preserve"> values so that I can create a 3D cube </w:t>
+      </w:r>
+    </w:p>
+    <w:p>
+      <w:pPr>
+        <w:ind w:left="360"/>
+        <w:rPr>
+          <w:rFonts w:ascii="Times New Roman" w:hAnsi="Times New Roman" w:cs="Times New Roman"/>
+          <w:b/>
+          <w:bCs/>
+          <w:lang w:val="en-US"/>
+        </w:rPr>
+      </w:pPr>
+      <w:r>
+        <w:rPr>
+          <w:rFonts w:ascii="Times New Roman" w:hAnsi="Times New Roman" w:cs="Times New Roman"/>
+          <w:b/>
+          <w:bCs/>
+          <w:lang w:val="en-US"/>
+        </w:rPr>
+        <w:t>Points: 6</w:t>
+      </w:r>
+    </w:p>
+    <w:p>
+      <w:pPr>
+        <w:ind w:left="360"/>
+        <w:rPr>
+          <w:rFonts w:ascii="Times New Roman" w:hAnsi="Times New Roman" w:cs="Times New Roman"/>
+          <w:b/>
+          <w:bCs/>
+          <w:lang w:val="en-US"/>
+        </w:rPr>
+      </w:pPr>
+      <w:r>
+        <w:rPr>
+          <w:rFonts w:ascii="Times New Roman" w:hAnsi="Times New Roman" w:cs="Times New Roman"/>
+          <w:b/>
+          <w:bCs/>
+          <w:lang w:val="en-US"/>
+        </w:rPr>
+        <w:t xml:space="preserve">Priority: </w:t>
+      </w:r>
+      <w:r>
+        <w:rPr>
+          <w:rFonts w:ascii="Times New Roman" w:hAnsi="Times New Roman" w:cs="Times New Roman"/>
+          <w:b/>
+          <w:bCs/>
+          <w:lang w:val="en-US"/>
+        </w:rPr>
+        <w:t>High</w:t>
+      </w:r>
+    </w:p>
+    <w:p>
+      <w:pPr>
+        <w:ind w:left="360"/>
+        <w:rPr>
+          <w:rFonts w:ascii="Times New Roman" w:hAnsi="Times New Roman" w:cs="Times New Roman"/>
+          <w:b/>
+          <w:bCs/>
+          <w:lang w:val="en-US"/>
+        </w:rPr>
+      </w:pPr>
+    </w:p>
+    <w:p>
+      <w:pPr>
+        <w:ind w:left="360"/>
+        <w:rPr>
+          <w:rFonts w:ascii="Times New Roman" w:hAnsi="Times New Roman" w:cs="Times New Roman"/>
+          <w:b/>
+          <w:bCs/>
+          <w:lang w:val="en-US"/>
+        </w:rPr>
+      </w:pPr>
+      <w:r>
+        <w:rPr>
+          <w:rFonts w:ascii="Times New Roman" w:hAnsi="Times New Roman" w:cs="Times New Roman"/>
+          <w:b/>
+          <w:bCs/>
+          <w:sz w:val="28"/>
+          <w:szCs w:val="28"/>
+          <w:lang w:val="en-US"/>
+        </w:rPr>
+        <w:t xml:space="preserve">Story #5: </w:t>
+      </w:r>
+      <w:r>
+        <w:rPr>
+          <w:rFonts w:ascii="Times New Roman" w:hAnsi="Times New Roman" w:cs="Times New Roman"/>
+          <w:b/>
+          <w:bCs/>
+          <w:sz w:val="28"/>
+          <w:szCs w:val="28"/>
+          <w:lang w:val="en-US"/>
+        </w:rPr>
+        <w:t xml:space="preserve"> </w:t>
+      </w:r>
       <w:r>
         <w:rPr>
           <w:rFonts w:ascii="Times New Roman" w:hAnsi="Times New Roman" w:cs="Times New Roman"/>
@@ -635,20 +1880,141 @@
     </w:p>
     <w:p>
       <w:pPr>
-        <w:pStyle w:val="ListParagraph"/>
-        <w:numPr>
-          <w:ilvl w:val="0"/>
-          <w:numId w:val="4"/>
-        </w:numPr>
-        <w:rPr>
-          <w:rFonts w:ascii="Times New Roman" w:hAnsi="Times New Roman" w:cs="Times New Roman"/>
-          <w:b/>
-          <w:bCs/>
-          <w:sz w:val="28"/>
-          <w:szCs w:val="28"/>
-          <w:lang w:val="en-US"/>
-        </w:rPr>
-      </w:pPr>
+        <w:ind w:left="360"/>
+        <w:rPr>
+          <w:rFonts w:ascii="Times New Roman" w:hAnsi="Times New Roman" w:cs="Times New Roman"/>
+          <w:lang w:val="en-US"/>
+        </w:rPr>
+      </w:pPr>
+      <w:r>
+        <w:rPr>
+          <w:rFonts w:ascii="Times New Roman" w:hAnsi="Times New Roman" w:cs="Times New Roman"/>
+          <w:b/>
+          <w:bCs/>
+          <w:sz w:val="28"/>
+          <w:szCs w:val="28"/>
+          <w:lang w:val="en-US"/>
+        </w:rPr>
+        <w:t xml:space="preserve">User Story: </w:t>
+      </w:r>
+      <w:r>
+        <w:rPr>
+          <w:rFonts w:ascii="Times New Roman" w:hAnsi="Times New Roman" w:cs="Times New Roman"/>
+          <w:lang w:val="en-US"/>
+        </w:rPr>
+        <w:t xml:space="preserve">As a user I want to be able to </w:t>
+      </w:r>
+      <w:r>
+        <w:rPr>
+          <w:rFonts w:ascii="Times New Roman" w:hAnsi="Times New Roman" w:cs="Times New Roman"/>
+          <w:lang w:val="en-US"/>
+        </w:rPr>
+        <w:t xml:space="preserve">see the progress of the rendering process so that I can know if the function is running or not </w:t>
+      </w:r>
+    </w:p>
+    <w:p>
+      <w:pPr>
+        <w:ind w:left="360"/>
+        <w:rPr>
+          <w:rFonts w:ascii="Times New Roman" w:hAnsi="Times New Roman" w:cs="Times New Roman"/>
+          <w:b/>
+          <w:bCs/>
+          <w:lang w:val="en-US"/>
+        </w:rPr>
+      </w:pPr>
+      <w:r>
+        <w:rPr>
+          <w:rFonts w:ascii="Times New Roman" w:hAnsi="Times New Roman" w:cs="Times New Roman"/>
+          <w:b/>
+          <w:bCs/>
+          <w:lang w:val="en-US"/>
+        </w:rPr>
+        <w:t xml:space="preserve">Points: </w:t>
+      </w:r>
+      <w:r>
+        <w:rPr>
+          <w:rFonts w:ascii="Times New Roman" w:hAnsi="Times New Roman" w:cs="Times New Roman"/>
+          <w:b/>
+          <w:bCs/>
+          <w:lang w:val="en-US"/>
+        </w:rPr>
+        <w:t>2</w:t>
+      </w:r>
+    </w:p>
+    <w:p>
+      <w:pPr>
+        <w:ind w:left="360"/>
+        <w:rPr>
+          <w:rFonts w:ascii="Times New Roman" w:hAnsi="Times New Roman" w:cs="Times New Roman"/>
+          <w:b/>
+          <w:bCs/>
+          <w:lang w:val="en-US"/>
+        </w:rPr>
+      </w:pPr>
+      <w:r>
+        <w:rPr>
+          <w:rFonts w:ascii="Times New Roman" w:hAnsi="Times New Roman" w:cs="Times New Roman"/>
+          <w:b/>
+          <w:bCs/>
+          <w:lang w:val="en-US"/>
+        </w:rPr>
+        <w:t xml:space="preserve">Priority: </w:t>
+      </w:r>
+      <w:r>
+        <w:rPr>
+          <w:rFonts w:ascii="Times New Roman" w:hAnsi="Times New Roman" w:cs="Times New Roman"/>
+          <w:b/>
+          <w:bCs/>
+          <w:lang w:val="en-US"/>
+        </w:rPr>
+        <w:t>Low</w:t>
+      </w:r>
+    </w:p>
+    <w:p>
+      <w:pPr>
+        <w:ind w:left="360"/>
+        <w:rPr>
+          <w:rFonts w:ascii="Times New Roman" w:hAnsi="Times New Roman" w:cs="Times New Roman"/>
+          <w:b/>
+          <w:bCs/>
+          <w:lang w:val="en-US"/>
+        </w:rPr>
+      </w:pPr>
+    </w:p>
+    <w:p>
+      <w:pPr>
+        <w:ind w:left="360"/>
+        <w:rPr>
+          <w:rFonts w:ascii="Times New Roman" w:hAnsi="Times New Roman" w:cs="Times New Roman"/>
+          <w:b/>
+          <w:bCs/>
+          <w:sz w:val="28"/>
+          <w:szCs w:val="28"/>
+          <w:lang w:val="en-US"/>
+        </w:rPr>
+      </w:pPr>
+      <w:r>
+        <w:rPr>
+          <w:rFonts w:ascii="Times New Roman" w:hAnsi="Times New Roman" w:cs="Times New Roman"/>
+          <w:b/>
+          <w:bCs/>
+          <w:sz w:val="28"/>
+          <w:szCs w:val="28"/>
+          <w:lang w:val="en-US"/>
+        </w:rPr>
+        <w:t xml:space="preserve">Story #5: </w:t>
+      </w:r>
+      <w:r>
+        <w:rPr>
+          <w:rFonts w:ascii="Times New Roman" w:hAnsi="Times New Roman" w:cs="Times New Roman"/>
+          <w:b/>
+          <w:bCs/>
+          <w:sz w:val="28"/>
+          <w:szCs w:val="28"/>
+          <w:lang w:val="en-US"/>
+        </w:rPr>
+        <w:t xml:space="preserve"> </w:t>
+      </w:r>
       <w:r>
         <w:rPr>
           <w:rFonts w:ascii="Times New Roman" w:hAnsi="Times New Roman" w:cs="Times New Roman"/>
@@ -659,6 +2025,100 @@
     </w:p>
     <w:p>
       <w:pPr>
+        <w:ind w:left="360"/>
+        <w:rPr>
+          <w:rFonts w:ascii="Times New Roman" w:hAnsi="Times New Roman" w:cs="Times New Roman"/>
+          <w:lang w:val="en-US"/>
+        </w:rPr>
+      </w:pPr>
+      <w:r>
+        <w:rPr>
+          <w:rFonts w:ascii="Times New Roman" w:hAnsi="Times New Roman" w:cs="Times New Roman"/>
+          <w:b/>
+          <w:bCs/>
+          <w:sz w:val="28"/>
+          <w:szCs w:val="28"/>
+          <w:lang w:val="en-US"/>
+        </w:rPr>
+        <w:t xml:space="preserve">User Story: </w:t>
+      </w:r>
+      <w:r>
+        <w:rPr>
+          <w:rFonts w:ascii="Times New Roman" w:hAnsi="Times New Roman" w:cs="Times New Roman"/>
+          <w:lang w:val="en-US"/>
+        </w:rPr>
+        <w:t>As a user I want t</w:t>
+      </w:r>
+      <w:r>
+        <w:rPr>
+          <w:rFonts w:ascii="Times New Roman" w:hAnsi="Times New Roman" w:cs="Times New Roman"/>
+          <w:lang w:val="en-US"/>
+        </w:rPr>
+        <w:t>he process of creating the 3D cube to be faster so that I am not waiting for hours to start the next phase of my research or project</w:t>
+      </w:r>
+    </w:p>
+    <w:p>
+      <w:pPr>
+        <w:ind w:left="360"/>
+        <w:rPr>
+          <w:rFonts w:ascii="Times New Roman" w:hAnsi="Times New Roman" w:cs="Times New Roman"/>
+          <w:b/>
+          <w:bCs/>
+          <w:lang w:val="en-US"/>
+        </w:rPr>
+      </w:pPr>
+      <w:r>
+        <w:rPr>
+          <w:rFonts w:ascii="Times New Roman" w:hAnsi="Times New Roman" w:cs="Times New Roman"/>
+          <w:b/>
+          <w:bCs/>
+          <w:lang w:val="en-US"/>
+        </w:rPr>
+        <w:t xml:space="preserve">Points: </w:t>
+      </w:r>
+      <w:r>
+        <w:rPr>
+          <w:rFonts w:ascii="Times New Roman" w:hAnsi="Times New Roman" w:cs="Times New Roman"/>
+          <w:b/>
+          <w:bCs/>
+          <w:lang w:val="en-US"/>
+        </w:rPr>
+        <w:t>6</w:t>
+      </w:r>
+    </w:p>
+    <w:p>
+      <w:pPr>
+        <w:ind w:left="360"/>
+        <w:rPr>
+          <w:rFonts w:ascii="Times New Roman" w:hAnsi="Times New Roman" w:cs="Times New Roman"/>
+          <w:b/>
+          <w:bCs/>
+          <w:lang w:val="en-US"/>
+        </w:rPr>
+      </w:pPr>
+      <w:r>
+        <w:rPr>
+          <w:rFonts w:ascii="Times New Roman" w:hAnsi="Times New Roman" w:cs="Times New Roman"/>
+          <w:b/>
+          <w:bCs/>
+          <w:lang w:val="en-US"/>
+        </w:rPr>
+        <w:t>Priority: Medium</w:t>
+      </w:r>
+    </w:p>
+    <w:p>
+      <w:pPr>
+        <w:ind w:left="360"/>
+        <w:rPr>
+          <w:rFonts w:ascii="Times New Roman" w:hAnsi="Times New Roman" w:cs="Times New Roman"/>
+          <w:b/>
+          <w:bCs/>
+          <w:lang w:val="en-US"/>
+        </w:rPr>
+      </w:pPr>
+    </w:p>
+    <w:p>
+      <w:pPr>
         <w:rPr>
           <w:rFonts w:ascii="Times New Roman" w:hAnsi="Times New Roman" w:cs="Times New Roman"/>
           <w:b/>
@@ -816,6 +2276,30 @@
           <w:lang w:val="en-US"/>
         </w:rPr>
       </w:pPr>
+    </w:p>
+    <w:p>
+      <w:pPr>
+        <w:rPr>
+          <w:rFonts w:ascii="Times New Roman" w:hAnsi="Times New Roman" w:cs="Times New Roman"/>
+          <w:b/>
+          <w:bCs/>
+          <w:sz w:val="28"/>
+          <w:szCs w:val="28"/>
+          <w:lang w:val="en-US"/>
+        </w:rPr>
+      </w:pPr>
+    </w:p>
+    <w:p>
+      <w:pPr>
+        <w:rPr>
+          <w:rFonts w:ascii="Times New Roman" w:hAnsi="Times New Roman" w:cs="Times New Roman"/>
+          <w:b/>
+          <w:bCs/>
+          <w:sz w:val="28"/>
+          <w:szCs w:val="28"/>
+          <w:lang w:val="en-US"/>
+        </w:rPr>
+      </w:pPr>
       <w:r>
         <w:rPr>
           <w:rFonts w:ascii="Times New Roman" w:hAnsi="Times New Roman" w:cs="Times New Roman"/>
@@ -826,6 +2310,29 @@
           <w:lang w:val="en-US"/>
         </w:rPr>
         <w:lastRenderedPageBreak/>
+        <w:t>EPIC #3:</w:t>
+      </w:r>
+    </w:p>
+    <w:p>
+      <w:pPr>
+        <w:rPr>
+          <w:rFonts w:ascii="Times New Roman" w:hAnsi="Times New Roman" w:cs="Times New Roman"/>
+          <w:b/>
+          <w:bCs/>
+          <w:sz w:val="28"/>
+          <w:szCs w:val="28"/>
+          <w:lang w:val="en-US"/>
+        </w:rPr>
+      </w:pPr>
+      <w:r>
+        <w:rPr>
+          <w:rFonts w:ascii="Times New Roman" w:hAnsi="Times New Roman" w:cs="Times New Roman"/>
+          <w:b/>
+          <w:bCs/>
+          <w:sz w:val="28"/>
+          <w:szCs w:val="28"/>
+          <w:lang w:val="en-US"/>
+        </w:rPr>
         <w:t>Title</w:t>
       </w:r>
       <w:r>
@@ -957,20 +2464,23 @@
     </w:p>
     <w:p>
       <w:pPr>
-        <w:pStyle w:val="ListParagraph"/>
-        <w:numPr>
-          <w:ilvl w:val="0"/>
-          <w:numId w:val="7"/>
-        </w:numPr>
-        <w:rPr>
-          <w:rFonts w:ascii="Times New Roman" w:hAnsi="Times New Roman" w:cs="Times New Roman"/>
-          <w:b/>
-          <w:bCs/>
-          <w:sz w:val="28"/>
-          <w:szCs w:val="28"/>
-          <w:lang w:val="en-US"/>
-        </w:rPr>
-      </w:pPr>
+        <w:ind w:left="360"/>
+        <w:rPr>
+          <w:rFonts w:ascii="Times New Roman" w:hAnsi="Times New Roman" w:cs="Times New Roman"/>
+          <w:lang w:val="en-US"/>
+        </w:rPr>
+      </w:pPr>
+      <w:r>
+        <w:rPr>
+          <w:rFonts w:ascii="Times New Roman" w:hAnsi="Times New Roman" w:cs="Times New Roman"/>
+          <w:b/>
+          <w:bCs/>
+          <w:sz w:val="28"/>
+          <w:szCs w:val="28"/>
+          <w:lang w:val="en-US"/>
+        </w:rPr>
+        <w:t xml:space="preserve">Story #5: </w:t>
+      </w:r>
       <w:r>
         <w:rPr>
           <w:rFonts w:ascii="Times New Roman" w:hAnsi="Times New Roman" w:cs="Times New Roman"/>
@@ -985,173 +2495,1017 @@
       <w:r>
         <w:rPr>
           <w:rFonts w:ascii="Times New Roman" w:hAnsi="Times New Roman" w:cs="Times New Roman"/>
-          <w:sz w:val="28"/>
-          <w:szCs w:val="28"/>
           <w:lang w:val="en-US"/>
         </w:rPr>
         <w:t>Button to load 3D cube</w:t>
       </w:r>
-    </w:p>
-    <w:p>
-      <w:pPr>
-        <w:pStyle w:val="ListParagraph"/>
-        <w:numPr>
-          <w:ilvl w:val="0"/>
-          <w:numId w:val="7"/>
-        </w:numPr>
-        <w:rPr>
-          <w:rFonts w:ascii="Times New Roman" w:hAnsi="Times New Roman" w:cs="Times New Roman"/>
-          <w:b/>
-          <w:bCs/>
-          <w:sz w:val="28"/>
-          <w:szCs w:val="28"/>
-          <w:lang w:val="en-US"/>
-        </w:rPr>
-      </w:pPr>
-      <w:r>
-        <w:rPr>
-          <w:rFonts w:ascii="Times New Roman" w:hAnsi="Times New Roman" w:cs="Times New Roman"/>
-          <w:b/>
-          <w:bCs/>
-          <w:sz w:val="28"/>
-          <w:szCs w:val="28"/>
+      <w:r>
+        <w:rPr>
+          <w:rFonts w:ascii="Times New Roman" w:hAnsi="Times New Roman" w:cs="Times New Roman"/>
           <w:lang w:val="en-US"/>
         </w:rPr>
         <w:t xml:space="preserve"> </w:t>
       </w:r>
-      <w:r>
-        <w:rPr>
-          <w:rFonts w:ascii="Times New Roman" w:hAnsi="Times New Roman" w:cs="Times New Roman"/>
-          <w:sz w:val="28"/>
-          <w:szCs w:val="28"/>
-          <w:lang w:val="en-US"/>
-        </w:rPr>
-        <w:t xml:space="preserve">Button to </w:t>
+    </w:p>
+    <w:p>
+      <w:pPr>
+        <w:ind w:left="360"/>
+        <w:rPr>
+          <w:rFonts w:ascii="Times New Roman" w:hAnsi="Times New Roman" w:cs="Times New Roman"/>
+          <w:lang w:val="en-US"/>
+        </w:rPr>
+      </w:pPr>
+      <w:r>
+        <w:rPr>
+          <w:rFonts w:ascii="Times New Roman" w:hAnsi="Times New Roman" w:cs="Times New Roman"/>
+          <w:b/>
+          <w:bCs/>
+          <w:sz w:val="28"/>
+          <w:szCs w:val="28"/>
+          <w:lang w:val="en-US"/>
+        </w:rPr>
+        <w:t xml:space="preserve">User Story: </w:t>
+      </w:r>
+      <w:r>
+        <w:rPr>
+          <w:rFonts w:ascii="Times New Roman" w:hAnsi="Times New Roman" w:cs="Times New Roman"/>
+          <w:lang w:val="en-US"/>
+        </w:rPr>
+        <w:t xml:space="preserve">As a user I want </w:t>
+      </w:r>
+      <w:r>
+        <w:rPr>
+          <w:rFonts w:ascii="Times New Roman" w:hAnsi="Times New Roman" w:cs="Times New Roman"/>
+          <w:lang w:val="en-US"/>
+        </w:rPr>
+        <w:t xml:space="preserve">the option to load in </w:t>
       </w:r>
       <w:proofErr w:type="gramStart"/>
       <w:r>
         <w:rPr>
           <w:rFonts w:ascii="Times New Roman" w:hAnsi="Times New Roman" w:cs="Times New Roman"/>
-          <w:sz w:val="28"/>
-          <w:szCs w:val="28"/>
-          <w:lang w:val="en-US"/>
-        </w:rPr>
-        <w:t>open up</w:t>
+          <w:lang w:val="en-US"/>
+        </w:rPr>
+        <w:t>my</w:t>
       </w:r>
       <w:proofErr w:type="gramEnd"/>
       <w:r>
         <w:rPr>
           <w:rFonts w:ascii="Times New Roman" w:hAnsi="Times New Roman" w:cs="Times New Roman"/>
-          <w:sz w:val="28"/>
-          <w:szCs w:val="28"/>
-          <w:lang w:val="en-US"/>
-        </w:rPr>
-        <w:t xml:space="preserve"> 3D visualization software</w:t>
-      </w:r>
-    </w:p>
-    <w:p>
-      <w:pPr>
-        <w:pStyle w:val="ListParagraph"/>
-        <w:numPr>
-          <w:ilvl w:val="0"/>
-          <w:numId w:val="7"/>
-        </w:numPr>
-        <w:rPr>
-          <w:rFonts w:ascii="Times New Roman" w:hAnsi="Times New Roman" w:cs="Times New Roman"/>
-          <w:b/>
-          <w:bCs/>
-          <w:sz w:val="28"/>
-          <w:szCs w:val="28"/>
-          <w:lang w:val="en-US"/>
-        </w:rPr>
-      </w:pPr>
-      <w:r>
-        <w:rPr>
-          <w:rFonts w:ascii="Times New Roman" w:hAnsi="Times New Roman" w:cs="Times New Roman"/>
-          <w:sz w:val="28"/>
-          <w:szCs w:val="28"/>
-          <w:lang w:val="en-US"/>
-        </w:rPr>
-        <w:t>Include ability to rotate data</w:t>
-      </w:r>
-    </w:p>
-    <w:p>
-      <w:pPr>
-        <w:pStyle w:val="ListParagraph"/>
-        <w:numPr>
-          <w:ilvl w:val="0"/>
-          <w:numId w:val="7"/>
-        </w:numPr>
-        <w:rPr>
-          <w:rFonts w:ascii="Times New Roman" w:hAnsi="Times New Roman" w:cs="Times New Roman"/>
-          <w:b/>
-          <w:bCs/>
-          <w:sz w:val="28"/>
-          <w:szCs w:val="28"/>
-          <w:lang w:val="en-US"/>
-        </w:rPr>
-      </w:pPr>
-      <w:r>
-        <w:rPr>
-          <w:rFonts w:ascii="Times New Roman" w:hAnsi="Times New Roman" w:cs="Times New Roman"/>
-          <w:sz w:val="28"/>
-          <w:szCs w:val="28"/>
-          <w:lang w:val="en-US"/>
-        </w:rPr>
-        <w:t>Add ability to get points/coordinates from one slice/section of the cube</w:t>
-      </w:r>
-    </w:p>
-    <w:p>
-      <w:pPr>
-        <w:pStyle w:val="ListParagraph"/>
-        <w:numPr>
-          <w:ilvl w:val="0"/>
-          <w:numId w:val="7"/>
-        </w:numPr>
-        <w:rPr>
-          <w:rFonts w:ascii="Times New Roman" w:hAnsi="Times New Roman" w:cs="Times New Roman"/>
-          <w:b/>
-          <w:bCs/>
-          <w:sz w:val="28"/>
-          <w:szCs w:val="28"/>
-          <w:lang w:val="en-US"/>
-        </w:rPr>
-      </w:pPr>
-      <w:r>
-        <w:rPr>
-          <w:rFonts w:ascii="Times New Roman" w:hAnsi="Times New Roman" w:cs="Times New Roman"/>
-          <w:sz w:val="28"/>
-          <w:szCs w:val="28"/>
-          <w:lang w:val="en-US"/>
-        </w:rPr>
-        <w:t>Add function to automatically get the coordinates from the slice at every “user defined” interval</w:t>
-      </w:r>
-    </w:p>
-    <w:p>
-      <w:pPr>
-        <w:pStyle w:val="ListParagraph"/>
-        <w:numPr>
-          <w:ilvl w:val="0"/>
-          <w:numId w:val="7"/>
-        </w:numPr>
-        <w:rPr>
-          <w:rFonts w:ascii="Times New Roman" w:hAnsi="Times New Roman" w:cs="Times New Roman"/>
-          <w:b/>
-          <w:bCs/>
-          <w:sz w:val="28"/>
-          <w:szCs w:val="28"/>
-          <w:lang w:val="en-US"/>
-        </w:rPr>
-      </w:pPr>
-      <w:r>
-        <w:rPr>
-          <w:rFonts w:ascii="Times New Roman" w:hAnsi="Times New Roman" w:cs="Times New Roman"/>
-          <w:sz w:val="28"/>
-          <w:szCs w:val="28"/>
-          <w:lang w:val="en-US"/>
-        </w:rPr>
-        <w:t>Store coordinates in a formatted exportable file, like excel</w:t>
-      </w:r>
+          <w:lang w:val="en-US"/>
+        </w:rPr>
+        <w:t xml:space="preserve"> .</w:t>
+      </w:r>
+      <w:proofErr w:type="spellStart"/>
+      <w:r>
+        <w:rPr>
+          <w:rFonts w:ascii="Times New Roman" w:hAnsi="Times New Roman" w:cs="Times New Roman"/>
+          <w:lang w:val="en-US"/>
+        </w:rPr>
+        <w:t>vtk</w:t>
+      </w:r>
+      <w:proofErr w:type="spellEnd"/>
+      <w:r>
+        <w:rPr>
+          <w:rFonts w:ascii="Times New Roman" w:hAnsi="Times New Roman" w:cs="Times New Roman"/>
+          <w:lang w:val="en-US"/>
+        </w:rPr>
+        <w:t xml:space="preserve"> file into the program without the need for an extra script or 3</w:t>
+      </w:r>
+      <w:r>
+        <w:rPr>
+          <w:rFonts w:ascii="Times New Roman" w:hAnsi="Times New Roman" w:cs="Times New Roman"/>
+          <w:vertAlign w:val="superscript"/>
+          <w:lang w:val="en-US"/>
+        </w:rPr>
+        <w:t>rd</w:t>
+      </w:r>
+      <w:r>
+        <w:rPr>
+          <w:rFonts w:ascii="Times New Roman" w:hAnsi="Times New Roman" w:cs="Times New Roman"/>
+          <w:lang w:val="en-US"/>
+        </w:rPr>
+        <w:t xml:space="preserve"> party software </w:t>
+      </w:r>
+    </w:p>
+    <w:p>
+      <w:pPr>
+        <w:ind w:left="360"/>
+        <w:rPr>
+          <w:rFonts w:ascii="Times New Roman" w:hAnsi="Times New Roman" w:cs="Times New Roman"/>
+          <w:b/>
+          <w:bCs/>
+          <w:lang w:val="en-US"/>
+        </w:rPr>
+      </w:pPr>
+      <w:r>
+        <w:rPr>
+          <w:rFonts w:ascii="Times New Roman" w:hAnsi="Times New Roman" w:cs="Times New Roman"/>
+          <w:b/>
+          <w:bCs/>
+          <w:lang w:val="en-US"/>
+        </w:rPr>
+        <w:t xml:space="preserve">Points: </w:t>
+      </w:r>
+      <w:r>
+        <w:rPr>
+          <w:rFonts w:ascii="Times New Roman" w:hAnsi="Times New Roman" w:cs="Times New Roman"/>
+          <w:b/>
+          <w:bCs/>
+          <w:lang w:val="en-US"/>
+        </w:rPr>
+        <w:t>2</w:t>
+      </w:r>
+    </w:p>
+    <w:p>
+      <w:pPr>
+        <w:ind w:left="360"/>
+        <w:rPr>
+          <w:rFonts w:ascii="Times New Roman" w:hAnsi="Times New Roman" w:cs="Times New Roman"/>
+          <w:b/>
+          <w:bCs/>
+          <w:lang w:val="en-US"/>
+        </w:rPr>
+      </w:pPr>
+      <w:r>
+        <w:rPr>
+          <w:rFonts w:ascii="Times New Roman" w:hAnsi="Times New Roman" w:cs="Times New Roman"/>
+          <w:b/>
+          <w:bCs/>
+          <w:lang w:val="en-US"/>
+        </w:rPr>
+        <w:t xml:space="preserve">Priority: </w:t>
+      </w:r>
+      <w:r>
+        <w:rPr>
+          <w:rFonts w:ascii="Times New Roman" w:hAnsi="Times New Roman" w:cs="Times New Roman"/>
+          <w:b/>
+          <w:bCs/>
+          <w:lang w:val="en-US"/>
+        </w:rPr>
+        <w:t>Low</w:t>
+      </w:r>
+    </w:p>
+    <w:p>
+      <w:pPr>
+        <w:ind w:left="360"/>
+        <w:rPr>
+          <w:rFonts w:ascii="Times New Roman" w:hAnsi="Times New Roman" w:cs="Times New Roman"/>
+          <w:b/>
+          <w:bCs/>
+          <w:lang w:val="en-US"/>
+        </w:rPr>
+      </w:pPr>
+    </w:p>
+    <w:p>
+      <w:pPr>
+        <w:ind w:left="360"/>
+        <w:rPr>
+          <w:rFonts w:ascii="Times New Roman" w:hAnsi="Times New Roman" w:cs="Times New Roman"/>
+          <w:lang w:val="en-US"/>
+        </w:rPr>
+      </w:pPr>
+      <w:r>
+        <w:rPr>
+          <w:rFonts w:ascii="Times New Roman" w:hAnsi="Times New Roman" w:cs="Times New Roman"/>
+          <w:b/>
+          <w:bCs/>
+          <w:sz w:val="28"/>
+          <w:szCs w:val="28"/>
+          <w:lang w:val="en-US"/>
+        </w:rPr>
+        <w:t xml:space="preserve">Story #5: </w:t>
+      </w:r>
+      <w:r>
+        <w:rPr>
+          <w:rFonts w:ascii="Times New Roman" w:hAnsi="Times New Roman" w:cs="Times New Roman"/>
+          <w:b/>
+          <w:bCs/>
+          <w:sz w:val="28"/>
+          <w:szCs w:val="28"/>
+          <w:lang w:val="en-US"/>
+        </w:rPr>
+        <w:t xml:space="preserve"> </w:t>
+      </w:r>
+      <w:r>
+        <w:rPr>
+          <w:rFonts w:ascii="Times New Roman" w:hAnsi="Times New Roman" w:cs="Times New Roman"/>
+          <w:lang w:val="en-US"/>
+        </w:rPr>
+        <w:t>Button to open 3D visualization software</w:t>
+      </w:r>
+      <w:r>
+        <w:rPr>
+          <w:rFonts w:ascii="Times New Roman" w:hAnsi="Times New Roman" w:cs="Times New Roman"/>
+          <w:lang w:val="en-US"/>
+        </w:rPr>
+        <w:t xml:space="preserve"> </w:t>
+      </w:r>
+    </w:p>
+    <w:p>
+      <w:pPr>
+        <w:ind w:left="360"/>
+        <w:rPr>
+          <w:rFonts w:ascii="Times New Roman" w:hAnsi="Times New Roman" w:cs="Times New Roman"/>
+          <w:lang w:val="en-US"/>
+        </w:rPr>
+      </w:pPr>
+      <w:r>
+        <w:rPr>
+          <w:rFonts w:ascii="Times New Roman" w:hAnsi="Times New Roman" w:cs="Times New Roman"/>
+          <w:b/>
+          <w:bCs/>
+          <w:sz w:val="28"/>
+          <w:szCs w:val="28"/>
+          <w:lang w:val="en-US"/>
+        </w:rPr>
+        <w:t xml:space="preserve">User Story: </w:t>
+      </w:r>
+      <w:r>
+        <w:rPr>
+          <w:rFonts w:ascii="Times New Roman" w:hAnsi="Times New Roman" w:cs="Times New Roman"/>
+          <w:lang w:val="en-US"/>
+        </w:rPr>
+        <w:t xml:space="preserve">As a user I want to be able </w:t>
+      </w:r>
+      <w:r>
+        <w:rPr>
+          <w:rFonts w:ascii="Times New Roman" w:hAnsi="Times New Roman" w:cs="Times New Roman"/>
+          <w:lang w:val="en-US"/>
+        </w:rPr>
+        <w:t xml:space="preserve">open the 3D modeling software from the program itself so that I don’t have to open another program </w:t>
+      </w:r>
+      <w:r>
+        <w:rPr>
+          <w:rFonts w:ascii="Times New Roman" w:hAnsi="Times New Roman" w:cs="Times New Roman"/>
+          <w:lang w:val="en-US"/>
+        </w:rPr>
+        <w:t>and slow down my computer</w:t>
+      </w:r>
+    </w:p>
+    <w:p>
+      <w:pPr>
+        <w:ind w:left="360"/>
+        <w:rPr>
+          <w:rFonts w:ascii="Times New Roman" w:hAnsi="Times New Roman" w:cs="Times New Roman"/>
+          <w:b/>
+          <w:bCs/>
+          <w:lang w:val="en-US"/>
+        </w:rPr>
+      </w:pPr>
+      <w:r>
+        <w:rPr>
+          <w:rFonts w:ascii="Times New Roman" w:hAnsi="Times New Roman" w:cs="Times New Roman"/>
+          <w:b/>
+          <w:bCs/>
+          <w:lang w:val="en-US"/>
+        </w:rPr>
+        <w:t xml:space="preserve">Points: </w:t>
+      </w:r>
+      <w:r>
+        <w:rPr>
+          <w:rFonts w:ascii="Times New Roman" w:hAnsi="Times New Roman" w:cs="Times New Roman"/>
+          <w:b/>
+          <w:bCs/>
+          <w:lang w:val="en-US"/>
+        </w:rPr>
+        <w:t>2</w:t>
+      </w:r>
+    </w:p>
+    <w:p>
+      <w:pPr>
+        <w:ind w:left="360"/>
+        <w:rPr>
+          <w:rFonts w:ascii="Times New Roman" w:hAnsi="Times New Roman" w:cs="Times New Roman"/>
+          <w:b/>
+          <w:bCs/>
+          <w:lang w:val="en-US"/>
+        </w:rPr>
+      </w:pPr>
+      <w:r>
+        <w:rPr>
+          <w:rFonts w:ascii="Times New Roman" w:hAnsi="Times New Roman" w:cs="Times New Roman"/>
+          <w:b/>
+          <w:bCs/>
+          <w:lang w:val="en-US"/>
+        </w:rPr>
+        <w:t>Priority:</w:t>
+      </w:r>
+      <w:r>
+        <w:rPr>
+          <w:rFonts w:ascii="Times New Roman" w:hAnsi="Times New Roman" w:cs="Times New Roman"/>
+          <w:b/>
+          <w:bCs/>
+          <w:lang w:val="en-US"/>
+        </w:rPr>
+        <w:t xml:space="preserve"> Low</w:t>
+      </w:r>
+    </w:p>
+    <w:p>
+      <w:pPr>
+        <w:ind w:left="360"/>
+        <w:rPr>
+          <w:rFonts w:ascii="Times New Roman" w:hAnsi="Times New Roman" w:cs="Times New Roman"/>
+          <w:b/>
+          <w:bCs/>
+          <w:lang w:val="en-US"/>
+        </w:rPr>
+      </w:pPr>
+    </w:p>
+    <w:p>
+      <w:pPr>
+        <w:ind w:left="360"/>
+        <w:rPr>
+          <w:rFonts w:ascii="Times New Roman" w:hAnsi="Times New Roman" w:cs="Times New Roman"/>
+          <w:lang w:val="en-US"/>
+        </w:rPr>
+      </w:pPr>
+      <w:r>
+        <w:rPr>
+          <w:rFonts w:ascii="Times New Roman" w:hAnsi="Times New Roman" w:cs="Times New Roman"/>
+          <w:b/>
+          <w:bCs/>
+          <w:sz w:val="28"/>
+          <w:szCs w:val="28"/>
+          <w:lang w:val="en-US"/>
+        </w:rPr>
+        <w:t xml:space="preserve">Story #5: </w:t>
+      </w:r>
+      <w:r>
+        <w:rPr>
+          <w:rFonts w:ascii="Times New Roman" w:hAnsi="Times New Roman" w:cs="Times New Roman"/>
+          <w:b/>
+          <w:bCs/>
+          <w:sz w:val="28"/>
+          <w:szCs w:val="28"/>
+          <w:lang w:val="en-US"/>
+        </w:rPr>
+        <w:t xml:space="preserve"> </w:t>
+      </w:r>
+      <w:r>
+        <w:rPr>
+          <w:rFonts w:ascii="Times New Roman" w:hAnsi="Times New Roman" w:cs="Times New Roman"/>
+          <w:lang w:val="en-US"/>
+        </w:rPr>
+        <w:t>Rotate data</w:t>
+      </w:r>
+      <w:r>
+        <w:rPr>
+          <w:rFonts w:ascii="Times New Roman" w:hAnsi="Times New Roman" w:cs="Times New Roman"/>
+          <w:lang w:val="en-US"/>
+        </w:rPr>
+        <w:t xml:space="preserve"> </w:t>
+      </w:r>
+    </w:p>
+    <w:p>
+      <w:pPr>
+        <w:ind w:left="360"/>
+        <w:rPr>
+          <w:rFonts w:ascii="Times New Roman" w:hAnsi="Times New Roman" w:cs="Times New Roman"/>
+          <w:lang w:val="en-US"/>
+        </w:rPr>
+      </w:pPr>
+      <w:r>
+        <w:rPr>
+          <w:rFonts w:ascii="Times New Roman" w:hAnsi="Times New Roman" w:cs="Times New Roman"/>
+          <w:b/>
+          <w:bCs/>
+          <w:sz w:val="28"/>
+          <w:szCs w:val="28"/>
+          <w:lang w:val="en-US"/>
+        </w:rPr>
+        <w:t xml:space="preserve">User Story: </w:t>
+      </w:r>
+      <w:r>
+        <w:rPr>
+          <w:rFonts w:ascii="Times New Roman" w:hAnsi="Times New Roman" w:cs="Times New Roman"/>
+          <w:lang w:val="en-US"/>
+        </w:rPr>
+        <w:t xml:space="preserve">As a user I want to be able to </w:t>
+      </w:r>
+      <w:r>
+        <w:rPr>
+          <w:rFonts w:ascii="Times New Roman" w:hAnsi="Times New Roman" w:cs="Times New Roman"/>
+          <w:lang w:val="en-US"/>
+        </w:rPr>
+        <w:t>rotate the 3D cube so that I can view the data from different angles and improve my understanding of the data</w:t>
+      </w:r>
+    </w:p>
+    <w:p>
+      <w:pPr>
+        <w:ind w:left="360"/>
+        <w:rPr>
+          <w:rFonts w:ascii="Times New Roman" w:hAnsi="Times New Roman" w:cs="Times New Roman"/>
+          <w:b/>
+          <w:bCs/>
+          <w:lang w:val="en-US"/>
+        </w:rPr>
+      </w:pPr>
+      <w:r>
+        <w:rPr>
+          <w:rFonts w:ascii="Times New Roman" w:hAnsi="Times New Roman" w:cs="Times New Roman"/>
+          <w:b/>
+          <w:bCs/>
+          <w:lang w:val="en-US"/>
+        </w:rPr>
+        <w:t xml:space="preserve">Points: </w:t>
+      </w:r>
+      <w:r>
+        <w:rPr>
+          <w:rFonts w:ascii="Times New Roman" w:hAnsi="Times New Roman" w:cs="Times New Roman"/>
+          <w:b/>
+          <w:bCs/>
+          <w:lang w:val="en-US"/>
+        </w:rPr>
+        <w:t>4</w:t>
+      </w:r>
+    </w:p>
+    <w:p>
+      <w:pPr>
+        <w:ind w:left="360"/>
+        <w:rPr>
+          <w:rFonts w:ascii="Times New Roman" w:hAnsi="Times New Roman" w:cs="Times New Roman"/>
+          <w:b/>
+          <w:bCs/>
+          <w:lang w:val="en-US"/>
+        </w:rPr>
+      </w:pPr>
+      <w:r>
+        <w:rPr>
+          <w:rFonts w:ascii="Times New Roman" w:hAnsi="Times New Roman" w:cs="Times New Roman"/>
+          <w:b/>
+          <w:bCs/>
+          <w:lang w:val="en-US"/>
+        </w:rPr>
+        <w:t>Priority: Medium</w:t>
+      </w:r>
+    </w:p>
+    <w:p>
+      <w:pPr>
+        <w:ind w:left="360"/>
+        <w:rPr>
+          <w:rFonts w:ascii="Times New Roman" w:hAnsi="Times New Roman" w:cs="Times New Roman"/>
+          <w:lang w:val="en-US"/>
+        </w:rPr>
+      </w:pPr>
+      <w:r>
+        <w:rPr>
+          <w:rFonts w:ascii="Times New Roman" w:hAnsi="Times New Roman" w:cs="Times New Roman"/>
+          <w:b/>
+          <w:bCs/>
+          <w:sz w:val="28"/>
+          <w:szCs w:val="28"/>
+          <w:lang w:val="en-US"/>
+        </w:rPr>
+        <w:t xml:space="preserve">Story #5: </w:t>
+      </w:r>
+      <w:r>
+        <w:rPr>
+          <w:rFonts w:ascii="Times New Roman" w:hAnsi="Times New Roman" w:cs="Times New Roman"/>
+          <w:b/>
+          <w:bCs/>
+          <w:sz w:val="28"/>
+          <w:szCs w:val="28"/>
+          <w:lang w:val="en-US"/>
+        </w:rPr>
+        <w:t xml:space="preserve"> </w:t>
+      </w:r>
+      <w:r>
+        <w:rPr>
+          <w:rFonts w:ascii="Times New Roman" w:hAnsi="Times New Roman" w:cs="Times New Roman"/>
+          <w:lang w:val="en-US"/>
+        </w:rPr>
+        <w:t>Slice the cube</w:t>
+      </w:r>
+      <w:r>
+        <w:rPr>
+          <w:rFonts w:ascii="Times New Roman" w:hAnsi="Times New Roman" w:cs="Times New Roman"/>
+          <w:lang w:val="en-US"/>
+        </w:rPr>
+        <w:t xml:space="preserve"> </w:t>
+      </w:r>
+    </w:p>
+    <w:p>
+      <w:pPr>
+        <w:ind w:left="360"/>
+        <w:rPr>
+          <w:rFonts w:ascii="Times New Roman" w:hAnsi="Times New Roman" w:cs="Times New Roman"/>
+          <w:lang w:val="en-US"/>
+        </w:rPr>
+      </w:pPr>
+      <w:r>
+        <w:rPr>
+          <w:rFonts w:ascii="Times New Roman" w:hAnsi="Times New Roman" w:cs="Times New Roman"/>
+          <w:b/>
+          <w:bCs/>
+          <w:sz w:val="28"/>
+          <w:szCs w:val="28"/>
+          <w:lang w:val="en-US"/>
+        </w:rPr>
+        <w:t xml:space="preserve">User Story: </w:t>
+      </w:r>
+      <w:r>
+        <w:rPr>
+          <w:rFonts w:ascii="Times New Roman" w:hAnsi="Times New Roman" w:cs="Times New Roman"/>
+          <w:lang w:val="en-US"/>
+        </w:rPr>
+        <w:t xml:space="preserve">As a user I want to be able to </w:t>
+      </w:r>
+      <w:r>
+        <w:rPr>
+          <w:rFonts w:ascii="Times New Roman" w:hAnsi="Times New Roman" w:cs="Times New Roman"/>
+          <w:lang w:val="en-US"/>
+        </w:rPr>
+        <w:t>slice the cube so that I can differentiate or highlight the parts that are of interest to me</w:t>
+      </w:r>
+    </w:p>
+    <w:p>
+      <w:pPr>
+        <w:ind w:left="360"/>
+        <w:rPr>
+          <w:rFonts w:ascii="Times New Roman" w:hAnsi="Times New Roman" w:cs="Times New Roman"/>
+          <w:b/>
+          <w:bCs/>
+          <w:lang w:val="en-US"/>
+        </w:rPr>
+      </w:pPr>
+      <w:r>
+        <w:rPr>
+          <w:rFonts w:ascii="Times New Roman" w:hAnsi="Times New Roman" w:cs="Times New Roman"/>
+          <w:b/>
+          <w:bCs/>
+          <w:lang w:val="en-US"/>
+        </w:rPr>
+        <w:t xml:space="preserve">Points: </w:t>
+      </w:r>
+      <w:r>
+        <w:rPr>
+          <w:rFonts w:ascii="Times New Roman" w:hAnsi="Times New Roman" w:cs="Times New Roman"/>
+          <w:b/>
+          <w:bCs/>
+          <w:lang w:val="en-US"/>
+        </w:rPr>
+        <w:t>4</w:t>
+      </w:r>
+    </w:p>
+    <w:p>
+      <w:pPr>
+        <w:ind w:left="360"/>
+        <w:rPr>
+          <w:rFonts w:ascii="Times New Roman" w:hAnsi="Times New Roman" w:cs="Times New Roman"/>
+          <w:b/>
+          <w:bCs/>
+          <w:lang w:val="en-US"/>
+        </w:rPr>
+      </w:pPr>
+      <w:r>
+        <w:rPr>
+          <w:rFonts w:ascii="Times New Roman" w:hAnsi="Times New Roman" w:cs="Times New Roman"/>
+          <w:b/>
+          <w:bCs/>
+          <w:lang w:val="en-US"/>
+        </w:rPr>
+        <w:t xml:space="preserve">Priority: </w:t>
+      </w:r>
+      <w:r>
+        <w:rPr>
+          <w:rFonts w:ascii="Times New Roman" w:hAnsi="Times New Roman" w:cs="Times New Roman"/>
+          <w:b/>
+          <w:bCs/>
+          <w:lang w:val="en-US"/>
+        </w:rPr>
+        <w:t>High</w:t>
+      </w:r>
+    </w:p>
+    <w:p>
+      <w:pPr>
+        <w:ind w:left="360"/>
+        <w:rPr>
+          <w:rFonts w:ascii="Times New Roman" w:hAnsi="Times New Roman" w:cs="Times New Roman"/>
+          <w:b/>
+          <w:bCs/>
+          <w:sz w:val="28"/>
+          <w:szCs w:val="28"/>
+          <w:lang w:val="en-US"/>
+        </w:rPr>
+      </w:pPr>
+    </w:p>
+    <w:p>
+      <w:pPr>
+        <w:ind w:left="360"/>
+        <w:rPr>
+          <w:rFonts w:ascii="Times New Roman" w:hAnsi="Times New Roman" w:cs="Times New Roman"/>
+          <w:lang w:val="en-US"/>
+        </w:rPr>
+      </w:pPr>
+      <w:r>
+        <w:rPr>
+          <w:rFonts w:ascii="Times New Roman" w:hAnsi="Times New Roman" w:cs="Times New Roman"/>
+          <w:b/>
+          <w:bCs/>
+          <w:sz w:val="28"/>
+          <w:szCs w:val="28"/>
+          <w:lang w:val="en-US"/>
+        </w:rPr>
+        <w:lastRenderedPageBreak/>
+        <w:t xml:space="preserve">Story #5: </w:t>
+      </w:r>
+      <w:r>
+        <w:rPr>
+          <w:rFonts w:ascii="Times New Roman" w:hAnsi="Times New Roman" w:cs="Times New Roman"/>
+          <w:b/>
+          <w:bCs/>
+          <w:sz w:val="28"/>
+          <w:szCs w:val="28"/>
+          <w:lang w:val="en-US"/>
+        </w:rPr>
+        <w:t xml:space="preserve"> </w:t>
+      </w:r>
+      <w:r>
+        <w:rPr>
+          <w:rFonts w:ascii="Times New Roman" w:hAnsi="Times New Roman" w:cs="Times New Roman"/>
+          <w:lang w:val="en-US"/>
+        </w:rPr>
+        <w:t>Add ability to get coordinates from one slice/section of the cube</w:t>
+      </w:r>
+      <w:r>
+        <w:rPr>
+          <w:rFonts w:ascii="Times New Roman" w:hAnsi="Times New Roman" w:cs="Times New Roman"/>
+          <w:lang w:val="en-US"/>
+        </w:rPr>
+        <w:t xml:space="preserve"> </w:t>
+      </w:r>
+    </w:p>
+    <w:p>
+      <w:pPr>
+        <w:ind w:left="360"/>
+        <w:rPr>
+          <w:rFonts w:ascii="Times New Roman" w:hAnsi="Times New Roman" w:cs="Times New Roman"/>
+          <w:lang w:val="en-US"/>
+        </w:rPr>
+      </w:pPr>
+      <w:r>
+        <w:rPr>
+          <w:rFonts w:ascii="Times New Roman" w:hAnsi="Times New Roman" w:cs="Times New Roman"/>
+          <w:b/>
+          <w:bCs/>
+          <w:sz w:val="28"/>
+          <w:szCs w:val="28"/>
+          <w:lang w:val="en-US"/>
+        </w:rPr>
+        <w:t xml:space="preserve">User Story: </w:t>
+      </w:r>
+      <w:r>
+        <w:rPr>
+          <w:rFonts w:ascii="Times New Roman" w:hAnsi="Times New Roman" w:cs="Times New Roman"/>
+          <w:lang w:val="en-US"/>
+        </w:rPr>
+        <w:t xml:space="preserve">As a user I want to be able to </w:t>
+      </w:r>
+      <w:r>
+        <w:rPr>
+          <w:rFonts w:ascii="Times New Roman" w:hAnsi="Times New Roman" w:cs="Times New Roman"/>
+          <w:lang w:val="en-US"/>
+        </w:rPr>
+        <w:t>get the coordinates from one section of the cube that is of interest to me so that I can plot those points on a map for future excavations</w:t>
+      </w:r>
+    </w:p>
+    <w:p>
+      <w:pPr>
+        <w:ind w:left="360"/>
+        <w:rPr>
+          <w:rFonts w:ascii="Times New Roman" w:hAnsi="Times New Roman" w:cs="Times New Roman"/>
+          <w:b/>
+          <w:bCs/>
+          <w:lang w:val="en-US"/>
+        </w:rPr>
+      </w:pPr>
+      <w:r>
+        <w:rPr>
+          <w:rFonts w:ascii="Times New Roman" w:hAnsi="Times New Roman" w:cs="Times New Roman"/>
+          <w:b/>
+          <w:bCs/>
+          <w:lang w:val="en-US"/>
+        </w:rPr>
+        <w:t xml:space="preserve">Points: </w:t>
+      </w:r>
+      <w:r>
+        <w:rPr>
+          <w:rFonts w:ascii="Times New Roman" w:hAnsi="Times New Roman" w:cs="Times New Roman"/>
+          <w:b/>
+          <w:bCs/>
+          <w:lang w:val="en-US"/>
+        </w:rPr>
+        <w:t>4</w:t>
+      </w:r>
+    </w:p>
+    <w:p>
+      <w:pPr>
+        <w:ind w:left="360"/>
+        <w:rPr>
+          <w:rFonts w:ascii="Times New Roman" w:hAnsi="Times New Roman" w:cs="Times New Roman"/>
+          <w:b/>
+          <w:bCs/>
+          <w:lang w:val="en-US"/>
+        </w:rPr>
+      </w:pPr>
+      <w:r>
+        <w:rPr>
+          <w:rFonts w:ascii="Times New Roman" w:hAnsi="Times New Roman" w:cs="Times New Roman"/>
+          <w:b/>
+          <w:bCs/>
+          <w:lang w:val="en-US"/>
+        </w:rPr>
+        <w:t>Priority: Medium</w:t>
+      </w:r>
+    </w:p>
+    <w:p>
+      <w:pPr>
+        <w:ind w:left="360"/>
+        <w:rPr>
+          <w:rFonts w:ascii="Times New Roman" w:hAnsi="Times New Roman" w:cs="Times New Roman"/>
+          <w:b/>
+          <w:bCs/>
+          <w:lang w:val="en-US"/>
+        </w:rPr>
+      </w:pPr>
+    </w:p>
+    <w:p>
+      <w:pPr>
+        <w:ind w:left="360"/>
+        <w:rPr>
+          <w:rFonts w:ascii="Times New Roman" w:hAnsi="Times New Roman" w:cs="Times New Roman"/>
+          <w:lang w:val="en-US"/>
+        </w:rPr>
+      </w:pPr>
+      <w:r>
+        <w:rPr>
+          <w:rFonts w:ascii="Times New Roman" w:hAnsi="Times New Roman" w:cs="Times New Roman"/>
+          <w:b/>
+          <w:bCs/>
+          <w:sz w:val="28"/>
+          <w:szCs w:val="28"/>
+          <w:lang w:val="en-US"/>
+        </w:rPr>
+        <w:t xml:space="preserve">Story #5: </w:t>
+      </w:r>
+      <w:r>
+        <w:rPr>
+          <w:rFonts w:ascii="Times New Roman" w:hAnsi="Times New Roman" w:cs="Times New Roman"/>
+          <w:b/>
+          <w:bCs/>
+          <w:sz w:val="28"/>
+          <w:szCs w:val="28"/>
+          <w:lang w:val="en-US"/>
+        </w:rPr>
+        <w:t xml:space="preserve"> </w:t>
+      </w:r>
+      <w:r>
+        <w:rPr>
+          <w:rFonts w:ascii="Times New Roman" w:hAnsi="Times New Roman" w:cs="Times New Roman"/>
+          <w:lang w:val="en-US"/>
+        </w:rPr>
+        <w:t>Add function to automatically get the coordinates from every slice at “user-defined” intervals</w:t>
+      </w:r>
+      <w:r>
+        <w:rPr>
+          <w:rFonts w:ascii="Times New Roman" w:hAnsi="Times New Roman" w:cs="Times New Roman"/>
+          <w:lang w:val="en-US"/>
+        </w:rPr>
+        <w:t xml:space="preserve"> </w:t>
+      </w:r>
+    </w:p>
+    <w:p>
+      <w:pPr>
+        <w:ind w:left="360"/>
+        <w:rPr>
+          <w:rFonts w:ascii="Times New Roman" w:hAnsi="Times New Roman" w:cs="Times New Roman"/>
+          <w:lang w:val="en-US"/>
+        </w:rPr>
+      </w:pPr>
+      <w:r>
+        <w:rPr>
+          <w:rFonts w:ascii="Times New Roman" w:hAnsi="Times New Roman" w:cs="Times New Roman"/>
+          <w:b/>
+          <w:bCs/>
+          <w:sz w:val="28"/>
+          <w:szCs w:val="28"/>
+          <w:lang w:val="en-US"/>
+        </w:rPr>
+        <w:t xml:space="preserve">User Story: </w:t>
+      </w:r>
+      <w:r>
+        <w:rPr>
+          <w:rFonts w:ascii="Times New Roman" w:hAnsi="Times New Roman" w:cs="Times New Roman"/>
+          <w:lang w:val="en-US"/>
+        </w:rPr>
+        <w:t xml:space="preserve">As a user I want to be able to </w:t>
+      </w:r>
+      <w:r>
+        <w:rPr>
+          <w:rFonts w:ascii="Times New Roman" w:hAnsi="Times New Roman" w:cs="Times New Roman"/>
+          <w:lang w:val="en-US"/>
+        </w:rPr>
+        <w:t>automatically get the coordinates from every slice in the cube at intervals that I specify so that I can speed up the data extraction process</w:t>
+      </w:r>
+    </w:p>
+    <w:p>
+      <w:pPr>
+        <w:ind w:left="360"/>
+        <w:rPr>
+          <w:rFonts w:ascii="Times New Roman" w:hAnsi="Times New Roman" w:cs="Times New Roman"/>
+          <w:b/>
+          <w:bCs/>
+          <w:lang w:val="en-US"/>
+        </w:rPr>
+      </w:pPr>
+      <w:r>
+        <w:rPr>
+          <w:rFonts w:ascii="Times New Roman" w:hAnsi="Times New Roman" w:cs="Times New Roman"/>
+          <w:b/>
+          <w:bCs/>
+          <w:lang w:val="en-US"/>
+        </w:rPr>
+        <w:t>Points: 6</w:t>
+      </w:r>
+    </w:p>
+    <w:p>
+      <w:pPr>
+        <w:ind w:left="360"/>
+        <w:rPr>
+          <w:rFonts w:ascii="Times New Roman" w:hAnsi="Times New Roman" w:cs="Times New Roman"/>
+          <w:b/>
+          <w:bCs/>
+          <w:lang w:val="en-US"/>
+        </w:rPr>
+      </w:pPr>
+      <w:r>
+        <w:rPr>
+          <w:rFonts w:ascii="Times New Roman" w:hAnsi="Times New Roman" w:cs="Times New Roman"/>
+          <w:b/>
+          <w:bCs/>
+          <w:lang w:val="en-US"/>
+        </w:rPr>
+        <w:t>Priority: Medium</w:t>
+      </w:r>
+    </w:p>
+    <w:p>
+      <w:pPr>
+        <w:ind w:left="360"/>
+        <w:rPr>
+          <w:rFonts w:ascii="Times New Roman" w:hAnsi="Times New Roman" w:cs="Times New Roman"/>
+          <w:b/>
+          <w:bCs/>
+          <w:sz w:val="28"/>
+          <w:szCs w:val="28"/>
+          <w:lang w:val="en-US"/>
+        </w:rPr>
+      </w:pPr>
+    </w:p>
+    <w:p>
+      <w:pPr>
+        <w:ind w:left="360"/>
+        <w:rPr>
+          <w:rFonts w:ascii="Times New Roman" w:hAnsi="Times New Roman" w:cs="Times New Roman"/>
+          <w:lang w:val="en-US"/>
+        </w:rPr>
+      </w:pPr>
+      <w:r>
+        <w:rPr>
+          <w:rFonts w:ascii="Times New Roman" w:hAnsi="Times New Roman" w:cs="Times New Roman"/>
+          <w:b/>
+          <w:bCs/>
+          <w:sz w:val="28"/>
+          <w:szCs w:val="28"/>
+          <w:lang w:val="en-US"/>
+        </w:rPr>
+        <w:t xml:space="preserve">Story #5: </w:t>
+      </w:r>
+      <w:r>
+        <w:rPr>
+          <w:rFonts w:ascii="Times New Roman" w:hAnsi="Times New Roman" w:cs="Times New Roman"/>
+          <w:b/>
+          <w:bCs/>
+          <w:sz w:val="28"/>
+          <w:szCs w:val="28"/>
+          <w:lang w:val="en-US"/>
+        </w:rPr>
+        <w:t xml:space="preserve"> </w:t>
+      </w:r>
+      <w:r>
+        <w:rPr>
+          <w:rFonts w:ascii="Times New Roman" w:hAnsi="Times New Roman" w:cs="Times New Roman"/>
+          <w:lang w:val="en-US"/>
+        </w:rPr>
+        <w:t>Store coordinates into an exportable file like excel</w:t>
+      </w:r>
+      <w:r>
+        <w:rPr>
+          <w:rFonts w:ascii="Times New Roman" w:hAnsi="Times New Roman" w:cs="Times New Roman"/>
+          <w:lang w:val="en-US"/>
+        </w:rPr>
+        <w:t xml:space="preserve"> </w:t>
+      </w:r>
+    </w:p>
+    <w:p>
+      <w:pPr>
+        <w:ind w:left="360"/>
+        <w:rPr>
+          <w:rFonts w:ascii="Times New Roman" w:hAnsi="Times New Roman" w:cs="Times New Roman"/>
+          <w:lang w:val="en-US"/>
+        </w:rPr>
+      </w:pPr>
+      <w:r>
+        <w:rPr>
+          <w:rFonts w:ascii="Times New Roman" w:hAnsi="Times New Roman" w:cs="Times New Roman"/>
+          <w:b/>
+          <w:bCs/>
+          <w:sz w:val="28"/>
+          <w:szCs w:val="28"/>
+          <w:lang w:val="en-US"/>
+        </w:rPr>
+        <w:t xml:space="preserve">User Story: </w:t>
+      </w:r>
+      <w:r>
+        <w:rPr>
+          <w:rFonts w:ascii="Times New Roman" w:hAnsi="Times New Roman" w:cs="Times New Roman"/>
+          <w:lang w:val="en-US"/>
+        </w:rPr>
+        <w:t xml:space="preserve">As a user I want to be able to </w:t>
+      </w:r>
+      <w:r>
+        <w:rPr>
+          <w:rFonts w:ascii="Times New Roman" w:hAnsi="Times New Roman" w:cs="Times New Roman"/>
+          <w:lang w:val="en-US"/>
+        </w:rPr>
+        <w:t>store these</w:t>
+      </w:r>
+    </w:p>
+    <w:p>
+      <w:pPr>
+        <w:ind w:left="360"/>
+        <w:rPr>
+          <w:rFonts w:ascii="Times New Roman" w:hAnsi="Times New Roman" w:cs="Times New Roman"/>
+          <w:b/>
+          <w:bCs/>
+          <w:lang w:val="en-US"/>
+        </w:rPr>
+      </w:pPr>
+      <w:r>
+        <w:rPr>
+          <w:rFonts w:ascii="Times New Roman" w:hAnsi="Times New Roman" w:cs="Times New Roman"/>
+          <w:b/>
+          <w:bCs/>
+          <w:lang w:val="en-US"/>
+        </w:rPr>
+        <w:t>Points: 6</w:t>
+      </w:r>
+    </w:p>
+    <w:p>
+      <w:pPr>
+        <w:ind w:left="360"/>
+        <w:rPr>
+          <w:rFonts w:ascii="Times New Roman" w:hAnsi="Times New Roman" w:cs="Times New Roman"/>
+          <w:b/>
+          <w:bCs/>
+          <w:lang w:val="en-US"/>
+        </w:rPr>
+      </w:pPr>
+      <w:r>
+        <w:rPr>
+          <w:rFonts w:ascii="Times New Roman" w:hAnsi="Times New Roman" w:cs="Times New Roman"/>
+          <w:b/>
+          <w:bCs/>
+          <w:lang w:val="en-US"/>
+        </w:rPr>
+        <w:t>Priority: Medium</w:t>
+      </w:r>
+    </w:p>
+    <w:p>
+      <w:pPr>
+        <w:ind w:left="360"/>
+        <w:rPr>
+          <w:rFonts w:ascii="Times New Roman" w:hAnsi="Times New Roman" w:cs="Times New Roman"/>
+          <w:b/>
+          <w:bCs/>
+          <w:sz w:val="28"/>
+          <w:szCs w:val="28"/>
+          <w:lang w:val="en-US"/>
+        </w:rPr>
+      </w:pPr>
+    </w:p>
+    <w:p>
+      <w:pPr>
+        <w:ind w:left="360"/>
+        <w:rPr>
+          <w:rFonts w:ascii="Times New Roman" w:hAnsi="Times New Roman" w:cs="Times New Roman"/>
+          <w:b/>
+          <w:bCs/>
+          <w:sz w:val="28"/>
+          <w:szCs w:val="28"/>
+          <w:lang w:val="en-US"/>
+        </w:rPr>
+      </w:pPr>
     </w:p>
     <w:p>
       <w:pPr>
@@ -1493,6 +3847,7 @@
           <w:bCs/>
           <w:lang w:val="en-US"/>
         </w:rPr>
+        <w:lastRenderedPageBreak/>
         <w:t xml:space="preserve"> </w:t>
       </w:r>
       <w:r>
@@ -1759,7 +4114,6 @@
           <w:szCs w:val="28"/>
           <w:lang w:val="en-US"/>
         </w:rPr>
-        <w:lastRenderedPageBreak/>
         <w:t>Title</w:t>
       </w:r>
       <w:r>
@@ -2329,7 +4683,6 @@
           <w:szCs w:val="32"/>
           <w:lang w:val="en-US"/>
         </w:rPr>
-        <w:lastRenderedPageBreak/>
         <w:t>Issues</w:t>
       </w:r>
     </w:p>
@@ -2540,6 +4893,7 @@
           <w:noProof/>
           <w:lang w:val="en-US"/>
         </w:rPr>
+        <w:lastRenderedPageBreak/>
         <w:drawing>
           <wp:inline distT="0" distB="0" distL="0" distR="0" wp14:anchorId="30C7F944" wp14:editId="02B26E03">
             <wp:extent cx="5731510" cy="3283585"/>

</xml_diff>